<commit_message>
added more response to reviewers
</commit_message>
<xml_diff>
--- a/Docs/ICES_JMS/R1/R1_MainDocument.docx
+++ b/Docs/ICES_JMS/R1/R1_MainDocument.docx
@@ -3421,70 +3421,100 @@
           <w:rPr>
             <w:rFonts w:ascii="Times New Roman" w:hAnsi="Times New Roman" w:cs="Times New Roman"/>
           </w:rPr>
-          <w:t xml:space="preserve">laid in a brick of </w:t>
+          <w:t>laid in</w:t>
         </w:r>
-        <w:r>
-          <w:rPr>
-            <w:rFonts w:ascii="Times New Roman" w:hAnsi="Times New Roman" w:cs="Times New Roman"/>
-            <w:highlight w:val="yellow"/>
-            <w:rPrChange w:id="21" w:author="Benjamin J. Makhlouf" w:date="2026-03-01T19:38:00Z" w16du:dateUtc="2026-03-02T03:38:00Z">
-              <w:rPr>
-                <w:rFonts w:ascii="Times New Roman" w:hAnsi="Times New Roman" w:cs="Times New Roman"/>
-              </w:rPr>
-            </w:rPrChange>
-          </w:rPr>
-          <w:t>X</w:t>
-        </w:r>
+      </w:ins>
+      <w:ins w:id="21" w:author="Benjamin J. Makhlouf" w:date="2026-03-02T10:59:00Z" w16du:dateUtc="2026-03-02T18:59:00Z">
         <w:r>
           <w:rPr>
             <w:rFonts w:ascii="Times New Roman" w:hAnsi="Times New Roman" w:cs="Times New Roman"/>
           </w:rPr>
-          <w:t xml:space="preserve"> epoxy and </w:t>
+          <w:t xml:space="preserve"> a brick of</w:t>
         </w:r>
       </w:ins>
-      <w:r>
-        <w:rPr>
-          <w:rFonts w:ascii="Times New Roman" w:hAnsi="Times New Roman" w:cs="Times New Roman"/>
-        </w:rPr>
-        <w:t>cut along the transverse plane</w:t>
-      </w:r>
-      <w:r>
-        <w:rPr>
-          <w:rFonts w:ascii="Times New Roman" w:hAnsi="Times New Roman" w:cs="Times New Roman"/>
-        </w:rPr>
-        <w:t xml:space="preserve"> using a low speed</w:t>
-      </w:r>
-      <w:r>
-        <w:rPr>
-          <w:rFonts w:ascii="Times New Roman" w:hAnsi="Times New Roman" w:cs="Times New Roman"/>
-        </w:rPr>
-        <w:t xml:space="preserve"> </w:t>
-      </w:r>
-      <w:proofErr w:type="spellStart"/>
-      <w:r>
-        <w:rPr>
-          <w:rFonts w:ascii="Times New Roman" w:hAnsi="Times New Roman" w:cs="Times New Roman"/>
-        </w:rPr>
-        <w:t>isomet</w:t>
-      </w:r>
-      <w:proofErr w:type="spellEnd"/>
-      <w:ins w:id="22" w:author="Benjamin J. Makhlouf" w:date="2026-03-01T19:38:00Z" w16du:dateUtc="2026-03-02T03:38:00Z">
+      <w:ins w:id="22" w:author="Benjamin J. Makhlouf" w:date="2026-03-01T19:36:00Z" w16du:dateUtc="2026-03-02T03:36:00Z">
         <w:r>
           <w:rPr>
             <w:rFonts w:ascii="Times New Roman" w:hAnsi="Times New Roman" w:cs="Times New Roman"/>
           </w:rPr>
-          <w:t xml:space="preserve">. In doing so, we </w:t>
+          <w:t xml:space="preserve"> </w:t>
         </w:r>
-        <w:proofErr w:type="gramStart"/>
+      </w:ins>
+      <w:proofErr w:type="gramStart"/>
+      <w:ins w:id="23" w:author="Benjamin J. Makhlouf" w:date="2026-03-02T10:59:00Z" w16du:dateUtc="2026-03-02T18:59:00Z">
         <w:r>
           <w:rPr>
             <w:rFonts w:ascii="Times New Roman" w:hAnsi="Times New Roman" w:cs="Times New Roman"/>
           </w:rPr>
-          <w:t>removed  a</w:t>
+          <w:t>two part</w:t>
+        </w:r>
+        <w:proofErr w:type="gramEnd"/>
+        <w:r>
+          <w:rPr>
+            <w:rFonts w:ascii="Times New Roman" w:hAnsi="Times New Roman" w:cs="Times New Roman"/>
+          </w:rPr>
+          <w:t xml:space="preserve"> epoxy resin</w:t>
         </w:r>
       </w:ins>
-      <w:proofErr w:type="gramEnd"/>
-      <w:del w:id="23" w:author="Benjamin J. Makhlouf" w:date="2026-03-01T19:38:00Z" w16du:dateUtc="2026-03-02T03:38:00Z">
+      <w:ins w:id="24" w:author="Benjamin J. Makhlouf" w:date="2026-03-01T19:36:00Z" w16du:dateUtc="2026-03-02T03:36:00Z">
+        <w:r>
+          <w:rPr>
+            <w:rFonts w:ascii="Times New Roman" w:hAnsi="Times New Roman" w:cs="Times New Roman"/>
+          </w:rPr>
+          <w:t xml:space="preserve"> and </w:t>
+        </w:r>
+      </w:ins>
+      <w:r>
+        <w:rPr>
+          <w:rFonts w:ascii="Times New Roman" w:hAnsi="Times New Roman" w:cs="Times New Roman"/>
+        </w:rPr>
+        <w:t>cut along the transverse plane</w:t>
+      </w:r>
+      <w:r>
+        <w:rPr>
+          <w:rFonts w:ascii="Times New Roman" w:hAnsi="Times New Roman" w:cs="Times New Roman"/>
+        </w:rPr>
+        <w:t xml:space="preserve"> using a low speed</w:t>
+      </w:r>
+      <w:r>
+        <w:rPr>
+          <w:rFonts w:ascii="Times New Roman" w:hAnsi="Times New Roman" w:cs="Times New Roman"/>
+        </w:rPr>
+        <w:t xml:space="preserve"> </w:t>
+      </w:r>
+      <w:proofErr w:type="spellStart"/>
+      <w:r>
+        <w:rPr>
+          <w:rFonts w:ascii="Times New Roman" w:hAnsi="Times New Roman" w:cs="Times New Roman"/>
+        </w:rPr>
+        <w:t>isomet</w:t>
+      </w:r>
+      <w:proofErr w:type="spellEnd"/>
+      <w:ins w:id="25" w:author="Benjamin J. Makhlouf" w:date="2026-03-02T10:59:00Z" w16du:dateUtc="2026-03-02T18:59:00Z">
+        <w:r>
+          <w:rPr>
+            <w:rFonts w:ascii="Times New Roman" w:hAnsi="Times New Roman" w:cs="Times New Roman"/>
+          </w:rPr>
+          <w:t xml:space="preserve"> saw to </w:t>
+        </w:r>
+      </w:ins>
+      <w:ins w:id="26" w:author="Benjamin J. Makhlouf" w:date="2026-03-01T19:38:00Z" w16du:dateUtc="2026-03-02T03:38:00Z">
+        <w:r>
+          <w:rPr>
+            <w:rFonts w:ascii="Times New Roman" w:hAnsi="Times New Roman" w:cs="Times New Roman"/>
+          </w:rPr>
+          <w:t xml:space="preserve">remove </w:t>
+        </w:r>
+      </w:ins>
+      <w:ins w:id="27" w:author="Benjamin J. Makhlouf" w:date="2026-03-02T10:59:00Z" w16du:dateUtc="2026-03-02T18:59:00Z">
+        <w:r>
+          <w:rPr>
+            <w:rFonts w:ascii="Times New Roman" w:hAnsi="Times New Roman" w:cs="Times New Roman"/>
+          </w:rPr>
+          <w:t xml:space="preserve">a </w:t>
+        </w:r>
+      </w:ins>
+      <w:del w:id="28" w:author="Benjamin J. Makhlouf" w:date="2026-03-01T19:38:00Z" w16du:dateUtc="2026-03-02T03:38:00Z">
         <w:r>
           <w:rPr>
             <w:rFonts w:ascii="Times New Roman" w:hAnsi="Times New Roman" w:cs="Times New Roman"/>
@@ -3498,13 +3528,15 @@
           <w:delText xml:space="preserve"> to</w:delText>
         </w:r>
       </w:del>
-      <w:r>
-        <w:rPr>
-          <w:rFonts w:ascii="Times New Roman" w:hAnsi="Times New Roman" w:cs="Times New Roman"/>
-        </w:rPr>
-        <w:t xml:space="preserve"> </w:t>
-      </w:r>
-      <w:del w:id="24" w:author="Benjamin J. Makhlouf" w:date="2026-03-01T19:38:00Z" w16du:dateUtc="2026-03-02T03:38:00Z">
+      <w:del w:id="29" w:author="Benjamin J. Makhlouf" w:date="2026-03-02T10:59:00Z" w16du:dateUtc="2026-03-02T18:59:00Z">
+        <w:r>
+          <w:rPr>
+            <w:rFonts w:ascii="Times New Roman" w:hAnsi="Times New Roman" w:cs="Times New Roman"/>
+          </w:rPr>
+          <w:delText xml:space="preserve"> </w:delText>
+        </w:r>
+      </w:del>
+      <w:del w:id="30" w:author="Benjamin J. Makhlouf" w:date="2026-03-01T19:38:00Z" w16du:dateUtc="2026-03-02T03:38:00Z">
         <w:r>
           <w:rPr>
             <w:rFonts w:ascii="Times New Roman" w:hAnsi="Times New Roman" w:cs="Times New Roman"/>
@@ -3512,12 +3544,12 @@
           <w:delText>re</w:delText>
         </w:r>
       </w:del>
-      <w:ins w:id="25" w:author="Benjamin J. Makhlouf" w:date="2026-03-01T19:37:00Z" w16du:dateUtc="2026-03-02T03:37:00Z">
+      <w:ins w:id="31" w:author="Benjamin J. Makhlouf" w:date="2026-03-01T19:37:00Z" w16du:dateUtc="2026-03-02T03:37:00Z">
         <w:r>
           <w:rPr>
             <w:rFonts w:ascii="Times New Roman" w:hAnsi="Times New Roman" w:cs="Times New Roman"/>
           </w:rPr>
-          <w:t xml:space="preserve">slice of epoxy with an embedded section of the otolith which contained the growth structure and core. </w:t>
+          <w:t xml:space="preserve">section which contained the growth structure and core. </w:t>
         </w:r>
         <w:r>
           <w:rPr>
@@ -3526,7 +3558,7 @@
           <w:t xml:space="preserve">This </w:t>
         </w:r>
       </w:ins>
-      <w:ins w:id="26" w:author="Benjamin J. Makhlouf" w:date="2026-03-01T19:38:00Z" w16du:dateUtc="2026-03-02T03:38:00Z">
+      <w:ins w:id="32" w:author="Benjamin J. Makhlouf" w:date="2026-03-01T19:38:00Z" w16du:dateUtc="2026-03-02T03:38:00Z">
         <w:r>
           <w:rPr>
             <w:rFonts w:ascii="Times New Roman" w:hAnsi="Times New Roman" w:cs="Times New Roman"/>
@@ -3534,7 +3566,7 @@
           <w:t xml:space="preserve">section was </w:t>
         </w:r>
       </w:ins>
-      <w:del w:id="27" w:author="Benjamin J. Makhlouf" w:date="2026-03-01T19:36:00Z" w16du:dateUtc="2026-03-02T03:36:00Z">
+      <w:del w:id="33" w:author="Benjamin J. Makhlouf" w:date="2026-03-01T19:36:00Z" w16du:dateUtc="2026-03-02T03:36:00Z">
         <w:r>
           <w:rPr>
             <w:rFonts w:ascii="Times New Roman" w:hAnsi="Times New Roman" w:cs="Times New Roman"/>
@@ -3542,7 +3574,7 @@
           <w:delText>veal</w:delText>
         </w:r>
       </w:del>
-      <w:del w:id="28" w:author="Benjamin J. Makhlouf" w:date="2026-03-01T19:37:00Z" w16du:dateUtc="2026-03-02T03:37:00Z">
+      <w:del w:id="34" w:author="Benjamin J. Makhlouf" w:date="2026-03-01T19:37:00Z" w16du:dateUtc="2026-03-02T03:37:00Z">
         <w:r>
           <w:rPr>
             <w:rFonts w:ascii="Times New Roman" w:hAnsi="Times New Roman" w:cs="Times New Roman"/>
@@ -3550,7 +3582,7 @@
           <w:delText xml:space="preserve"> the growth structure of the otolith</w:delText>
         </w:r>
       </w:del>
-      <w:del w:id="29" w:author="Benjamin J. Makhlouf" w:date="2026-03-01T19:35:00Z" w16du:dateUtc="2026-03-02T03:35:00Z">
+      <w:del w:id="35" w:author="Benjamin J. Makhlouf" w:date="2026-03-01T19:35:00Z" w16du:dateUtc="2026-03-02T03:35:00Z">
         <w:r>
           <w:rPr>
             <w:rFonts w:ascii="Times New Roman" w:hAnsi="Times New Roman" w:cs="Times New Roman"/>
@@ -3564,40 +3596,39 @@
         </w:rPr>
         <w:t>mounted on microscope slide</w:t>
       </w:r>
-      <w:ins w:id="30" w:author="Benjamin J. Makhlouf" w:date="2026-03-01T19:38:00Z" w16du:dateUtc="2026-03-02T03:38:00Z">
+      <w:ins w:id="36" w:author="Benjamin J. Makhlouf" w:date="2026-03-01T19:38:00Z" w16du:dateUtc="2026-03-02T03:38:00Z">
         <w:r>
           <w:rPr>
             <w:rFonts w:ascii="Times New Roman" w:hAnsi="Times New Roman" w:cs="Times New Roman"/>
           </w:rPr>
-          <w:t xml:space="preserve"> using </w:t>
+          <w:t xml:space="preserve"> </w:t>
         </w:r>
+      </w:ins>
+      <w:ins w:id="37" w:author="Benjamin J. Makhlouf" w:date="2026-03-02T10:54:00Z" w16du:dateUtc="2026-03-02T18:54:00Z">
         <w:r>
           <w:rPr>
             <w:rFonts w:ascii="Times New Roman" w:hAnsi="Times New Roman" w:cs="Times New Roman"/>
-            <w:highlight w:val="yellow"/>
-            <w:rPrChange w:id="31" w:author="Benjamin J. Makhlouf" w:date="2026-03-01T19:39:00Z" w16du:dateUtc="2026-03-02T03:39:00Z">
-              <w:rPr>
-                <w:rFonts w:ascii="Times New Roman" w:hAnsi="Times New Roman" w:cs="Times New Roman"/>
-              </w:rPr>
-            </w:rPrChange>
           </w:rPr>
-          <w:t xml:space="preserve">X </w:t>
+          <w:t xml:space="preserve">using </w:t>
         </w:r>
+      </w:ins>
+      <w:ins w:id="38" w:author="Benjamin J. Makhlouf" w:date="2026-03-02T10:57:00Z" w16du:dateUtc="2026-03-02T18:57:00Z">
         <w:r>
           <w:rPr>
             <w:rFonts w:ascii="Times New Roman" w:hAnsi="Times New Roman" w:cs="Times New Roman"/>
-            <w:color w:val="EE0000"/>
-            <w:highlight w:val="yellow"/>
-            <w:rPrChange w:id="32" w:author="Benjamin J. Makhlouf" w:date="2026-03-01T19:39:00Z" w16du:dateUtc="2026-03-02T03:39:00Z">
-              <w:rPr>
-                <w:rFonts w:ascii="Times New Roman" w:hAnsi="Times New Roman" w:cs="Times New Roman"/>
-              </w:rPr>
-            </w:rPrChange>
           </w:rPr>
-          <w:t>glue</w:t>
+          <w:t xml:space="preserve">liquid </w:t>
         </w:r>
       </w:ins>
-      <w:del w:id="33" w:author="Benjamin J. Makhlouf" w:date="2026-03-01T19:38:00Z" w16du:dateUtc="2026-03-02T03:38:00Z">
+      <w:ins w:id="39" w:author="Benjamin J. Makhlouf" w:date="2026-03-02T10:54:00Z" w16du:dateUtc="2026-03-02T18:54:00Z">
+        <w:r>
+          <w:rPr>
+            <w:rFonts w:ascii="Times New Roman" w:hAnsi="Times New Roman" w:cs="Times New Roman"/>
+          </w:rPr>
+          <w:t xml:space="preserve">superglue </w:t>
+        </w:r>
+      </w:ins>
+      <w:del w:id="40" w:author="Benjamin J. Makhlouf" w:date="2026-03-01T19:38:00Z" w16du:dateUtc="2026-03-02T03:38:00Z">
         <w:r>
           <w:rPr>
             <w:rFonts w:ascii="Times New Roman" w:hAnsi="Times New Roman" w:cs="Times New Roman"/>
@@ -3605,15 +3636,15 @@
           <w:delText>s</w:delText>
         </w:r>
       </w:del>
-      <w:ins w:id="34" w:author="Benjamin J. Makhlouf" w:date="2026-03-01T19:39:00Z" w16du:dateUtc="2026-03-02T03:39:00Z">
+      <w:ins w:id="41" w:author="Benjamin J. Makhlouf" w:date="2026-03-01T19:39:00Z" w16du:dateUtc="2026-03-02T03:39:00Z">
         <w:r>
           <w:rPr>
             <w:rFonts w:ascii="Times New Roman" w:hAnsi="Times New Roman" w:cs="Times New Roman"/>
           </w:rPr>
-          <w:t xml:space="preserve"> and </w:t>
+          <w:t xml:space="preserve">and </w:t>
         </w:r>
       </w:ins>
-      <w:del w:id="35" w:author="Benjamin J. Makhlouf" w:date="2026-03-01T19:39:00Z" w16du:dateUtc="2026-03-02T03:39:00Z">
+      <w:del w:id="42" w:author="Benjamin J. Makhlouf" w:date="2026-03-01T19:39:00Z" w16du:dateUtc="2026-03-02T03:39:00Z">
         <w:r>
           <w:rPr>
             <w:rFonts w:ascii="Times New Roman" w:hAnsi="Times New Roman" w:cs="Times New Roman"/>
@@ -3627,7 +3658,7 @@
         </w:rPr>
         <w:t>polished</w:t>
       </w:r>
-      <w:ins w:id="36" w:author="Benjamin J. Makhlouf" w:date="2026-03-01T19:39:00Z" w16du:dateUtc="2026-03-02T03:39:00Z">
+      <w:ins w:id="43" w:author="Benjamin J. Makhlouf" w:date="2026-03-01T19:39:00Z" w16du:dateUtc="2026-03-02T03:39:00Z">
         <w:r>
           <w:rPr>
             <w:rFonts w:ascii="Times New Roman" w:hAnsi="Times New Roman" w:cs="Times New Roman"/>
@@ -3638,20 +3669,52 @@
           <w:rPr>
             <w:rFonts w:ascii="Times New Roman" w:hAnsi="Times New Roman" w:cs="Times New Roman"/>
             <w:highlight w:val="yellow"/>
-            <w:rPrChange w:id="37" w:author="Benjamin J. Makhlouf" w:date="2026-03-01T19:39:00Z" w16du:dateUtc="2026-03-02T03:39:00Z">
+            <w:rPrChange w:id="44" w:author="Benjamin J. Makhlouf" w:date="2026-03-01T19:39:00Z" w16du:dateUtc="2026-03-02T03:39:00Z">
               <w:rPr>
                 <w:rFonts w:ascii="Times New Roman" w:hAnsi="Times New Roman" w:cs="Times New Roman"/>
               </w:rPr>
             </w:rPrChange>
           </w:rPr>
-          <w:t>using X alumina powder</w:t>
+          <w:t xml:space="preserve">using </w:t>
         </w:r>
       </w:ins>
-      <w:r>
-        <w:rPr>
-          <w:rFonts w:ascii="Times New Roman" w:hAnsi="Times New Roman" w:cs="Times New Roman"/>
-        </w:rPr>
-        <w:t xml:space="preserve"> to enhance clarity</w:t>
+      <w:ins w:id="45" w:author="Benjamin J. Makhlouf" w:date="2026-03-02T10:55:00Z" w16du:dateUtc="2026-03-02T18:55:00Z">
+        <w:r>
+          <w:rPr>
+            <w:rFonts w:ascii="Times New Roman" w:hAnsi="Times New Roman" w:cs="Times New Roman"/>
+          </w:rPr>
+          <w:t>alumina powder (</w:t>
+        </w:r>
+      </w:ins>
+      <w:ins w:id="46" w:author="Benjamin J. Makhlouf" w:date="2026-03-02T10:57:00Z" w16du:dateUtc="2026-03-02T18:57:00Z">
+        <w:r>
+          <w:rPr>
+            <w:rFonts w:ascii="Times New Roman" w:hAnsi="Times New Roman" w:cs="Times New Roman"/>
+          </w:rPr>
+          <w:t xml:space="preserve">Type DX, </w:t>
+        </w:r>
+      </w:ins>
+      <w:ins w:id="47" w:author="Benjamin J. Makhlouf" w:date="2026-03-02T10:55:00Z" w16du:dateUtc="2026-03-02T18:55:00Z">
+        <w:r>
+          <w:rPr>
+            <w:rFonts w:ascii="Times New Roman" w:hAnsi="Times New Roman" w:cs="Times New Roman"/>
+          </w:rPr>
+          <w:t xml:space="preserve">Electron Microscope Sciences) </w:t>
+        </w:r>
+      </w:ins>
+      <w:del w:id="48" w:author="Benjamin J. Makhlouf" w:date="2026-03-02T10:54:00Z" w16du:dateUtc="2026-03-02T18:54:00Z">
+        <w:r>
+          <w:rPr>
+            <w:rFonts w:ascii="Times New Roman" w:hAnsi="Times New Roman" w:cs="Times New Roman"/>
+          </w:rPr>
+          <w:delText xml:space="preserve"> </w:delText>
+        </w:r>
+      </w:del>
+      <w:r>
+        <w:rPr>
+          <w:rFonts w:ascii="Times New Roman" w:hAnsi="Times New Roman" w:cs="Times New Roman"/>
+        </w:rPr>
+        <w:t>to enhance clarity</w:t>
       </w:r>
       <w:r>
         <w:rPr>
@@ -3934,7 +3997,7 @@
         </w:rPr>
         <w:t xml:space="preserve"> assigned following methods outlined in Makhlouf et al., 2025</w:t>
       </w:r>
-      <w:del w:id="38" w:author="Benjamin J. Makhlouf" w:date="2026-03-01T20:03:00Z" w16du:dateUtc="2026-03-02T04:03:00Z">
+      <w:del w:id="49" w:author="Benjamin J. Makhlouf" w:date="2026-03-01T20:03:00Z" w16du:dateUtc="2026-03-02T04:03:00Z">
         <w:r>
           <w:rPr>
             <w:rFonts w:ascii="Times New Roman" w:hAnsi="Times New Roman" w:cs="Times New Roman"/>
@@ -4437,7 +4500,7 @@
         </w:rPr>
         <w:t xml:space="preserve"> randomized </w:t>
       </w:r>
-      <w:ins w:id="39" w:author="Benjamin J. Makhlouf" w:date="2026-03-01T20:13:00Z" w16du:dateUtc="2026-03-02T04:13:00Z">
+      <w:ins w:id="50" w:author="Benjamin J. Makhlouf" w:date="2026-03-01T20:13:00Z" w16du:dateUtc="2026-03-02T04:13:00Z">
         <w:r>
           <w:rPr>
             <w:rFonts w:ascii="Times New Roman" w:hAnsi="Times New Roman" w:cs="Times New Roman"/>
@@ -4445,7 +4508,7 @@
           <w:t xml:space="preserve">among samples and </w:t>
         </w:r>
       </w:ins>
-      <w:ins w:id="40" w:author="Benjamin J. Makhlouf" w:date="2026-03-01T20:12:00Z" w16du:dateUtc="2026-03-02T04:12:00Z">
+      <w:ins w:id="51" w:author="Benjamin J. Makhlouf" w:date="2026-03-01T20:12:00Z" w16du:dateUtc="2026-03-02T04:12:00Z">
         <w:r>
           <w:rPr>
             <w:rFonts w:ascii="Times New Roman" w:hAnsi="Times New Roman" w:cs="Times New Roman"/>
@@ -4453,7 +4516,7 @@
           <w:t xml:space="preserve">done without knowing the </w:t>
         </w:r>
       </w:ins>
-      <w:ins w:id="41" w:author="Benjamin J. Makhlouf" w:date="2026-03-01T20:13:00Z" w16du:dateUtc="2026-03-02T04:13:00Z">
+      <w:ins w:id="52" w:author="Benjamin J. Makhlouf" w:date="2026-03-01T20:13:00Z" w16du:dateUtc="2026-03-02T04:13:00Z">
         <w:r>
           <w:rPr>
             <w:rFonts w:ascii="Times New Roman" w:hAnsi="Times New Roman" w:cs="Times New Roman"/>
@@ -4475,7 +4538,7 @@
           <w:t xml:space="preserve"> </w:t>
         </w:r>
       </w:ins>
-      <w:del w:id="42" w:author="Benjamin J. Makhlouf" w:date="2026-03-01T20:12:00Z" w16du:dateUtc="2026-03-02T04:12:00Z">
+      <w:del w:id="53" w:author="Benjamin J. Makhlouf" w:date="2026-03-01T20:12:00Z" w16du:dateUtc="2026-03-02T04:12:00Z">
         <w:r>
           <w:rPr>
             <w:rFonts w:ascii="Times New Roman" w:hAnsi="Times New Roman" w:cs="Times New Roman"/>
@@ -4483,7 +4546,7 @@
           <w:delText xml:space="preserve">and </w:delText>
         </w:r>
       </w:del>
-      <w:del w:id="43" w:author="Benjamin J. Makhlouf" w:date="2026-03-01T20:13:00Z" w16du:dateUtc="2026-03-02T04:13:00Z">
+      <w:del w:id="54" w:author="Benjamin J. Makhlouf" w:date="2026-03-01T20:13:00Z" w16du:dateUtc="2026-03-02T04:13:00Z">
         <w:r>
           <w:rPr>
             <w:rFonts w:ascii="Times New Roman" w:hAnsi="Times New Roman" w:cs="Times New Roman"/>
@@ -6188,12 +6251,12 @@
       <w:r>
         <w:t xml:space="preserve"> </w:t>
       </w:r>
-      <w:ins w:id="44" w:author="Benjamin J. Makhlouf" w:date="2026-03-01T20:21:00Z" w16du:dateUtc="2026-03-02T04:21:00Z">
+      <w:ins w:id="55" w:author="Benjamin J. Makhlouf" w:date="2026-03-01T20:21:00Z" w16du:dateUtc="2026-03-02T04:21:00Z">
         <w:r>
           <w:t>2</w:t>
         </w:r>
       </w:ins>
-      <w:del w:id="45" w:author="Benjamin J. Makhlouf" w:date="2026-03-01T20:21:00Z" w16du:dateUtc="2026-03-02T04:21:00Z">
+      <w:del w:id="56" w:author="Benjamin J. Makhlouf" w:date="2026-03-01T20:21:00Z" w16du:dateUtc="2026-03-02T04:21:00Z">
         <w:r>
           <w:delText>1.</w:delText>
         </w:r>
@@ -6374,12 +6437,12 @@
       <w:r>
         <w:t xml:space="preserve">Principal component analysis of the full GAM-smoothed dataset (n = 2,531) revealed </w:t>
       </w:r>
-      <w:ins w:id="46" w:author="Benjamin J. Makhlouf" w:date="2026-03-01T20:18:00Z" w16du:dateUtc="2026-03-02T04:18:00Z">
+      <w:ins w:id="57" w:author="Benjamin J. Makhlouf" w:date="2026-03-01T20:18:00Z" w16du:dateUtc="2026-03-02T04:18:00Z">
         <w:r>
           <w:t xml:space="preserve">substantial </w:t>
         </w:r>
       </w:ins>
-      <w:del w:id="47" w:author="Benjamin J. Makhlouf" w:date="2026-03-01T20:18:00Z" w16du:dateUtc="2026-03-02T04:18:00Z">
+      <w:del w:id="58" w:author="Benjamin J. Makhlouf" w:date="2026-03-01T20:18:00Z" w16du:dateUtc="2026-03-02T04:18:00Z">
         <w:r>
           <w:delText xml:space="preserve">significant </w:delText>
         </w:r>
@@ -7309,7 +7372,7 @@
         </w:rPr>
         <w:t xml:space="preserve">Classification accuracy within the CWAK reporting group, which includes the Kuskokwim, Nushagak, and Lower Yukon regions was 90.0%. Classification accuracy for regions in our dataset not within CWAK was 97.9%. Yukon classification accuracy for those within the CWAK group fell to 73.3%. However, it should be noted that the sample size of CWAK Yukon individuals was </w:t>
       </w:r>
-      <w:ins w:id="48" w:author="Benjamin J. Makhlouf" w:date="2026-03-01T20:19:00Z" w16du:dateUtc="2026-03-02T04:19:00Z">
+      <w:ins w:id="59" w:author="Benjamin J. Makhlouf" w:date="2026-03-01T20:19:00Z" w16du:dateUtc="2026-03-02T04:19:00Z">
         <w:r>
           <w:rPr>
             <w:rFonts w:ascii="Times New Roman" w:hAnsi="Times New Roman" w:cs="Times New Roman"/>
@@ -7317,7 +7380,7 @@
           <w:t xml:space="preserve">substantially </w:t>
         </w:r>
       </w:ins>
-      <w:del w:id="49" w:author="Benjamin J. Makhlouf" w:date="2026-03-01T20:19:00Z" w16du:dateUtc="2026-03-02T04:19:00Z">
+      <w:del w:id="60" w:author="Benjamin J. Makhlouf" w:date="2026-03-01T20:19:00Z" w16du:dateUtc="2026-03-02T04:19:00Z">
         <w:r>
           <w:rPr>
             <w:rFonts w:ascii="Times New Roman" w:hAnsi="Times New Roman" w:cs="Times New Roman"/>
@@ -7504,7 +7567,7 @@
         </w:rPr>
         <w:t>accuracy ranged from 91</w:t>
       </w:r>
-      <w:ins w:id="50" w:author="Benjamin J. Makhlouf" w:date="2026-03-01T20:23:00Z" w16du:dateUtc="2026-03-02T04:23:00Z">
+      <w:ins w:id="61" w:author="Benjamin J. Makhlouf" w:date="2026-03-01T20:23:00Z" w16du:dateUtc="2026-03-02T04:23:00Z">
         <w:r>
           <w:rPr>
             <w:rFonts w:ascii="Times New Roman" w:hAnsi="Times New Roman" w:cs="Times New Roman"/>
@@ -7518,7 +7581,7 @@
         </w:rPr>
         <w:t xml:space="preserve"> </w:t>
       </w:r>
-      <w:ins w:id="51" w:author="Benjamin J. Makhlouf" w:date="2026-03-01T20:23:00Z" w16du:dateUtc="2026-03-02T04:23:00Z">
+      <w:ins w:id="62" w:author="Benjamin J. Makhlouf" w:date="2026-03-01T20:23:00Z" w16du:dateUtc="2026-03-02T04:23:00Z">
         <w:r>
           <w:rPr>
             <w:rFonts w:ascii="Times New Roman" w:hAnsi="Times New Roman" w:cs="Times New Roman"/>
@@ -7526,7 +7589,7 @@
           <w:t xml:space="preserve">to </w:t>
         </w:r>
       </w:ins>
-      <w:del w:id="52" w:author="Benjamin J. Makhlouf" w:date="2026-03-01T20:23:00Z" w16du:dateUtc="2026-03-02T04:23:00Z">
+      <w:del w:id="63" w:author="Benjamin J. Makhlouf" w:date="2026-03-01T20:23:00Z" w16du:dateUtc="2026-03-02T04:23:00Z">
         <w:r>
           <w:rPr>
             <w:rFonts w:ascii="Times New Roman" w:hAnsi="Times New Roman" w:cs="Times New Roman"/>
@@ -7774,7 +7837,7 @@
         </w:rPr>
         <w:t xml:space="preserve"> smoothing techniques s</w:t>
       </w:r>
-      <w:ins w:id="53" w:author="Benjamin J. Makhlouf" w:date="2026-03-01T20:17:00Z" w16du:dateUtc="2026-03-02T04:17:00Z">
+      <w:ins w:id="64" w:author="Benjamin J. Makhlouf" w:date="2026-03-01T20:17:00Z" w16du:dateUtc="2026-03-02T04:17:00Z">
         <w:r>
           <w:rPr>
             <w:rFonts w:ascii="Times New Roman" w:hAnsi="Times New Roman" w:cs="Times New Roman"/>
@@ -7782,7 +7845,7 @@
           <w:t xml:space="preserve">ubstantially </w:t>
         </w:r>
       </w:ins>
-      <w:del w:id="54" w:author="Benjamin J. Makhlouf" w:date="2026-03-01T20:17:00Z" w16du:dateUtc="2026-03-02T04:17:00Z">
+      <w:del w:id="65" w:author="Benjamin J. Makhlouf" w:date="2026-03-01T20:17:00Z" w16du:dateUtc="2026-03-02T04:17:00Z">
         <w:r>
           <w:rPr>
             <w:rFonts w:ascii="Times New Roman" w:hAnsi="Times New Roman" w:cs="Times New Roman"/>
@@ -8015,7 +8078,7 @@
         </w:rPr>
         <w:t xml:space="preserve">This limitation is further illustrated in the confidence threshold analysis, in which we imposed the additional requirement that the model must assign to the correct class with a calibrated probability value above a given threshold. Preforming this analysis on the total dataset resulted in a </w:t>
       </w:r>
-      <w:ins w:id="55" w:author="Benjamin J. Makhlouf" w:date="2026-03-01T20:18:00Z" w16du:dateUtc="2026-03-02T04:18:00Z">
+      <w:ins w:id="66" w:author="Benjamin J. Makhlouf" w:date="2026-03-01T20:18:00Z" w16du:dateUtc="2026-03-02T04:18:00Z">
         <w:r>
           <w:rPr>
             <w:rFonts w:ascii="Times New Roman" w:hAnsi="Times New Roman" w:cs="Times New Roman"/>
@@ -8023,7 +8086,7 @@
           <w:t xml:space="preserve">substantial </w:t>
         </w:r>
       </w:ins>
-      <w:del w:id="56" w:author="Benjamin J. Makhlouf" w:date="2026-03-01T20:18:00Z" w16du:dateUtc="2026-03-02T04:18:00Z">
+      <w:del w:id="67" w:author="Benjamin J. Makhlouf" w:date="2026-03-01T20:18:00Z" w16du:dateUtc="2026-03-02T04:18:00Z">
         <w:r>
           <w:rPr>
             <w:rFonts w:ascii="Times New Roman" w:hAnsi="Times New Roman" w:cs="Times New Roman"/>
@@ -8624,6 +8687,7 @@
       <w:r>
         <w:t xml:space="preserve">of hypotheses of declining population health by allowing for an explicit assessment of marine mortality on stock specific health. </w:t>
       </w:r>
+      <w:bookmarkStart w:id="68" w:name="_Hlk223339650"/>
       <w:r>
         <w:t xml:space="preserve">The </w:t>
       </w:r>
@@ -8655,11 +8719,28 @@
         <w:t>provenance and</w:t>
       </w:r>
       <w:r>
-        <w:t xml:space="preserve"> calibrated may be immediately useful for classifying adult Chinook salmon from western Alaska watershed</w:t>
+        <w:t xml:space="preserve"> </w:t>
+      </w:r>
+      <w:ins w:id="69" w:author="Benjamin J. Makhlouf" w:date="2026-03-02T10:14:00Z" w16du:dateUtc="2026-03-02T18:14:00Z">
+        <w:r>
+          <w:t xml:space="preserve">a </w:t>
+        </w:r>
+      </w:ins>
+      <w:r>
+        <w:t xml:space="preserve">calibrated </w:t>
+      </w:r>
+      <w:ins w:id="70" w:author="Benjamin J. Makhlouf" w:date="2026-03-02T10:14:00Z" w16du:dateUtc="2026-03-02T18:14:00Z">
+        <w:r>
+          <w:t xml:space="preserve">classification model that </w:t>
+        </w:r>
+      </w:ins>
+      <w:r>
+        <w:t>may be immediately useful for classifying adult Chinook salmon from western Alaska watershed</w:t>
       </w:r>
       <w:r>
         <w:t>s</w:t>
       </w:r>
+      <w:bookmarkEnd w:id="68"/>
       <w:r>
         <w:t xml:space="preserve">. </w:t>
       </w:r>
@@ -8667,7 +8748,16 @@
         <w:t xml:space="preserve">Our dataset is unusually large for its type and includes samples collected across several years and from nearly all parts of the sampled watersheds. As such, we expect it to be broadly representative of the natural variability among years, and that the model presented here will generalize well to new years of data. However, due to sample size constraints we did not include a true validation set from a year excluded from the training and testing data, leaving open the possibility that some degree of overfitting to this dataset could affect assignment accuracy for unseen years. </w:t>
       </w:r>
       <w:r>
-        <w:t xml:space="preserve">During exploratory analyses, we conducted a preliminary cross-year validation in which one year of Yukon data was withheld in each run and used as a validation set. Classification accuracy across years was generally consistent with testing performance, except for 2019, which performed moderately worse, possibly due to differences in sample preparation or data quality. While these preliminary results were not included in the final </w:t>
+        <w:rPr>
+          <w:highlight w:val="yellow"/>
+          <w:rPrChange w:id="71" w:author="Benjamin J. Makhlouf" w:date="2026-03-02T10:25:00Z" w16du:dateUtc="2026-03-02T18:25:00Z">
+            <w:rPr/>
+          </w:rPrChange>
+        </w:rPr>
+        <w:t>During exploratory analyses, we conducted a preliminary cross-year validation in which one year of Yukon data was withheld in each run and used as a validation set.</w:t>
+      </w:r>
+      <w:r>
+        <w:t xml:space="preserve"> Classification accuracy across years was generally consistent with testing performance, except for 2019, which performed moderately worse, possibly due to differences in sample preparation or data quality. While these preliminary results were not included in the final </w:t>
       </w:r>
       <w:proofErr w:type="gramStart"/>
       <w:r>
@@ -8678,11 +8768,11 @@
         <w:t xml:space="preserve"> they support the potential for this model to generalize to new years of data, </w:t>
       </w:r>
       <w:r>
-        <w:t xml:space="preserve">which we plan to further evaluate as additional, currently unprocessed years </w:t>
+        <w:t xml:space="preserve">which we plan to further </w:t>
       </w:r>
       <w:r>
         <w:lastRenderedPageBreak/>
-        <w:t xml:space="preserve">of otolith data become available. </w:t>
+        <w:t xml:space="preserve">evaluate as additional, currently unprocessed years of otolith data become available. </w:t>
       </w:r>
       <w:r>
         <w:t xml:space="preserve">Additionally, sample preparation procedures and </w:t>
@@ -8712,30 +8802,58 @@
         <w:t xml:space="preserve">dynamic time warping </w:t>
       </w:r>
       <w:r>
-        <w:t>(Arai et al., 2025 (</w:t>
-      </w:r>
-      <w:r>
-        <w:rPr>
-          <w:i/>
-          <w:iCs/>
-        </w:rPr>
-        <w:t xml:space="preserve">in </w:t>
-      </w:r>
-      <w:r>
-        <w:rPr>
-          <w:i/>
-          <w:iCs/>
-        </w:rPr>
-        <w:t>review</w:t>
-      </w:r>
-      <w:r>
-        <w:t>)</w:t>
-      </w:r>
-      <w:r>
-        <w:t>)</w:t>
-      </w:r>
-      <w:r>
-        <w:t xml:space="preserve">, or deep learning approaches which can accommodate variation in time-series length and </w:t>
+        <w:fldChar w:fldCharType="begin"/>
+      </w:r>
+      <w:r>
+        <w:instrText xml:space="preserve"> ADDIN ZOTERO_ITEM CSL_CITATION {"citationID":"j7zBNeS5","properties":{"formattedCitation":"(Arai et al., 2026; Hegg &amp; Kennedy, 2021)","plainCitation":"(Arai et al., 2026; Hegg &amp; Kennedy, 2021)","noteIndex":0},"citationItems":[{"id":6459,"uris":["http://zotero.org/users/8421274/items/DFJGSZE5"],"itemData":{"id":6459,"type":"article-journal","abstract":"Accurate provenance assignment is critical for understanding ecological connectivity and guiding conservation and management. Natural chemical chronologies stored in metabolically inert, incrementally growing tissues (e.g., otoliths) provide a powerful tool for this purpose. However, traditional approaches face biological challenges, collapse chronological data into single values, and require subjective interpretation, limiting accuracy and scalability. We present a novel framework that integrates machine learning, time series analysis, and ensemble modeling to improve provenance assignment from archival tissue chemistry. Using otolith 87Sr/86Sr profiles from 17 distinct natal sources (n = 255) of California Central Valley Chinook salmon, we developed automated feature extraction, explicit time series classification (including dynamic time warping [DTW] with k-nearest neighbors [KNN]), and ensembles combining multiple classifiers. Furthermore, to address gaps in under-sampled life histories within natal sources, we added simulated chemical profiles to the reference baseline and tested whether they improved model performance. Time series approaches (mean accuracy: 0.56–0.62) consistently outperformed traditional methods (0.48), particularly for sources influenced by maternal signatures or early dispersal. Feature extraction approaches performed best when profiles followed predictable life-stage patterns, while explicit time series classification (DTW + KNN) excelled for distinct profile “shapes”. Ensembles leveraged complementary strengths and outperformed any single method. Our results highlight the advantages of treating archival chemical data as time series and applying machine learning and ensemble strategies to enhance the accuracy and scalability of provenance assignment. This framework is broadly applicable across taxa, tissue types, and chemical markers, offering a roadmap for advancing ecological inference and conservation.","container-title":"Ecological Informatics","DOI":"10.1016/j.ecoinf.2026.103604","ISSN":"1574-9541","journalAbbreviation":"Ecological Informatics","page":"103604","source":"ScienceDirect","title":"Advancing provenance assignment using machine learning and time series analysis of chemical chronologies in archival tissues","volume":"93","author":[{"family":"Arai","given":"Kohma"},{"family":"Willmes","given":"Malte"},{"family":"Johnson","given":"Rachel C."},{"family":"Sturrock","given":"Anna M."}],"issued":{"date-parts":[["2026",2,1]]}}},{"id":4390,"uris":["http://zotero.org/users/8421274/items/BD9UPNI2"],"itemData":{"id":4390,"type":"article-journal","abstract":"Ecological patterns are often fundamentally chronological. However, generalization of data is necessarily accompanied by a loss of detail or resolution. Temporal data in particular contain information not only in data values but in the temporal structure, which is lost when these values are aggregated to provide point estimates. Dynamic time warping (DTW) is a time series comparison method that is capable of efficiently comparing series despite temporal offsets that confound other methods. The DTW method is both efficient and remarkably flexible, capable of efficiently matching not only time series but also any sequentially structured data set, which has made it a popular technique in machine learning, artificial intelligence, and big data analytical tasks. DTW is rarely used in ecology despite the ubiquity of temporally structured data. As technological advances have increased the richness of small-scale ecological data, DTW may be an attractive analysis technique because it is able to utilize the additional information contained in the temporal structure of many ecological data sets. In this study, we use an example data set of high-resolution fish movement records obtained from otolith microchemistry to compare traditional analysis techniques with DTW clustering. Our results suggest that DTW is capable of detecting subtle behavioral patterns within otolith data sets which traditional data aggregation techniques cannot. These results provide evidence that the DTW method may be useful across many of the temporal data types commonly collected in ecology, as well other sequentially ordered “pseudo time series” data such as classification of species by shape.","container-title":"Ecosphere","DOI":"10.1002/ecs2.3742","ISSN":"2150-8925","issue":"9","language":"en","note":"_eprint: https://esajournals.onlinelibrary.wiley.com/doi/pdf/10.1002/ecs2.3742","page":"e03742","source":"Wiley Online Library","title":"Let's do the time warp again: non-linear time series matching as a tool for sequentially structured data in ecology","title-short":"Let's do the time warp again","volume":"12","author":[{"family":"Hegg","given":"Jens C."},{"family":"Kennedy","given":"Brian P."}],"issued":{"date-parts":[["2021"]]}}}],"schema":"https://github.com/citation-style-language/schema/raw/master/csl-citation.json"} </w:instrText>
+      </w:r>
+      <w:r>
+        <w:fldChar w:fldCharType="separate"/>
+      </w:r>
+      <w:r>
+        <w:rPr>
+          <w:noProof/>
+        </w:rPr>
+        <w:t>(Arai et al., 2026; Hegg &amp; Kennedy, 2021)</w:t>
+      </w:r>
+      <w:r>
+        <w:fldChar w:fldCharType="end"/>
+      </w:r>
+      <w:ins w:id="72" w:author="Benjamin J. Makhlouf" w:date="2026-03-02T10:27:00Z" w16du:dateUtc="2026-03-02T18:27:00Z">
+        <w:r>
+          <w:t xml:space="preserve"> </w:t>
+        </w:r>
+      </w:ins>
+      <w:del w:id="73" w:author="Benjamin J. Makhlouf" w:date="2026-03-02T10:25:00Z" w16du:dateUtc="2026-03-02T18:25:00Z">
+        <w:r>
+          <w:delText>(Arai et al., 2025 (</w:delText>
+        </w:r>
+        <w:r>
+          <w:rPr>
+            <w:i/>
+            <w:iCs/>
+          </w:rPr>
+          <w:delText xml:space="preserve">in </w:delText>
+        </w:r>
+        <w:r>
+          <w:rPr>
+            <w:i/>
+            <w:iCs/>
+          </w:rPr>
+          <w:delText>review</w:delText>
+        </w:r>
+        <w:r>
+          <w:delText>)</w:delText>
+        </w:r>
+        <w:r>
+          <w:delText>)</w:delText>
+        </w:r>
+        <w:r>
+          <w:delText xml:space="preserve">, </w:delText>
+        </w:r>
+      </w:del>
+      <w:r>
+        <w:t xml:space="preserve">or deep learning approaches which can accommodate variation in time-series length and </w:t>
       </w:r>
       <w:proofErr w:type="spellStart"/>
       <w:r>
@@ -8869,11 +8987,37 @@
         <w:t>s</w:t>
       </w:r>
       <w:r>
-        <w:t xml:space="preserve"> limited for in-season management or rapid research applications. Otolith LA-ICPMS is costly and labor-intensive, making large-scale, real-time assessment of river origin for marine-caught samples impractical. Moreover, otolith </w:t>
+        <w:t xml:space="preserve"> limited for in-season management or rapid research applications. Otolith LA-ICPMS is costly and labor-intensive, making large-scale, </w:t>
       </w:r>
       <w:r>
         <w:lastRenderedPageBreak/>
-        <w:t xml:space="preserve">collection is lethal, which may be prohibitive given the increasingly endangered status of Chinook salmon in this region. The model also relies on a large existing dataset with known river-of-origin labels derived from unique sampling efforts, a resource not available for most other species of concern. For example, comparable datasets do not exist for chum salmon, constraining the </w:t>
+        <w:t>real-time assessment of river origin for marine-caught samples impractical. Moreover, otolith collection is lethal, which may be prohibitive given the increasingly endangered status of Chinook salmon in this region</w:t>
+      </w:r>
+      <w:ins w:id="74" w:author="Benjamin J. Makhlouf" w:date="2026-03-02T10:29:00Z" w16du:dateUtc="2026-03-02T18:29:00Z">
+        <w:r>
+          <w:t xml:space="preserve"> </w:t>
+        </w:r>
+      </w:ins>
+      <w:r>
+        <w:fldChar w:fldCharType="begin"/>
+      </w:r>
+      <w:r>
+        <w:instrText xml:space="preserve"> ADDIN ZOTERO_ITEM CSL_CITATION {"citationID":"L38gIQ1z","properties":{"formattedCitation":"(Feddern et al., 2023; Ohlberger et al., 2018; Schindler et al., 2013)","plainCitation":"(Feddern et al., 2023; Ohlberger et al., 2018; Schindler et al., 2013)","noteIndex":0},"citationItems":[{"id":4226,"uris":["http://zotero.org/users/8421274/items/53AYSP4H"],"itemData":{"id":4226,"type":"article-journal","abstract":"Understanding how species are responding to environmental change is a central challenge for stewards and managers of fish and wildlife who seek to maintain harvest opportunities for communities and Indigenous peoples. This is a particularly daunting but increasingly important task in remote, high-latitude regions where environmental conditions are changing rapidly and data collection is logistically difficult. The Arctic-Yukon-Kuskokwim (AYK) region encompasses the northern extent of the Chinook Salmon Oncorhynchus tshawytscha range where populations are experiencing rapid rates of environmental change across both freshwater and marine habitats due to global climate change. Climate-salmon interactions in the AYK region are a particularly pressing issue as many local communities have a deep reliance on a subsistence way of life. Here, we synthesize perspectives shared at a recent workshop on Chinook Salmon declines in the AYK region. The objectives were to discuss current understandings of climate-Chinook Salmon interactions, develop a set of outstanding questions, review available data and its limitations in addressing these questions, and describe the perspectives expressed by participants in this workshop from diverse backgrounds. We conclude by suggesting pathways forward to integrate different types of information and build relationships among communities, academic partners, and fishery management agencies.","container-title":"FISHERIES","DOI":"10.1002/fsh.10923","ISSN":"0363-2415, 1548-8446","issue":"8","journalAbbreviation":"Fisheries","language":"English","note":"number-of-pages: 13\npublisher-place: Hoboken\nWeb of Science ID: WOS:000998764500001","page":"331-343","publisher":"Wiley","source":"Clarivate Analytics Web of Science","title":"Kings of the North: Bridging Disciplines to Understand the Effects of Changing Climate on Chinook Salmon in the Arctic-Yukon-Kuskokwim Region","title-short":"Kings of the North","volume":"48","author":[{"family":"Feddern","given":"Megan L."},{"family":"Schoen","given":"Erik R."},{"family":"Shaftel","given":"Rebecca"},{"family":"Cunningham","given":"Curry J."},{"family":"Chythlook","given":"Craig"},{"family":"Connors","given":"Brendan M."},{"family":"Murdoch","given":"Alyssa D."},{"family":"Biela","given":"Vanessa R.","non-dropping-particle":"von"},{"family":"Woods","given":"Brooke"}],"issued":{"date-parts":[["2023",8]]}}},{"id":4421,"uris":["http://zotero.org/users/8421274/items/PUA9GF7A"],"itemData":{"id":4421,"type":"article-journal","abstract":"The demographic structure of populations is affected by life history strategies and how these interact with natural and anthropogenic factors such as exploitation, climate change, and biotic interactions. Previous work suggests that the mean size and age of some North American populations of Chinook salmon (Oncorhynchus tshawytscha, Salmonidae) are declining. These trends are of concern because Chinook salmon are highly valued commercially for their exceptional size and because the loss of the largest and oldest individuals may lead to reduced population productivity. Using long-term data from wild and hatchery populations, we quantified changes in the demographic structure of Chinook salmon populations over the past four decades across the Northeast Pacific Ocean, from California through western Alaska. Our results show that wild and hatchery fish are becoming smaller and younger throughout most of the Pacific coast. Proportions of older age classes have decreased over time in most regions. Simultaneously, the length-at-age of older fish has declined while the length-at-age of younger fish has typically increased. However, negative size trends of older ages were weak or non-existent at the southern end of the range. While it remains to be explored whether these trends are caused by changes in climate, fishing practices or species interactions such as predation, our qualitative review of the potential causes of demographic change suggests that selective removal of large fish has likely contributed to the apparent widespread declines in average body sizes.","container-title":"Fish and Fisheries","DOI":"10.1111/faf.12272","ISSN":"1467-2979","issue":"3","language":"en","license":"© 2018 The Authors. Fish and Fisheries published by John Wiley &amp; Sons Ltd.","note":"_eprint: https://onlinelibrary.wiley.com/doi/pdf/10.1111/faf.12272","page":"533-546","source":"Wiley Online Library","title":"Demographic changes in Chinook salmon across the Northeast Pacific Ocean","volume":"19","author":[{"family":"Ohlberger","given":"Jan"},{"family":"Ward","given":"Eric J"},{"family":"Schindler","given":"Daniel E"},{"family":"Lewis","given":"Bert"}],"issued":{"date-parts":[["2018"]]}}},{"id":4426,"uris":["http://zotero.org/users/8421274/items/GRMID2QD"],"itemData":{"id":4426,"type":"report","language":"en","source":"Zotero","title":"Arctic-Yukon-Kuskokwim Chinook Salmon Research Action Plan: Evidence of Decline of Chinook Salmon Populations and Recommendations for Future Research. Prepared for the AYK Sustainable Salmon Initiative","author":[{"family":"Schindler","given":"Daniel E"},{"family":"Krueger","given":"C"},{"family":"Bisson","given":"P"},{"family":"Bradford","given":"Michael J"},{"family":"Clark","given":"B"},{"family":"Conitz","given":"J"},{"family":"Howard","given":"K"},{"family":"Jones","given":"M"},{"family":"Murphy","given":"J"},{"family":"Myers","given":"Katherine W."},{"family":"Scheuerell","given":"Mark"},{"family":"Volk","given":"Eric C"},{"family":"Winton","given":"James"}],"issued":{"date-parts":[["2013",8]]}}}],"schema":"https://github.com/citation-style-language/schema/raw/master/csl-citation.json"} </w:instrText>
+      </w:r>
+      <w:r>
+        <w:fldChar w:fldCharType="separate"/>
+      </w:r>
+      <w:r>
+        <w:rPr>
+          <w:noProof/>
+        </w:rPr>
+        <w:t>(Feddern et al., 2023; Ohlberger et al., 2018; Schindler et al., 2013)</w:t>
+      </w:r>
+      <w:r>
+        <w:fldChar w:fldCharType="end"/>
+      </w:r>
+      <w:r>
+        <w:t xml:space="preserve">. The model also relies on a large existing dataset with known river-of-origin labels derived from unique sampling efforts, a resource not available for most other species of concern. For example, comparable datasets do not exist for chum salmon, constraining the </w:t>
       </w:r>
       <w:r>
         <w:t xml:space="preserve">application of these methods to other similar species of concern in the region. </w:t>
@@ -9063,7 +9207,15 @@
           <w:color w:val="222222"/>
           <w:shd w:val="clear" w:color="auto" w:fill="FFFFFF"/>
         </w:rPr>
-        <w:t>to advance isotope-based methods </w:t>
+        <w:t xml:space="preserve">to advance isotope-based </w:t>
+      </w:r>
+      <w:r>
+        <w:rPr>
+          <w:color w:val="222222"/>
+          <w:shd w:val="clear" w:color="auto" w:fill="FFFFFF"/>
+        </w:rPr>
+        <w:lastRenderedPageBreak/>
+        <w:t>methods </w:t>
       </w:r>
       <w:r>
         <w:rPr>
@@ -9078,15 +9230,7 @@
           <w:color w:val="222222"/>
           <w:shd w:val="clear" w:color="auto" w:fill="FFFFFF"/>
         </w:rPr>
-        <w:t xml:space="preserve">for ecological research in Alaska. We thank the University of </w:t>
-      </w:r>
-      <w:r>
-        <w:rPr>
-          <w:color w:val="222222"/>
-          <w:shd w:val="clear" w:color="auto" w:fill="FFFFFF"/>
-        </w:rPr>
-        <w:lastRenderedPageBreak/>
-        <w:t>Washington’s eScience Institute Data Science and AI Accelerator program, which provided significant mentorship and resources to a</w:t>
+        <w:t>for ecological research in Alaska. We thank the University of Washington’s eScience Institute Data Science and AI Accelerator program, which provided significant mentorship and resources to a</w:t>
       </w:r>
       <w:r>
         <w:rPr>
@@ -9507,6 +9651,7 @@
         </w:rPr>
       </w:pPr>
       <w:r>
+        <w:lastRenderedPageBreak/>
         <w:fldChar w:fldCharType="begin"/>
       </w:r>
       <w:r>
@@ -9565,7 +9710,6 @@
         <w:rPr>
           <w:rFonts w:ascii="Times New Roman" w:hAnsi="Times New Roman" w:cs="Times New Roman"/>
         </w:rPr>
-        <w:lastRenderedPageBreak/>
         <w:t xml:space="preserve">Arai, K., Castonguay, M., </w:t>
       </w:r>
       <w:proofErr w:type="spellStart"/>
@@ -9678,7 +9822,7 @@
         <w:rPr>
           <w:rFonts w:ascii="Times New Roman" w:hAnsi="Times New Roman" w:cs="Times New Roman"/>
         </w:rPr>
-        <w:t xml:space="preserve">Bataille, C. P., &amp; Bowen, G. J. (2012). Mapping 87Sr/86Sr variations in bedrock and water for large scale provenance studies. </w:t>
+        <w:t xml:space="preserve">Arai, K., Willmes, M., Johnson, R. C., &amp; Sturrock, A. M. (2026). Advancing provenance assignment using machine learning and time series analysis of chemical chronologies in archival tissues. </w:t>
       </w:r>
       <w:r>
         <w:rPr>
@@ -9686,7 +9830,7 @@
           <w:i/>
           <w:iCs/>
         </w:rPr>
-        <w:t>Chemical Geology</w:t>
+        <w:t>Ecological Informatics</w:t>
       </w:r>
       <w:r>
         <w:rPr>
@@ -9700,13 +9844,13 @@
           <w:i/>
           <w:iCs/>
         </w:rPr>
-        <w:t>304–305</w:t>
-      </w:r>
-      <w:r>
-        <w:rPr>
-          <w:rFonts w:ascii="Times New Roman" w:hAnsi="Times New Roman" w:cs="Times New Roman"/>
-        </w:rPr>
-        <w:t>, 39–52. https://doi.org/10.1016/j.chemgeo.2012.01.028</w:t>
+        <w:t>93</w:t>
+      </w:r>
+      <w:r>
+        <w:rPr>
+          <w:rFonts w:ascii="Times New Roman" w:hAnsi="Times New Roman" w:cs="Times New Roman"/>
+        </w:rPr>
+        <w:t>, 103604. https://doi.org/10.1016/j.ecoinf.2026.103604</w:t>
       </w:r>
     </w:p>
     <w:p>
@@ -9720,21 +9864,7 @@
         <w:rPr>
           <w:rFonts w:ascii="Times New Roman" w:hAnsi="Times New Roman" w:cs="Times New Roman"/>
         </w:rPr>
-        <w:t xml:space="preserve">Beacham, T. D., Lapointe, M., Candy, J. R., Miller, K. M., &amp; </w:t>
-      </w:r>
-      <w:proofErr w:type="spellStart"/>
-      <w:r>
-        <w:rPr>
-          <w:rFonts w:ascii="Times New Roman" w:hAnsi="Times New Roman" w:cs="Times New Roman"/>
-        </w:rPr>
-        <w:t>Withler</w:t>
-      </w:r>
-      <w:proofErr w:type="spellEnd"/>
-      <w:r>
-        <w:rPr>
-          <w:rFonts w:ascii="Times New Roman" w:hAnsi="Times New Roman" w:cs="Times New Roman"/>
-        </w:rPr>
-        <w:t xml:space="preserve">, R. E. (2004). DNA in Action: Rapid Application of DNA Variation to Sockeye Salmon Fisheries Management. </w:t>
+        <w:t xml:space="preserve">Bataille, C. P., &amp; Bowen, G. J. (2012). Mapping 87Sr/86Sr variations in bedrock and water for large scale provenance studies. </w:t>
       </w:r>
       <w:r>
         <w:rPr>
@@ -9742,7 +9872,7 @@
           <w:i/>
           <w:iCs/>
         </w:rPr>
-        <w:t>Conservation Genetics</w:t>
+        <w:t>Chemical Geology</w:t>
       </w:r>
       <w:r>
         <w:rPr>
@@ -9756,13 +9886,13 @@
           <w:i/>
           <w:iCs/>
         </w:rPr>
-        <w:t>5</w:t>
-      </w:r>
-      <w:r>
-        <w:rPr>
-          <w:rFonts w:ascii="Times New Roman" w:hAnsi="Times New Roman" w:cs="Times New Roman"/>
-        </w:rPr>
-        <w:t>(3), 411–416. https://doi.org/10.1023/B:COGE.0000031140.41379.73</w:t>
+        <w:t>304–305</w:t>
+      </w:r>
+      <w:r>
+        <w:rPr>
+          <w:rFonts w:ascii="Times New Roman" w:hAnsi="Times New Roman" w:cs="Times New Roman"/>
+        </w:rPr>
+        <w:t>, 39–52. https://doi.org/10.1016/j.chemgeo.2012.01.028</w:t>
       </w:r>
     </w:p>
     <w:p>
@@ -9776,7 +9906,21 @@
         <w:rPr>
           <w:rFonts w:ascii="Times New Roman" w:hAnsi="Times New Roman" w:cs="Times New Roman"/>
         </w:rPr>
-        <w:t xml:space="preserve">Brennan, S. R., Cline, T. J., &amp; Schindler, D. E. (2019). Quantifying habitat use of migratory fish across riverscapes using space-time isotope models. </w:t>
+        <w:t xml:space="preserve">Beacham, T. D., Lapointe, M., Candy, J. R., Miller, K. M., &amp; </w:t>
+      </w:r>
+      <w:proofErr w:type="spellStart"/>
+      <w:r>
+        <w:rPr>
+          <w:rFonts w:ascii="Times New Roman" w:hAnsi="Times New Roman" w:cs="Times New Roman"/>
+        </w:rPr>
+        <w:t>Withler</w:t>
+      </w:r>
+      <w:proofErr w:type="spellEnd"/>
+      <w:r>
+        <w:rPr>
+          <w:rFonts w:ascii="Times New Roman" w:hAnsi="Times New Roman" w:cs="Times New Roman"/>
+        </w:rPr>
+        <w:t xml:space="preserve">, R. E. (2004). DNA in Action: Rapid Application of DNA Variation to Sockeye Salmon Fisheries Management. </w:t>
       </w:r>
       <w:r>
         <w:rPr>
@@ -9784,7 +9928,7 @@
           <w:i/>
           <w:iCs/>
         </w:rPr>
-        <w:t>Methods in Ecology and Evolution</w:t>
+        <w:t>Conservation Genetics</w:t>
       </w:r>
       <w:r>
         <w:rPr>
@@ -9798,13 +9942,13 @@
           <w:i/>
           <w:iCs/>
         </w:rPr>
-        <w:t>10</w:t>
-      </w:r>
-      <w:r>
-        <w:rPr>
-          <w:rFonts w:ascii="Times New Roman" w:hAnsi="Times New Roman" w:cs="Times New Roman"/>
-        </w:rPr>
-        <w:t>(7), 1036–1047. https://doi.org/10.1111/2041-210X.13191</w:t>
+        <w:t>5</w:t>
+      </w:r>
+      <w:r>
+        <w:rPr>
+          <w:rFonts w:ascii="Times New Roman" w:hAnsi="Times New Roman" w:cs="Times New Roman"/>
+        </w:rPr>
+        <w:t>(3), 411–416. https://doi.org/10.1023/B:COGE.0000031140.41379.73</w:t>
       </w:r>
     </w:p>
     <w:p>
@@ -9818,21 +9962,7 @@
         <w:rPr>
           <w:rFonts w:ascii="Times New Roman" w:hAnsi="Times New Roman" w:cs="Times New Roman"/>
         </w:rPr>
-        <w:t xml:space="preserve">Brennan, S. R., &amp; Schindler, D. E. (2017). Linking otolith microchemistry and dendritic </w:t>
-      </w:r>
-      <w:proofErr w:type="spellStart"/>
-      <w:r>
-        <w:rPr>
-          <w:rFonts w:ascii="Times New Roman" w:hAnsi="Times New Roman" w:cs="Times New Roman"/>
-        </w:rPr>
-        <w:t>isoscapes</w:t>
-      </w:r>
-      <w:proofErr w:type="spellEnd"/>
-      <w:r>
-        <w:rPr>
-          <w:rFonts w:ascii="Times New Roman" w:hAnsi="Times New Roman" w:cs="Times New Roman"/>
-        </w:rPr>
-        <w:t xml:space="preserve"> to map heterogeneous production of fish across river basins. </w:t>
+        <w:t xml:space="preserve">Brennan, S. R., Cline, T. J., &amp; Schindler, D. E. (2019). Quantifying habitat use of migratory fish across riverscapes using space-time isotope models. </w:t>
       </w:r>
       <w:r>
         <w:rPr>
@@ -9840,7 +9970,7 @@
           <w:i/>
           <w:iCs/>
         </w:rPr>
-        <w:t>Ecological Applications</w:t>
+        <w:t>Methods in Ecology and Evolution</w:t>
       </w:r>
       <w:r>
         <w:rPr>
@@ -9854,13 +9984,13 @@
           <w:i/>
           <w:iCs/>
         </w:rPr>
-        <w:t>27</w:t>
-      </w:r>
-      <w:r>
-        <w:rPr>
-          <w:rFonts w:ascii="Times New Roman" w:hAnsi="Times New Roman" w:cs="Times New Roman"/>
-        </w:rPr>
-        <w:t>(2), 363–377. https://doi.org/10.1002/eap.1474</w:t>
+        <w:t>10</w:t>
+      </w:r>
+      <w:r>
+        <w:rPr>
+          <w:rFonts w:ascii="Times New Roman" w:hAnsi="Times New Roman" w:cs="Times New Roman"/>
+        </w:rPr>
+        <w:t>(7), 1036–1047. https://doi.org/10.1111/2041-210X.13191</w:t>
       </w:r>
     </w:p>
     <w:p>
@@ -9874,21 +10004,21 @@
         <w:rPr>
           <w:rFonts w:ascii="Times New Roman" w:hAnsi="Times New Roman" w:cs="Times New Roman"/>
         </w:rPr>
-        <w:t xml:space="preserve">Brennan, S. R., Zimmerman, C. E., Fernandez, D. P., </w:t>
+        <w:t xml:space="preserve">Brennan, S. R., &amp; Schindler, D. E. (2017). Linking otolith microchemistry and dendritic </w:t>
       </w:r>
       <w:proofErr w:type="spellStart"/>
       <w:r>
         <w:rPr>
           <w:rFonts w:ascii="Times New Roman" w:hAnsi="Times New Roman" w:cs="Times New Roman"/>
         </w:rPr>
-        <w:t>Cerling</w:t>
+        <w:t>isoscapes</w:t>
       </w:r>
       <w:proofErr w:type="spellEnd"/>
       <w:r>
         <w:rPr>
           <w:rFonts w:ascii="Times New Roman" w:hAnsi="Times New Roman" w:cs="Times New Roman"/>
         </w:rPr>
-        <w:t xml:space="preserve">, T. E., McPhee, M. V., &amp; Wooller, M. J. (2015). Strontium isotopes delineate fine-scale natal origins and migration histories of Pacific salmon. </w:t>
+        <w:t xml:space="preserve"> to map heterogeneous production of fish across river basins. </w:t>
       </w:r>
       <w:r>
         <w:rPr>
@@ -9896,7 +10026,7 @@
           <w:i/>
           <w:iCs/>
         </w:rPr>
-        <w:t>Science Advances</w:t>
+        <w:t>Ecological Applications</w:t>
       </w:r>
       <w:r>
         <w:rPr>
@@ -9910,6 +10040,62 @@
           <w:i/>
           <w:iCs/>
         </w:rPr>
+        <w:t>27</w:t>
+      </w:r>
+      <w:r>
+        <w:rPr>
+          <w:rFonts w:ascii="Times New Roman" w:hAnsi="Times New Roman" w:cs="Times New Roman"/>
+        </w:rPr>
+        <w:t>(2), 363–377. https://doi.org/10.1002/eap.1474</w:t>
+      </w:r>
+    </w:p>
+    <w:p>
+      <w:pPr>
+        <w:pStyle w:val="Bibliography"/>
+        <w:rPr>
+          <w:rFonts w:ascii="Times New Roman" w:hAnsi="Times New Roman" w:cs="Times New Roman"/>
+        </w:rPr>
+      </w:pPr>
+      <w:r>
+        <w:rPr>
+          <w:rFonts w:ascii="Times New Roman" w:hAnsi="Times New Roman" w:cs="Times New Roman"/>
+        </w:rPr>
+        <w:t xml:space="preserve">Brennan, S. R., Zimmerman, C. E., Fernandez, D. P., </w:t>
+      </w:r>
+      <w:proofErr w:type="spellStart"/>
+      <w:r>
+        <w:rPr>
+          <w:rFonts w:ascii="Times New Roman" w:hAnsi="Times New Roman" w:cs="Times New Roman"/>
+        </w:rPr>
+        <w:t>Cerling</w:t>
+      </w:r>
+      <w:proofErr w:type="spellEnd"/>
+      <w:r>
+        <w:rPr>
+          <w:rFonts w:ascii="Times New Roman" w:hAnsi="Times New Roman" w:cs="Times New Roman"/>
+        </w:rPr>
+        <w:t xml:space="preserve">, T. E., McPhee, M. V., &amp; Wooller, M. J. (2015). Strontium isotopes delineate fine-scale natal origins and migration histories of Pacific salmon. </w:t>
+      </w:r>
+      <w:r>
+        <w:rPr>
+          <w:rFonts w:ascii="Times New Roman" w:hAnsi="Times New Roman" w:cs="Times New Roman"/>
+          <w:i/>
+          <w:iCs/>
+        </w:rPr>
+        <w:t>Science Advances</w:t>
+      </w:r>
+      <w:r>
+        <w:rPr>
+          <w:rFonts w:ascii="Times New Roman" w:hAnsi="Times New Roman" w:cs="Times New Roman"/>
+        </w:rPr>
+        <w:t xml:space="preserve">, </w:t>
+      </w:r>
+      <w:r>
+        <w:rPr>
+          <w:rFonts w:ascii="Times New Roman" w:hAnsi="Times New Roman" w:cs="Times New Roman"/>
+          <w:i/>
+          <w:iCs/>
+        </w:rPr>
         <w:t>1</w:t>
       </w:r>
       <w:r>
@@ -10032,7 +10218,14 @@
         <w:rPr>
           <w:rFonts w:ascii="Times New Roman" w:hAnsi="Times New Roman" w:cs="Times New Roman"/>
         </w:rPr>
-        <w:t xml:space="preserve">DeMaster, D., Alexander, E., Wiese, F. K., Baker, B., Froehlich, E., Harris, C., Schaeffer, J., Schoen, E., &amp; Shahbazi, A. H. (2025). Food security crisis in the Yukon River Basin: Where have the salmon gone and what can be done? </w:t>
+        <w:t xml:space="preserve">DeMaster, D., Alexander, E., Wiese, F. K., Baker, B., Froehlich, E., Harris, C., Schaeffer, J., Schoen, E., &amp; Shahbazi, A. H. (2025). Food security crisis in the Yukon River Basin: Where </w:t>
+      </w:r>
+      <w:r>
+        <w:rPr>
+          <w:rFonts w:ascii="Times New Roman" w:hAnsi="Times New Roman" w:cs="Times New Roman"/>
+        </w:rPr>
+        <w:lastRenderedPageBreak/>
+        <w:t xml:space="preserve">have the salmon gone and what can be done? </w:t>
       </w:r>
       <w:r>
         <w:rPr>
@@ -10116,7 +10309,6 @@
         <w:rPr>
           <w:rFonts w:ascii="Times New Roman" w:hAnsi="Times New Roman" w:cs="Times New Roman"/>
         </w:rPr>
-        <w:lastRenderedPageBreak/>
         <w:t xml:space="preserve">Dormann, C. F. (2020). Calibration of probability predictions from machine-learning and statistical models. </w:t>
       </w:r>
       <w:r>
@@ -10551,7 +10743,14 @@
         <w:rPr>
           <w:rFonts w:ascii="Times New Roman" w:hAnsi="Times New Roman" w:cs="Times New Roman"/>
         </w:rPr>
-        <w:t xml:space="preserve">Larson, W. A., Seeb, J. E., Pascal, C. E., Templin, W. D., &amp; Seeb, L. W. (2014). Single-nucleotide polymorphisms (SNPs) identified through genotyping-by-sequencing improve genetic stock identification of Chinook salmon (Oncorhynchus tshawytscha) from western Alaska. </w:t>
+        <w:t xml:space="preserve">Larson, W. A., Seeb, J. E., Pascal, C. E., Templin, W. D., &amp; Seeb, L. W. (2014). Single-nucleotide polymorphisms (SNPs) identified through genotyping-by-sequencing improve genetic </w:t>
+      </w:r>
+      <w:r>
+        <w:rPr>
+          <w:rFonts w:ascii="Times New Roman" w:hAnsi="Times New Roman" w:cs="Times New Roman"/>
+        </w:rPr>
+        <w:lastRenderedPageBreak/>
+        <w:t xml:space="preserve">stock identification of Chinook salmon (Oncorhynchus tshawytscha) from western Alaska. </w:t>
       </w:r>
       <w:r>
         <w:rPr>
@@ -10607,14 +10806,7 @@
         <w:rPr>
           <w:rFonts w:ascii="Times New Roman" w:hAnsi="Times New Roman" w:cs="Times New Roman"/>
         </w:rPr>
-        <w:t xml:space="preserve">, S., Whited, D., Zimmerman, C. E., &amp; Schindler, D. E. (2025). Combining genetic and isotope frameworks </w:t>
-      </w:r>
-      <w:r>
-        <w:rPr>
-          <w:rFonts w:ascii="Times New Roman" w:hAnsi="Times New Roman" w:cs="Times New Roman"/>
-        </w:rPr>
-        <w:lastRenderedPageBreak/>
-        <w:t xml:space="preserve">improves reconstruction of fish provenance across riverscapes. </w:t>
+        <w:t xml:space="preserve">, S., Whited, D., Zimmerman, C. E., &amp; Schindler, D. E. (2025). Combining genetic and isotope frameworks improves reconstruction of fish provenance across riverscapes. </w:t>
       </w:r>
       <w:r>
         <w:rPr>
@@ -10722,25 +10914,19 @@
           <w:rFonts w:ascii="Times New Roman" w:hAnsi="Times New Roman" w:cs="Times New Roman"/>
         </w:rPr>
       </w:pPr>
-      <w:r>
-        <w:rPr>
-          <w:rFonts w:ascii="Times New Roman" w:hAnsi="Times New Roman" w:cs="Times New Roman"/>
-        </w:rPr>
-        <w:t xml:space="preserve">Reis-Santos, P., Gillanders, B. M., Sturrock, A. M., Izzo, C., Oxman, D. S., Lueders-Dumont, J. A., </w:t>
-      </w:r>
       <w:proofErr w:type="spellStart"/>
       <w:r>
         <w:rPr>
           <w:rFonts w:ascii="Times New Roman" w:hAnsi="Times New Roman" w:cs="Times New Roman"/>
         </w:rPr>
-        <w:t>Hüssy</w:t>
+        <w:t>Ohlberger</w:t>
       </w:r>
       <w:proofErr w:type="spellEnd"/>
       <w:r>
         <w:rPr>
           <w:rFonts w:ascii="Times New Roman" w:hAnsi="Times New Roman" w:cs="Times New Roman"/>
         </w:rPr>
-        <w:t xml:space="preserve">, K., Tanner, S. E., Rogers, T., Doubleday, Z. A., Andrews, A. H., Trueman, C., Brophy, D., Thiem, J. D., Baumgartner, L. J., Willmes, M., Chung, M.-T., Charapata, P., Johnson, R. C., … Walther, B. D. (2022). Reading the biomineralized book of life: Expanding otolith biogeochemical research and applications for fisheries and ecosystem-based management. </w:t>
+        <w:t xml:space="preserve">, J., Ward, E. J., Schindler, D. E., &amp; Lewis, B. (2018). Demographic changes in Chinook salmon across the Northeast Pacific Ocean. </w:t>
       </w:r>
       <w:r>
         <w:rPr>
@@ -10748,27 +10934,13 @@
           <w:i/>
           <w:iCs/>
         </w:rPr>
-        <w:t>Reviews in Fish Biology and Fisheries</w:t>
-      </w:r>
-      <w:r>
-        <w:rPr>
-          <w:rFonts w:ascii="Times New Roman" w:hAnsi="Times New Roman" w:cs="Times New Roman"/>
-        </w:rPr>
-        <w:t>. https://doi.org/10.1007/s11160-022-09720-z</w:t>
-      </w:r>
-    </w:p>
-    <w:p>
-      <w:pPr>
-        <w:pStyle w:val="Bibliography"/>
-        <w:rPr>
-          <w:rFonts w:ascii="Times New Roman" w:hAnsi="Times New Roman" w:cs="Times New Roman"/>
-        </w:rPr>
-      </w:pPr>
-      <w:r>
-        <w:rPr>
-          <w:rFonts w:ascii="Times New Roman" w:hAnsi="Times New Roman" w:cs="Times New Roman"/>
-        </w:rPr>
-        <w:t xml:space="preserve">Silva Filho, T., Song, H., Perello-Nieto, M., Santos-Rodriguez, R., Kull, M., &amp; Flach, P. (2023). Classifier calibration: A survey on how to assess and improve predicted class probabilities. </w:t>
+        <w:t>Fish and Fisheries</w:t>
+      </w:r>
+      <w:r>
+        <w:rPr>
+          <w:rFonts w:ascii="Times New Roman" w:hAnsi="Times New Roman" w:cs="Times New Roman"/>
+        </w:rPr>
+        <w:t xml:space="preserve">, </w:t>
       </w:r>
       <w:r>
         <w:rPr>
@@ -10776,13 +10948,41 @@
           <w:i/>
           <w:iCs/>
         </w:rPr>
-        <w:t>Machine Learning</w:t>
-      </w:r>
-      <w:r>
-        <w:rPr>
-          <w:rFonts w:ascii="Times New Roman" w:hAnsi="Times New Roman" w:cs="Times New Roman"/>
-        </w:rPr>
-        <w:t xml:space="preserve">, </w:t>
+        <w:t>19</w:t>
+      </w:r>
+      <w:r>
+        <w:rPr>
+          <w:rFonts w:ascii="Times New Roman" w:hAnsi="Times New Roman" w:cs="Times New Roman"/>
+        </w:rPr>
+        <w:t>(3), 533–546. https://doi.org/10.1111/faf.12272</w:t>
+      </w:r>
+    </w:p>
+    <w:p>
+      <w:pPr>
+        <w:pStyle w:val="Bibliography"/>
+        <w:rPr>
+          <w:rFonts w:ascii="Times New Roman" w:hAnsi="Times New Roman" w:cs="Times New Roman"/>
+        </w:rPr>
+      </w:pPr>
+      <w:r>
+        <w:rPr>
+          <w:rFonts w:ascii="Times New Roman" w:hAnsi="Times New Roman" w:cs="Times New Roman"/>
+        </w:rPr>
+        <w:t xml:space="preserve">Reis-Santos, P., Gillanders, B. M., Sturrock, A. M., Izzo, C., Oxman, D. S., Lueders-Dumont, J. A., </w:t>
+      </w:r>
+      <w:proofErr w:type="spellStart"/>
+      <w:r>
+        <w:rPr>
+          <w:rFonts w:ascii="Times New Roman" w:hAnsi="Times New Roman" w:cs="Times New Roman"/>
+        </w:rPr>
+        <w:t>Hüssy</w:t>
+      </w:r>
+      <w:proofErr w:type="spellEnd"/>
+      <w:r>
+        <w:rPr>
+          <w:rFonts w:ascii="Times New Roman" w:hAnsi="Times New Roman" w:cs="Times New Roman"/>
+        </w:rPr>
+        <w:t xml:space="preserve">, K., Tanner, S. E., Rogers, T., Doubleday, Z. A., Andrews, A. H., Trueman, C., Brophy, D., Thiem, J. D., Baumgartner, L. J., Willmes, M., Chung, M.-T., Charapata, P., Johnson, R. C., … Walther, B. D. (2022). Reading the biomineralized book of life: Expanding otolith biogeochemical research and applications for fisheries and ecosystem-based management. </w:t>
       </w:r>
       <w:r>
         <w:rPr>
@@ -10790,13 +10990,13 @@
           <w:i/>
           <w:iCs/>
         </w:rPr>
-        <w:t>112</w:t>
-      </w:r>
-      <w:r>
-        <w:rPr>
-          <w:rFonts w:ascii="Times New Roman" w:hAnsi="Times New Roman" w:cs="Times New Roman"/>
-        </w:rPr>
-        <w:t>(9), 3211–3260. https://doi.org/10.1007/s10994-023-06336-7</w:t>
+        <w:t>Reviews in Fish Biology and Fisheries</w:t>
+      </w:r>
+      <w:r>
+        <w:rPr>
+          <w:rFonts w:ascii="Times New Roman" w:hAnsi="Times New Roman" w:cs="Times New Roman"/>
+        </w:rPr>
+        <w:t>. https://doi.org/10.1007/s11160-022-09720-z</w:t>
       </w:r>
     </w:p>
     <w:p>
@@ -10810,7 +11010,21 @@
         <w:rPr>
           <w:rFonts w:ascii="Times New Roman" w:hAnsi="Times New Roman" w:cs="Times New Roman"/>
         </w:rPr>
-        <w:t xml:space="preserve">Templin, W. D., Seeb, J. E., Jasper, J. R., Barclay, A. W., &amp; Seeb, L. W. (2011). Genetic differentiation of Alaska Chinook salmon: The missing link for migratory studies. </w:t>
+        <w:t xml:space="preserve">Schindler, D. E., Krueger, C., Bisson, P., Bradford, M. J., Clark, B., </w:t>
+      </w:r>
+      <w:proofErr w:type="spellStart"/>
+      <w:r>
+        <w:rPr>
+          <w:rFonts w:ascii="Times New Roman" w:hAnsi="Times New Roman" w:cs="Times New Roman"/>
+        </w:rPr>
+        <w:t>Conitz</w:t>
+      </w:r>
+      <w:proofErr w:type="spellEnd"/>
+      <w:r>
+        <w:rPr>
+          <w:rFonts w:ascii="Times New Roman" w:hAnsi="Times New Roman" w:cs="Times New Roman"/>
+        </w:rPr>
+        <w:t xml:space="preserve">, J., Howard, K., Jones, M., Murphy, J., Myers, K. W., Scheuerell, M., Volk, E. C., &amp; Winton, J. (2013). </w:t>
       </w:r>
       <w:r>
         <w:rPr>
@@ -10818,13 +11032,27 @@
           <w:i/>
           <w:iCs/>
         </w:rPr>
-        <w:t>Molecular Ecology Resources</w:t>
-      </w:r>
-      <w:r>
-        <w:rPr>
-          <w:rFonts w:ascii="Times New Roman" w:hAnsi="Times New Roman" w:cs="Times New Roman"/>
-        </w:rPr>
-        <w:t xml:space="preserve">, </w:t>
+        <w:t>Arctic-Yukon-Kuskokwim Chinook Salmon Research Action Plan: Evidence of Decline of Chinook Salmon Populations and Recommendations for Future Research. Prepared for the AYK Sustainable Salmon Initiative</w:t>
+      </w:r>
+      <w:r>
+        <w:rPr>
+          <w:rFonts w:ascii="Times New Roman" w:hAnsi="Times New Roman" w:cs="Times New Roman"/>
+        </w:rPr>
+        <w:t>.</w:t>
+      </w:r>
+    </w:p>
+    <w:p>
+      <w:pPr>
+        <w:pStyle w:val="Bibliography"/>
+        <w:rPr>
+          <w:rFonts w:ascii="Times New Roman" w:hAnsi="Times New Roman" w:cs="Times New Roman"/>
+        </w:rPr>
+      </w:pPr>
+      <w:r>
+        <w:rPr>
+          <w:rFonts w:ascii="Times New Roman" w:hAnsi="Times New Roman" w:cs="Times New Roman"/>
+        </w:rPr>
+        <w:t xml:space="preserve">Silva Filho, T., Song, H., Perello-Nieto, M., Santos-Rodriguez, R., Kull, M., &amp; Flach, P. (2023). Classifier calibration: A survey on how to assess and improve predicted class probabilities. </w:t>
       </w:r>
       <w:r>
         <w:rPr>
@@ -10832,27 +11060,13 @@
           <w:i/>
           <w:iCs/>
         </w:rPr>
-        <w:t>11</w:t>
-      </w:r>
-      <w:r>
-        <w:rPr>
-          <w:rFonts w:ascii="Times New Roman" w:hAnsi="Times New Roman" w:cs="Times New Roman"/>
-        </w:rPr>
-        <w:t>(s1), 226–246. https://doi.org/10.1111/j.1755-0998.2010.02968.x</w:t>
-      </w:r>
-    </w:p>
-    <w:p>
-      <w:pPr>
-        <w:pStyle w:val="Bibliography"/>
-        <w:rPr>
-          <w:rFonts w:ascii="Times New Roman" w:hAnsi="Times New Roman" w:cs="Times New Roman"/>
-        </w:rPr>
-      </w:pPr>
-      <w:r>
-        <w:rPr>
-          <w:rFonts w:ascii="Times New Roman" w:hAnsi="Times New Roman" w:cs="Times New Roman"/>
-        </w:rPr>
-        <w:t xml:space="preserve">Van Doornik, D. M., Moran, P., Rondeau, E. B., Nichols, K. M., Narum, S. R., Campbell, M. R., Clemento, A. J., Hargrove, J. S., Hess, J. E., Horn, R. L., Seeb, L. W., Stephenson, J. J., &amp; McKinney, G. J. (2024). A new, standardized international Pacific Rim baseline for genetic stock identification (GSI) of Chinook Salmon. </w:t>
+        <w:t>Machine Learning</w:t>
+      </w:r>
+      <w:r>
+        <w:rPr>
+          <w:rFonts w:ascii="Times New Roman" w:hAnsi="Times New Roman" w:cs="Times New Roman"/>
+        </w:rPr>
+        <w:t xml:space="preserve">, </w:t>
       </w:r>
       <w:r>
         <w:rPr>
@@ -10860,13 +11074,27 @@
           <w:i/>
           <w:iCs/>
         </w:rPr>
-        <w:t>North American Journal of Fisheries Management</w:t>
-      </w:r>
-      <w:r>
-        <w:rPr>
-          <w:rFonts w:ascii="Times New Roman" w:hAnsi="Times New Roman" w:cs="Times New Roman"/>
-        </w:rPr>
-        <w:t xml:space="preserve">, </w:t>
+        <w:t>112</w:t>
+      </w:r>
+      <w:r>
+        <w:rPr>
+          <w:rFonts w:ascii="Times New Roman" w:hAnsi="Times New Roman" w:cs="Times New Roman"/>
+        </w:rPr>
+        <w:t>(9), 3211–3260. https://doi.org/10.1007/s10994-023-06336-7</w:t>
+      </w:r>
+    </w:p>
+    <w:p>
+      <w:pPr>
+        <w:pStyle w:val="Bibliography"/>
+        <w:rPr>
+          <w:rFonts w:ascii="Times New Roman" w:hAnsi="Times New Roman" w:cs="Times New Roman"/>
+        </w:rPr>
+      </w:pPr>
+      <w:r>
+        <w:rPr>
+          <w:rFonts w:ascii="Times New Roman" w:hAnsi="Times New Roman" w:cs="Times New Roman"/>
+        </w:rPr>
+        <w:t xml:space="preserve">Templin, W. D., Seeb, J. E., Jasper, J. R., Barclay, A. W., &amp; Seeb, L. W. (2011). Genetic differentiation of Alaska Chinook salmon: The missing link for migratory studies. </w:t>
       </w:r>
       <w:r>
         <w:rPr>
@@ -10874,41 +11102,13 @@
           <w:i/>
           <w:iCs/>
         </w:rPr>
-        <w:t>44</w:t>
-      </w:r>
-      <w:r>
-        <w:rPr>
-          <w:rFonts w:ascii="Times New Roman" w:hAnsi="Times New Roman" w:cs="Times New Roman"/>
-        </w:rPr>
-        <w:t>(4), 857–869. https://doi.org/10.1002/nafm.11019</w:t>
-      </w:r>
-    </w:p>
-    <w:p>
-      <w:pPr>
-        <w:pStyle w:val="Bibliography"/>
-        <w:rPr>
-          <w:rFonts w:ascii="Times New Roman" w:hAnsi="Times New Roman" w:cs="Times New Roman"/>
-        </w:rPr>
-      </w:pPr>
-      <w:r>
-        <w:rPr>
-          <w:rFonts w:ascii="Times New Roman" w:hAnsi="Times New Roman" w:cs="Times New Roman"/>
-        </w:rPr>
-        <w:t xml:space="preserve">Van </w:t>
-      </w:r>
-      <w:proofErr w:type="spellStart"/>
-      <w:r>
-        <w:rPr>
-          <w:rFonts w:ascii="Times New Roman" w:hAnsi="Times New Roman" w:cs="Times New Roman"/>
-        </w:rPr>
-        <w:t>Rijsbergen</w:t>
-      </w:r>
-      <w:proofErr w:type="spellEnd"/>
-      <w:r>
-        <w:rPr>
-          <w:rFonts w:ascii="Times New Roman" w:hAnsi="Times New Roman" w:cs="Times New Roman"/>
-        </w:rPr>
-        <w:t xml:space="preserve">, C. J. (1975). </w:t>
+        <w:t>Molecular Ecology Resources</w:t>
+      </w:r>
+      <w:r>
+        <w:rPr>
+          <w:rFonts w:ascii="Times New Roman" w:hAnsi="Times New Roman" w:cs="Times New Roman"/>
+        </w:rPr>
+        <w:t xml:space="preserve">, </w:t>
       </w:r>
       <w:r>
         <w:rPr>
@@ -10916,13 +11116,13 @@
           <w:i/>
           <w:iCs/>
         </w:rPr>
-        <w:t>Information retrieval</w:t>
-      </w:r>
-      <w:r>
-        <w:rPr>
-          <w:rFonts w:ascii="Times New Roman" w:hAnsi="Times New Roman" w:cs="Times New Roman"/>
-        </w:rPr>
-        <w:t>. Butterworths. https://cir.nii.ac.jp/crid/1970023484860037059</w:t>
+        <w:t>11</w:t>
+      </w:r>
+      <w:r>
+        <w:rPr>
+          <w:rFonts w:ascii="Times New Roman" w:hAnsi="Times New Roman" w:cs="Times New Roman"/>
+        </w:rPr>
+        <w:t>(s1), 226–246. https://doi.org/10.1111/j.1755-0998.2010.02968.x</w:t>
       </w:r>
     </w:p>
     <w:p>
@@ -10936,7 +11136,7 @@
         <w:rPr>
           <w:rFonts w:ascii="Times New Roman" w:hAnsi="Times New Roman" w:cs="Times New Roman"/>
         </w:rPr>
-        <w:t xml:space="preserve">West, F., &amp; Dann, T. (2019). </w:t>
+        <w:t xml:space="preserve">Van Doornik, D. M., Moran, P., Rondeau, E. B., Nichols, K. M., Narum, S. R., Campbell, M. R., Clemento, A. J., Hargrove, J. S., Hess, J. E., Horn, R. L., Seeb, L. W., Stephenson, J. J., &amp; McKinney, G. J. (2024). A new, standardized international Pacific Rim baseline for genetic stock identification (GSI) of Chinook Salmon. </w:t>
       </w:r>
       <w:r>
         <w:rPr>
@@ -10944,13 +11144,70 @@
           <w:i/>
           <w:iCs/>
         </w:rPr>
-        <w:t>Genetic stock identification of Pilot Station Chinook salmon, 2017.</w:t>
-      </w:r>
-      <w:r>
-        <w:rPr>
-          <w:rFonts w:ascii="Times New Roman" w:hAnsi="Times New Roman" w:cs="Times New Roman"/>
-        </w:rPr>
-        <w:t xml:space="preserve"> (Alaska Department of Fish and Game, Division of Commercial Fisheries, Regional Information Report 3A19-08, Anchorage.). https://www.adfg.alaska.gov/FedAidPDFs/RIR.3A.2019.08.pdf.</w:t>
+        <w:t>North American Journal of Fisheries Management</w:t>
+      </w:r>
+      <w:r>
+        <w:rPr>
+          <w:rFonts w:ascii="Times New Roman" w:hAnsi="Times New Roman" w:cs="Times New Roman"/>
+        </w:rPr>
+        <w:t xml:space="preserve">, </w:t>
+      </w:r>
+      <w:r>
+        <w:rPr>
+          <w:rFonts w:ascii="Times New Roman" w:hAnsi="Times New Roman" w:cs="Times New Roman"/>
+          <w:i/>
+          <w:iCs/>
+        </w:rPr>
+        <w:t>44</w:t>
+      </w:r>
+      <w:r>
+        <w:rPr>
+          <w:rFonts w:ascii="Times New Roman" w:hAnsi="Times New Roman" w:cs="Times New Roman"/>
+        </w:rPr>
+        <w:t>(4), 857–869. https://doi.org/10.1002/nafm.11019</w:t>
+      </w:r>
+    </w:p>
+    <w:p>
+      <w:pPr>
+        <w:pStyle w:val="Bibliography"/>
+        <w:rPr>
+          <w:rFonts w:ascii="Times New Roman" w:hAnsi="Times New Roman" w:cs="Times New Roman"/>
+        </w:rPr>
+      </w:pPr>
+      <w:r>
+        <w:rPr>
+          <w:rFonts w:ascii="Times New Roman" w:hAnsi="Times New Roman" w:cs="Times New Roman"/>
+        </w:rPr>
+        <w:lastRenderedPageBreak/>
+        <w:t xml:space="preserve">Van </w:t>
+      </w:r>
+      <w:proofErr w:type="spellStart"/>
+      <w:r>
+        <w:rPr>
+          <w:rFonts w:ascii="Times New Roman" w:hAnsi="Times New Roman" w:cs="Times New Roman"/>
+        </w:rPr>
+        <w:t>Rijsbergen</w:t>
+      </w:r>
+      <w:proofErr w:type="spellEnd"/>
+      <w:r>
+        <w:rPr>
+          <w:rFonts w:ascii="Times New Roman" w:hAnsi="Times New Roman" w:cs="Times New Roman"/>
+        </w:rPr>
+        <w:t xml:space="preserve">, C. J. (1975). </w:t>
+      </w:r>
+      <w:r>
+        <w:rPr>
+          <w:rFonts w:ascii="Times New Roman" w:hAnsi="Times New Roman" w:cs="Times New Roman"/>
+          <w:i/>
+          <w:iCs/>
+        </w:rPr>
+        <w:t>Information retrieval</w:t>
+      </w:r>
+      <w:r>
+        <w:rPr>
+          <w:rFonts w:ascii="Times New Roman" w:hAnsi="Times New Roman" w:cs="Times New Roman"/>
+        </w:rPr>
+        <w:t>. Butterworths. https://cir.nii.ac.jp/crid/1970023484860037059</w:t>
       </w:r>
     </w:p>
     <w:p>
@@ -11473,7 +11730,7 @@
         </w:rPr>
         <w:t xml:space="preserve"> Principal Component analysis of GAM smoothed timeseries data (n = 2,531 otoliths). S</w:t>
       </w:r>
-      <w:ins w:id="57" w:author="Benjamin J. Makhlouf" w:date="2026-03-01T20:18:00Z" w16du:dateUtc="2026-03-02T04:18:00Z">
+      <w:ins w:id="75" w:author="Benjamin J. Makhlouf" w:date="2026-03-01T20:18:00Z" w16du:dateUtc="2026-03-02T04:18:00Z">
         <w:r>
           <w:rPr>
             <w:rFonts w:ascii="Times New Roman" w:hAnsi="Times New Roman" w:cs="Times New Roman"/>
@@ -11481,7 +11738,7 @@
           <w:t>ubstantial</w:t>
         </w:r>
       </w:ins>
-      <w:del w:id="58" w:author="Benjamin J. Makhlouf" w:date="2026-03-01T20:18:00Z" w16du:dateUtc="2026-03-02T04:18:00Z">
+      <w:del w:id="76" w:author="Benjamin J. Makhlouf" w:date="2026-03-01T20:18:00Z" w16du:dateUtc="2026-03-02T04:18:00Z">
         <w:r>
           <w:rPr>
             <w:rFonts w:ascii="Times New Roman" w:hAnsi="Times New Roman" w:cs="Times New Roman"/>
@@ -13143,7 +13400,7 @@
   <w:style w:type="paragraph" w:default="1" w:styleId="Normal">
     <w:name w:val="Normal"/>
     <w:qFormat/>
-    <w:rsid w:val="00F22BAA"/>
+    <w:rsid w:val="00B073DE"/>
   </w:style>
   <w:style w:type="paragraph" w:styleId="Heading1">
     <w:name w:val="heading 1"/>

</xml_diff>

<commit_message>
continued working on reviews, about half way
</commit_message>
<xml_diff>
--- a/Docs/ICES_JMS/R1/R1_MainDocument.docx
+++ b/Docs/ICES_JMS/R1/R1_MainDocument.docx
@@ -3781,7 +3781,21 @@
         <w:rPr>
           <w:rFonts w:ascii="Times New Roman" w:hAnsi="Times New Roman" w:cs="Times New Roman"/>
         </w:rPr>
-        <w:t xml:space="preserve"> analyzed using Laser Ablation Inductively Coupled Plasma Mass Spectrometry (LA-ICP-MS) at the University of Utah Strontium Metals Lab, </w:t>
+        <w:t xml:space="preserve"> analyzed using Laser Ablation Inductively Coupled Plasma Mass Spectrometry (LA-</w:t>
+      </w:r>
+      <w:ins w:id="49" w:author="Benjamin J. Makhlouf" w:date="2026-03-02T16:12:00Z" w16du:dateUtc="2026-03-03T00:12:00Z">
+        <w:r>
+          <w:rPr>
+            <w:rFonts w:ascii="Times New Roman" w:hAnsi="Times New Roman" w:cs="Times New Roman"/>
+          </w:rPr>
+          <w:t>MC-</w:t>
+        </w:r>
+      </w:ins>
+      <w:r>
+        <w:rPr>
+          <w:rFonts w:ascii="Times New Roman" w:hAnsi="Times New Roman" w:cs="Times New Roman"/>
+        </w:rPr>
+        <w:t xml:space="preserve">ICP-MS) at the University of Utah Strontium Metals Lab, </w:t>
       </w:r>
       <w:proofErr w:type="gramStart"/>
       <w:r>
@@ -3997,7 +4011,7 @@
         </w:rPr>
         <w:t xml:space="preserve"> assigned following methods outlined in Makhlouf et al., 2025</w:t>
       </w:r>
-      <w:del w:id="49" w:author="Benjamin J. Makhlouf" w:date="2026-03-01T20:03:00Z" w16du:dateUtc="2026-03-02T04:03:00Z">
+      <w:del w:id="50" w:author="Benjamin J. Makhlouf" w:date="2026-03-01T20:03:00Z" w16du:dateUtc="2026-03-02T04:03:00Z">
         <w:r>
           <w:rPr>
             <w:rFonts w:ascii="Times New Roman" w:hAnsi="Times New Roman" w:cs="Times New Roman"/>
@@ -4131,56 +4145,130 @@
         <w:spacing w:line="480" w:lineRule="auto"/>
         <w:ind w:firstLine="720"/>
         <w:rPr>
-          <w:rFonts w:ascii="Times New Roman" w:hAnsi="Times New Roman" w:cs="Times New Roman"/>
-        </w:rPr>
-      </w:pPr>
-      <w:r>
-        <w:rPr>
-          <w:rFonts w:ascii="Times New Roman" w:hAnsi="Times New Roman" w:cs="Times New Roman"/>
-        </w:rPr>
-        <w:t xml:space="preserve">To standardize all data to the same life history period </w:t>
-      </w:r>
-      <w:r>
-        <w:rPr>
-          <w:rFonts w:ascii="Times New Roman" w:hAnsi="Times New Roman" w:cs="Times New Roman"/>
-        </w:rPr>
-        <w:t xml:space="preserve">full </w:t>
-      </w:r>
-      <w:r>
-        <w:rPr>
-          <w:rFonts w:ascii="Times New Roman" w:hAnsi="Times New Roman" w:cs="Times New Roman"/>
-        </w:rPr>
-        <w:t>laser ablation datasets</w:t>
-      </w:r>
-      <w:r>
-        <w:rPr>
-          <w:rFonts w:ascii="Times New Roman" w:hAnsi="Times New Roman" w:cs="Times New Roman"/>
-        </w:rPr>
-        <w:t xml:space="preserve"> were trimmed to include only data between the </w:t>
-      </w:r>
-      <w:r>
-        <w:rPr>
-          <w:rFonts w:ascii="Times New Roman" w:hAnsi="Times New Roman" w:cs="Times New Roman"/>
-        </w:rPr>
-        <w:t>onset of the natal origin region</w:t>
-      </w:r>
-      <w:r>
-        <w:rPr>
-          <w:rFonts w:ascii="Times New Roman" w:hAnsi="Times New Roman" w:cs="Times New Roman"/>
-        </w:rPr>
-        <w:t xml:space="preserve"> and the </w:t>
-      </w:r>
-      <w:r>
-        <w:rPr>
-          <w:rFonts w:ascii="Times New Roman" w:hAnsi="Times New Roman" w:cs="Times New Roman"/>
-        </w:rPr>
-        <w:t xml:space="preserve">beginning of </w:t>
-      </w:r>
-      <w:r>
-        <w:rPr>
-          <w:rFonts w:ascii="Times New Roman" w:hAnsi="Times New Roman" w:cs="Times New Roman"/>
-        </w:rPr>
-        <w:t>marine residence. These cutoff points were identified by</w:t>
+          <w:ins w:id="51" w:author="Benjamin J. Makhlouf" w:date="2026-03-02T16:15:00Z" w16du:dateUtc="2026-03-03T00:15:00Z"/>
+          <w:rFonts w:ascii="Times New Roman" w:hAnsi="Times New Roman" w:cs="Times New Roman"/>
+        </w:rPr>
+      </w:pPr>
+      <w:ins w:id="52" w:author="Benjamin J. Makhlouf" w:date="2026-03-02T16:14:00Z" w16du:dateUtc="2026-03-03T00:14:00Z">
+        <w:r>
+          <w:rPr>
+            <w:rFonts w:ascii="Times New Roman" w:hAnsi="Times New Roman" w:cs="Times New Roman"/>
+          </w:rPr>
+          <w:t xml:space="preserve">Otolith timeseries data were collected on a transect from otolith core to the edge in many cases. </w:t>
+        </w:r>
+      </w:ins>
+      <w:moveFromRangeStart w:id="53" w:author="Benjamin J. Makhlouf" w:date="2026-03-02T16:17:00Z" w:name="move223360656"/>
+      <w:moveFrom w:id="54" w:author="Benjamin J. Makhlouf" w:date="2026-03-02T16:17:00Z" w16du:dateUtc="2026-03-03T00:17:00Z">
+        <w:r>
+          <w:rPr>
+            <w:rFonts w:ascii="Times New Roman" w:hAnsi="Times New Roman" w:cs="Times New Roman"/>
+          </w:rPr>
+          <w:t xml:space="preserve">To standardize all data to the same life history period </w:t>
+        </w:r>
+        <w:r>
+          <w:rPr>
+            <w:rFonts w:ascii="Times New Roman" w:hAnsi="Times New Roman" w:cs="Times New Roman"/>
+          </w:rPr>
+          <w:t xml:space="preserve">full </w:t>
+        </w:r>
+        <w:r>
+          <w:rPr>
+            <w:rFonts w:ascii="Times New Roman" w:hAnsi="Times New Roman" w:cs="Times New Roman"/>
+          </w:rPr>
+          <w:t>laser ablation datasets</w:t>
+        </w:r>
+        <w:r>
+          <w:rPr>
+            <w:rFonts w:ascii="Times New Roman" w:hAnsi="Times New Roman" w:cs="Times New Roman"/>
+          </w:rPr>
+          <w:t xml:space="preserve"> were trimmed to include only data between the </w:t>
+        </w:r>
+        <w:r>
+          <w:rPr>
+            <w:rFonts w:ascii="Times New Roman" w:hAnsi="Times New Roman" w:cs="Times New Roman"/>
+          </w:rPr>
+          <w:t>onset of the natal origin region</w:t>
+        </w:r>
+        <w:r>
+          <w:rPr>
+            <w:rFonts w:ascii="Times New Roman" w:hAnsi="Times New Roman" w:cs="Times New Roman"/>
+          </w:rPr>
+          <w:t xml:space="preserve"> and the </w:t>
+        </w:r>
+        <w:r>
+          <w:rPr>
+            <w:rFonts w:ascii="Times New Roman" w:hAnsi="Times New Roman" w:cs="Times New Roman"/>
+          </w:rPr>
+          <w:t xml:space="preserve">beginning of </w:t>
+        </w:r>
+        <w:r>
+          <w:rPr>
+            <w:rFonts w:ascii="Times New Roman" w:hAnsi="Times New Roman" w:cs="Times New Roman"/>
+          </w:rPr>
+          <w:t xml:space="preserve">marine residence. </w:t>
+        </w:r>
+      </w:moveFrom>
+      <w:moveFromRangeEnd w:id="53"/>
+      <w:ins w:id="55" w:author="Benjamin J. Makhlouf" w:date="2026-03-02T16:15:00Z" w16du:dateUtc="2026-03-03T00:15:00Z">
+        <w:r>
+          <w:rPr>
+            <w:rFonts w:ascii="Times New Roman" w:hAnsi="Times New Roman" w:cs="Times New Roman"/>
+          </w:rPr>
+          <w:t xml:space="preserve">The region closest to the core reflects a “maternal” signal that reflects both the isotopic environment of rearing and contribution from the mother. Because Pacific Salmon begin maturity in the </w:t>
+        </w:r>
+      </w:ins>
+      <w:ins w:id="56" w:author="Benjamin J. Makhlouf" w:date="2026-03-02T16:16:00Z" w16du:dateUtc="2026-03-03T00:16:00Z">
+        <w:r>
+          <w:rPr>
+            <w:rFonts w:ascii="Times New Roman" w:hAnsi="Times New Roman" w:cs="Times New Roman"/>
+          </w:rPr>
+          <w:t xml:space="preserve">marine environment, the maternal signature resembles a </w:t>
+        </w:r>
+        <w:r>
+          <w:rPr>
+            <w:rFonts w:ascii="Times New Roman" w:hAnsi="Times New Roman" w:cs="Times New Roman"/>
+          </w:rPr>
+          <w:t>⁸⁷Sr/⁸⁶Sr</w:t>
+        </w:r>
+        <w:r>
+          <w:rPr>
+            <w:rFonts w:ascii="Times New Roman" w:hAnsi="Times New Roman" w:cs="Times New Roman"/>
+          </w:rPr>
+          <w:t xml:space="preserve"> close to that of the global marine value (~ 0.7091). As the juvenile develops, this signal transitions to reflect that</w:t>
+        </w:r>
+      </w:ins>
+      <w:ins w:id="57" w:author="Benjamin J. Makhlouf" w:date="2026-03-02T16:17:00Z" w16du:dateUtc="2026-03-03T00:17:00Z">
+        <w:r>
+          <w:rPr>
+            <w:rFonts w:ascii="Times New Roman" w:hAnsi="Times New Roman" w:cs="Times New Roman"/>
+          </w:rPr>
+          <w:t xml:space="preserve"> of the natal freshwater rearing environment. </w:t>
+        </w:r>
+      </w:ins>
+      <w:moveToRangeStart w:id="58" w:author="Benjamin J. Makhlouf" w:date="2026-03-02T16:17:00Z" w:name="move223360656"/>
+      <w:moveTo w:id="59" w:author="Benjamin J. Makhlouf" w:date="2026-03-02T16:17:00Z" w16du:dateUtc="2026-03-03T00:17:00Z">
+        <w:r>
+          <w:rPr>
+            <w:rFonts w:ascii="Times New Roman" w:hAnsi="Times New Roman" w:cs="Times New Roman"/>
+          </w:rPr>
+          <w:t>To standardize all data to the same life history period full laser ablation datasets were trimmed to include only data between the onset of the natal origin region and the beginning of marine residence.</w:t>
+        </w:r>
+      </w:moveTo>
+      <w:moveToRangeEnd w:id="58"/>
+    </w:p>
+    <w:p>
+      <w:pPr>
+        <w:spacing w:line="480" w:lineRule="auto"/>
+        <w:ind w:firstLine="720"/>
+        <w:rPr>
+          <w:rFonts w:ascii="Times New Roman" w:hAnsi="Times New Roman" w:cs="Times New Roman"/>
+        </w:rPr>
+      </w:pPr>
+      <w:r>
+        <w:rPr>
+          <w:rFonts w:ascii="Times New Roman" w:hAnsi="Times New Roman" w:cs="Times New Roman"/>
+        </w:rPr>
+        <w:t>These cutoff points were identified by</w:t>
       </w:r>
       <w:r>
         <w:rPr>
@@ -4266,19 +4354,218 @@
         <w:rPr>
           <w:rFonts w:ascii="Times New Roman" w:hAnsi="Times New Roman" w:cs="Times New Roman"/>
         </w:rPr>
-        <w:t>Sr and movement of ⁸⁷Sr/⁸⁶Sr away from the global marine value (0.7092)</w:t>
-      </w:r>
-      <w:r>
-        <w:rPr>
-          <w:rFonts w:ascii="Times New Roman" w:hAnsi="Times New Roman" w:cs="Times New Roman"/>
-        </w:rPr>
-        <w:t>, which</w:t>
-      </w:r>
-      <w:r>
-        <w:rPr>
-          <w:rFonts w:ascii="Times New Roman" w:hAnsi="Times New Roman" w:cs="Times New Roman"/>
-        </w:rPr>
-        <w:t xml:space="preserve"> represent</w:t>
+        <w:t xml:space="preserve">Sr and movement of ⁸⁷Sr/⁸⁶Sr away from </w:t>
+      </w:r>
+      <w:ins w:id="60" w:author="Benjamin J. Makhlouf" w:date="2026-03-02T16:17:00Z" w16du:dateUtc="2026-03-03T00:17:00Z">
+        <w:r>
+          <w:rPr>
+            <w:rFonts w:ascii="Times New Roman" w:hAnsi="Times New Roman" w:cs="Times New Roman"/>
+          </w:rPr>
+          <w:t>maternal signature</w:t>
+        </w:r>
+      </w:ins>
+      <w:ins w:id="61" w:author="Benjamin J. Makhlouf" w:date="2026-03-02T16:18:00Z" w16du:dateUtc="2026-03-03T00:18:00Z">
+        <w:r>
+          <w:rPr>
+            <w:rFonts w:ascii="Times New Roman" w:hAnsi="Times New Roman" w:cs="Times New Roman"/>
+          </w:rPr>
+          <w:t xml:space="preserve"> (closest to the global marine value)</w:t>
+        </w:r>
+      </w:ins>
+      <w:del w:id="62" w:author="Benjamin J. Makhlouf" w:date="2026-03-02T16:18:00Z" w16du:dateUtc="2026-03-03T00:18:00Z">
+        <w:r>
+          <w:rPr>
+            <w:rFonts w:ascii="Times New Roman" w:hAnsi="Times New Roman" w:cs="Times New Roman"/>
+          </w:rPr>
+          <w:delText>the global marine value (0.7092</w:delText>
+        </w:r>
+      </w:del>
+      <w:del w:id="63" w:author="Benjamin J. Makhlouf" w:date="2026-03-02T16:17:00Z" w16du:dateUtc="2026-03-03T00:17:00Z">
+        <w:r>
+          <w:rPr>
+            <w:rFonts w:ascii="Times New Roman" w:hAnsi="Times New Roman" w:cs="Times New Roman"/>
+          </w:rPr>
+          <w:delText>)</w:delText>
+        </w:r>
+        <w:r>
+          <w:rPr>
+            <w:rFonts w:ascii="Times New Roman" w:hAnsi="Times New Roman" w:cs="Times New Roman"/>
+          </w:rPr>
+          <w:delText>, which</w:delText>
+        </w:r>
+        <w:r>
+          <w:rPr>
+            <w:rFonts w:ascii="Times New Roman" w:hAnsi="Times New Roman" w:cs="Times New Roman"/>
+          </w:rPr>
+          <w:delText xml:space="preserve"> represent</w:delText>
+        </w:r>
+        <w:r>
+          <w:rPr>
+            <w:rFonts w:ascii="Times New Roman" w:hAnsi="Times New Roman" w:cs="Times New Roman"/>
+          </w:rPr>
+          <w:delText>s</w:delText>
+        </w:r>
+        <w:r>
+          <w:rPr>
+            <w:rFonts w:ascii="Times New Roman" w:hAnsi="Times New Roman" w:cs="Times New Roman"/>
+          </w:rPr>
+          <w:delText xml:space="preserve"> the maternal signal in the otolith</w:delText>
+        </w:r>
+      </w:del>
+      <w:r>
+        <w:rPr>
+          <w:rFonts w:ascii="Times New Roman" w:hAnsi="Times New Roman" w:cs="Times New Roman"/>
+        </w:rPr>
+        <w:t>.</w:t>
+      </w:r>
+      <w:r>
+        <w:rPr>
+          <w:rFonts w:ascii="Times New Roman" w:hAnsi="Times New Roman" w:cs="Times New Roman"/>
+        </w:rPr>
+        <w:t xml:space="preserve"> Although we hypothesized that the maternal signature would differ among watersheds</w:t>
+      </w:r>
+      <w:r>
+        <w:rPr>
+          <w:rFonts w:ascii="Times New Roman" w:hAnsi="Times New Roman" w:cs="Times New Roman"/>
+        </w:rPr>
+        <w:t xml:space="preserve">, and thus could be useful for classification, </w:t>
+      </w:r>
+      <w:r>
+        <w:rPr>
+          <w:rFonts w:ascii="Times New Roman" w:hAnsi="Times New Roman" w:cs="Times New Roman"/>
+        </w:rPr>
+        <w:t xml:space="preserve">the start of the laser ablation </w:t>
+      </w:r>
+      <w:proofErr w:type="gramStart"/>
+      <w:r>
+        <w:rPr>
+          <w:rFonts w:ascii="Times New Roman" w:hAnsi="Times New Roman" w:cs="Times New Roman"/>
+        </w:rPr>
+        <w:t>transect</w:t>
+      </w:r>
+      <w:proofErr w:type="gramEnd"/>
+      <w:r>
+        <w:rPr>
+          <w:rFonts w:ascii="Times New Roman" w:hAnsi="Times New Roman" w:cs="Times New Roman"/>
+        </w:rPr>
+        <w:t xml:space="preserve"> and quality of the core signal varied among samples and years. T</w:t>
+      </w:r>
+      <w:r>
+        <w:rPr>
+          <w:rFonts w:ascii="Times New Roman" w:hAnsi="Times New Roman" w:cs="Times New Roman"/>
+        </w:rPr>
+        <w:t xml:space="preserve">herefore, to </w:t>
+      </w:r>
+      <w:proofErr w:type="spellStart"/>
+      <w:r>
+        <w:rPr>
+          <w:rFonts w:ascii="Times New Roman" w:hAnsi="Times New Roman" w:cs="Times New Roman"/>
+        </w:rPr>
+        <w:t>maximise</w:t>
+      </w:r>
+      <w:proofErr w:type="spellEnd"/>
+      <w:r>
+        <w:rPr>
+          <w:rFonts w:ascii="Times New Roman" w:hAnsi="Times New Roman" w:cs="Times New Roman"/>
+        </w:rPr>
+        <w:t xml:space="preserve"> consistency among years we did not include the portion</w:t>
+      </w:r>
+      <w:r>
+        <w:rPr>
+          <w:rFonts w:ascii="Times New Roman" w:hAnsi="Times New Roman" w:cs="Times New Roman"/>
+        </w:rPr>
+        <w:t xml:space="preserve"> of the time series</w:t>
+      </w:r>
+      <w:r>
+        <w:rPr>
+          <w:rFonts w:ascii="Times New Roman" w:hAnsi="Times New Roman" w:cs="Times New Roman"/>
+        </w:rPr>
+        <w:t xml:space="preserve"> before the natal origin region. A </w:t>
+      </w:r>
+      <w:r>
+        <w:rPr>
+          <w:rFonts w:ascii="Times New Roman" w:hAnsi="Times New Roman" w:cs="Times New Roman"/>
+        </w:rPr>
+        <w:t xml:space="preserve">cutoff at the </w:t>
+      </w:r>
+      <w:r>
+        <w:rPr>
+          <w:rFonts w:ascii="Times New Roman" w:hAnsi="Times New Roman" w:cs="Times New Roman"/>
+        </w:rPr>
+        <w:t xml:space="preserve">marine entry was identified </w:t>
+      </w:r>
+      <w:r>
+        <w:rPr>
+          <w:rFonts w:ascii="Times New Roman" w:hAnsi="Times New Roman" w:cs="Times New Roman"/>
+        </w:rPr>
+        <w:t xml:space="preserve">by </w:t>
+      </w:r>
+      <w:r>
+        <w:rPr>
+          <w:rFonts w:ascii="Times New Roman" w:hAnsi="Times New Roman" w:cs="Times New Roman"/>
+        </w:rPr>
+        <w:t xml:space="preserve">the marine check </w:t>
+      </w:r>
+      <w:r>
+        <w:rPr>
+          <w:rFonts w:ascii="Times New Roman" w:hAnsi="Times New Roman" w:cs="Times New Roman"/>
+        </w:rPr>
+        <w:t>on the otolith</w:t>
+      </w:r>
+      <w:r>
+        <w:rPr>
+          <w:rFonts w:ascii="Times New Roman" w:hAnsi="Times New Roman" w:cs="Times New Roman"/>
+        </w:rPr>
+        <w:t xml:space="preserve"> (dark annuli region)</w:t>
+      </w:r>
+      <w:r>
+        <w:rPr>
+          <w:rFonts w:ascii="Times New Roman" w:hAnsi="Times New Roman" w:cs="Times New Roman"/>
+        </w:rPr>
+        <w:t>, a rapid increase in</w:t>
+      </w:r>
+      <w:r>
+        <w:rPr>
+          <w:rFonts w:ascii="Times New Roman" w:hAnsi="Times New Roman" w:cs="Times New Roman"/>
+        </w:rPr>
+        <w:t xml:space="preserve"> </w:t>
+      </w:r>
+      <w:r>
+        <w:rPr>
+          <w:rFonts w:ascii="Times New Roman" w:hAnsi="Times New Roman" w:cs="Times New Roman"/>
+        </w:rPr>
+        <w:lastRenderedPageBreak/>
+        <w:t>⁸⁸Sr</w:t>
+      </w:r>
+      <w:r>
+        <w:rPr>
+          <w:rFonts w:ascii="Times New Roman" w:hAnsi="Times New Roman" w:cs="Times New Roman"/>
+        </w:rPr>
+        <w:t xml:space="preserve"> concentration</w:t>
+      </w:r>
+      <w:r>
+        <w:rPr>
+          <w:rFonts w:ascii="Times New Roman" w:hAnsi="Times New Roman" w:cs="Times New Roman"/>
+        </w:rPr>
+        <w:t xml:space="preserve">, and a </w:t>
+      </w:r>
+      <w:r>
+        <w:rPr>
+          <w:rFonts w:ascii="Times New Roman" w:hAnsi="Times New Roman" w:cs="Times New Roman"/>
+        </w:rPr>
+        <w:t>shift in ⁸⁷Sr/⁸⁶Sr to</w:t>
+      </w:r>
+      <w:r>
+        <w:rPr>
+          <w:rFonts w:ascii="Times New Roman" w:hAnsi="Times New Roman" w:cs="Times New Roman"/>
+        </w:rPr>
+        <w:t>war</w:t>
+      </w:r>
+      <w:r>
+        <w:rPr>
+          <w:rFonts w:ascii="Times New Roman" w:hAnsi="Times New Roman" w:cs="Times New Roman"/>
+        </w:rPr>
+        <w:t>d</w:t>
       </w:r>
       <w:r>
         <w:rPr>
@@ -4290,166 +4577,6 @@
         <w:rPr>
           <w:rFonts w:ascii="Times New Roman" w:hAnsi="Times New Roman" w:cs="Times New Roman"/>
         </w:rPr>
-        <w:t xml:space="preserve"> the maternal signal in the otolith</w:t>
-      </w:r>
-      <w:r>
-        <w:rPr>
-          <w:rFonts w:ascii="Times New Roman" w:hAnsi="Times New Roman" w:cs="Times New Roman"/>
-        </w:rPr>
-        <w:t>.</w:t>
-      </w:r>
-      <w:r>
-        <w:rPr>
-          <w:rFonts w:ascii="Times New Roman" w:hAnsi="Times New Roman" w:cs="Times New Roman"/>
-        </w:rPr>
-        <w:t xml:space="preserve"> Although we hypothesized that the maternal signature would differ among watersheds</w:t>
-      </w:r>
-      <w:r>
-        <w:rPr>
-          <w:rFonts w:ascii="Times New Roman" w:hAnsi="Times New Roman" w:cs="Times New Roman"/>
-        </w:rPr>
-        <w:t xml:space="preserve">, and thus could be useful for classification, </w:t>
-      </w:r>
-      <w:r>
-        <w:rPr>
-          <w:rFonts w:ascii="Times New Roman" w:hAnsi="Times New Roman" w:cs="Times New Roman"/>
-        </w:rPr>
-        <w:t xml:space="preserve">the start of the laser ablation </w:t>
-      </w:r>
-      <w:proofErr w:type="gramStart"/>
-      <w:r>
-        <w:rPr>
-          <w:rFonts w:ascii="Times New Roman" w:hAnsi="Times New Roman" w:cs="Times New Roman"/>
-        </w:rPr>
-        <w:t>transect</w:t>
-      </w:r>
-      <w:proofErr w:type="gramEnd"/>
-      <w:r>
-        <w:rPr>
-          <w:rFonts w:ascii="Times New Roman" w:hAnsi="Times New Roman" w:cs="Times New Roman"/>
-        </w:rPr>
-        <w:t xml:space="preserve"> and quality of the core signal varied among samples and years. T</w:t>
-      </w:r>
-      <w:r>
-        <w:rPr>
-          <w:rFonts w:ascii="Times New Roman" w:hAnsi="Times New Roman" w:cs="Times New Roman"/>
-        </w:rPr>
-        <w:t xml:space="preserve">herefore, to </w:t>
-      </w:r>
-      <w:proofErr w:type="spellStart"/>
-      <w:r>
-        <w:rPr>
-          <w:rFonts w:ascii="Times New Roman" w:hAnsi="Times New Roman" w:cs="Times New Roman"/>
-        </w:rPr>
-        <w:t>maximise</w:t>
-      </w:r>
-      <w:proofErr w:type="spellEnd"/>
-      <w:r>
-        <w:rPr>
-          <w:rFonts w:ascii="Times New Roman" w:hAnsi="Times New Roman" w:cs="Times New Roman"/>
-        </w:rPr>
-        <w:t xml:space="preserve"> consistency among years we did not include the portion</w:t>
-      </w:r>
-      <w:r>
-        <w:rPr>
-          <w:rFonts w:ascii="Times New Roman" w:hAnsi="Times New Roman" w:cs="Times New Roman"/>
-        </w:rPr>
-        <w:t xml:space="preserve"> of the time series</w:t>
-      </w:r>
-      <w:r>
-        <w:rPr>
-          <w:rFonts w:ascii="Times New Roman" w:hAnsi="Times New Roman" w:cs="Times New Roman"/>
-        </w:rPr>
-        <w:t xml:space="preserve"> before the natal origin region. A </w:t>
-      </w:r>
-      <w:r>
-        <w:rPr>
-          <w:rFonts w:ascii="Times New Roman" w:hAnsi="Times New Roman" w:cs="Times New Roman"/>
-        </w:rPr>
-        <w:t xml:space="preserve">cutoff at the </w:t>
-      </w:r>
-      <w:r>
-        <w:rPr>
-          <w:rFonts w:ascii="Times New Roman" w:hAnsi="Times New Roman" w:cs="Times New Roman"/>
-        </w:rPr>
-        <w:t xml:space="preserve">marine entry was identified </w:t>
-      </w:r>
-      <w:r>
-        <w:rPr>
-          <w:rFonts w:ascii="Times New Roman" w:hAnsi="Times New Roman" w:cs="Times New Roman"/>
-        </w:rPr>
-        <w:t xml:space="preserve">by </w:t>
-      </w:r>
-      <w:r>
-        <w:rPr>
-          <w:rFonts w:ascii="Times New Roman" w:hAnsi="Times New Roman" w:cs="Times New Roman"/>
-        </w:rPr>
-        <w:t xml:space="preserve">the marine check </w:t>
-      </w:r>
-      <w:r>
-        <w:rPr>
-          <w:rFonts w:ascii="Times New Roman" w:hAnsi="Times New Roman" w:cs="Times New Roman"/>
-        </w:rPr>
-        <w:t>on the otolith</w:t>
-      </w:r>
-      <w:r>
-        <w:rPr>
-          <w:rFonts w:ascii="Times New Roman" w:hAnsi="Times New Roman" w:cs="Times New Roman"/>
-        </w:rPr>
-        <w:t xml:space="preserve"> (dark annuli region)</w:t>
-      </w:r>
-      <w:r>
-        <w:rPr>
-          <w:rFonts w:ascii="Times New Roman" w:hAnsi="Times New Roman" w:cs="Times New Roman"/>
-        </w:rPr>
-        <w:t>, a rapid increase in</w:t>
-      </w:r>
-      <w:r>
-        <w:rPr>
-          <w:rFonts w:ascii="Times New Roman" w:hAnsi="Times New Roman" w:cs="Times New Roman"/>
-        </w:rPr>
-        <w:t xml:space="preserve"> ⁸⁸Sr</w:t>
-      </w:r>
-      <w:r>
-        <w:rPr>
-          <w:rFonts w:ascii="Times New Roman" w:hAnsi="Times New Roman" w:cs="Times New Roman"/>
-        </w:rPr>
-        <w:t xml:space="preserve"> concentration</w:t>
-      </w:r>
-      <w:r>
-        <w:rPr>
-          <w:rFonts w:ascii="Times New Roman" w:hAnsi="Times New Roman" w:cs="Times New Roman"/>
-        </w:rPr>
-        <w:t xml:space="preserve">, and a </w:t>
-      </w:r>
-      <w:r>
-        <w:rPr>
-          <w:rFonts w:ascii="Times New Roman" w:hAnsi="Times New Roman" w:cs="Times New Roman"/>
-        </w:rPr>
-        <w:t>shift in ⁸⁷Sr/⁸⁶Sr to</w:t>
-      </w:r>
-      <w:r>
-        <w:rPr>
-          <w:rFonts w:ascii="Times New Roman" w:hAnsi="Times New Roman" w:cs="Times New Roman"/>
-        </w:rPr>
-        <w:t>war</w:t>
-      </w:r>
-      <w:r>
-        <w:rPr>
-          <w:rFonts w:ascii="Times New Roman" w:hAnsi="Times New Roman" w:cs="Times New Roman"/>
-        </w:rPr>
-        <w:t>d</w:t>
-      </w:r>
-      <w:r>
-        <w:rPr>
-          <w:rFonts w:ascii="Times New Roman" w:hAnsi="Times New Roman" w:cs="Times New Roman"/>
-        </w:rPr>
-        <w:t>s</w:t>
-      </w:r>
-      <w:r>
-        <w:rPr>
-          <w:rFonts w:ascii="Times New Roman" w:hAnsi="Times New Roman" w:cs="Times New Roman"/>
-        </w:rPr>
         <w:t xml:space="preserve"> the</w:t>
       </w:r>
       <w:r>
@@ -4500,7 +4627,7 @@
         </w:rPr>
         <w:t xml:space="preserve"> randomized </w:t>
       </w:r>
-      <w:ins w:id="50" w:author="Benjamin J. Makhlouf" w:date="2026-03-01T20:13:00Z" w16du:dateUtc="2026-03-02T04:13:00Z">
+      <w:ins w:id="64" w:author="Benjamin J. Makhlouf" w:date="2026-03-01T20:13:00Z" w16du:dateUtc="2026-03-02T04:13:00Z">
         <w:r>
           <w:rPr>
             <w:rFonts w:ascii="Times New Roman" w:hAnsi="Times New Roman" w:cs="Times New Roman"/>
@@ -4508,29 +4635,47 @@
           <w:t xml:space="preserve">among samples and </w:t>
         </w:r>
       </w:ins>
-      <w:ins w:id="51" w:author="Benjamin J. Makhlouf" w:date="2026-03-01T20:12:00Z" w16du:dateUtc="2026-03-02T04:12:00Z">
+      <w:ins w:id="65" w:author="Benjamin J. Makhlouf" w:date="2026-03-01T20:12:00Z" w16du:dateUtc="2026-03-02T04:12:00Z">
         <w:r>
           <w:rPr>
             <w:rFonts w:ascii="Times New Roman" w:hAnsi="Times New Roman" w:cs="Times New Roman"/>
           </w:rPr>
-          <w:t xml:space="preserve">done without knowing the </w:t>
+          <w:t>done without know</w:t>
         </w:r>
       </w:ins>
-      <w:ins w:id="52" w:author="Benjamin J. Makhlouf" w:date="2026-03-01T20:13:00Z" w16du:dateUtc="2026-03-02T04:13:00Z">
+      <w:ins w:id="66" w:author="Benjamin J. Makhlouf" w:date="2026-03-02T16:20:00Z" w16du:dateUtc="2026-03-03T00:20:00Z">
         <w:r>
           <w:rPr>
             <w:rFonts w:ascii="Times New Roman" w:hAnsi="Times New Roman" w:cs="Times New Roman"/>
           </w:rPr>
-          <w:t xml:space="preserve">watershed of origin to avoid </w:t>
+          <w:t>ledge of</w:t>
         </w:r>
-        <w:proofErr w:type="gramStart"/>
+      </w:ins>
+      <w:ins w:id="67" w:author="Benjamin J. Makhlouf" w:date="2026-03-01T20:12:00Z" w16du:dateUtc="2026-03-02T04:12:00Z">
         <w:r>
           <w:rPr>
             <w:rFonts w:ascii="Times New Roman" w:hAnsi="Times New Roman" w:cs="Times New Roman"/>
           </w:rPr>
-          <w:t>bias .</w:t>
+          <w:t xml:space="preserve"> the </w:t>
         </w:r>
-        <w:proofErr w:type="gramEnd"/>
+      </w:ins>
+      <w:ins w:id="68" w:author="Benjamin J. Makhlouf" w:date="2026-03-01T20:13:00Z" w16du:dateUtc="2026-03-02T04:13:00Z">
+        <w:r>
+          <w:rPr>
+            <w:rFonts w:ascii="Times New Roman" w:hAnsi="Times New Roman" w:cs="Times New Roman"/>
+          </w:rPr>
+          <w:t>watershed of origin to avoid bias</w:t>
+        </w:r>
+      </w:ins>
+      <w:ins w:id="69" w:author="Benjamin J. Makhlouf" w:date="2026-03-02T16:19:00Z" w16du:dateUtc="2026-03-03T00:19:00Z">
+        <w:r>
+          <w:rPr>
+            <w:rFonts w:ascii="Times New Roman" w:hAnsi="Times New Roman" w:cs="Times New Roman"/>
+          </w:rPr>
+          <w:t>.</w:t>
+        </w:r>
+      </w:ins>
+      <w:ins w:id="70" w:author="Benjamin J. Makhlouf" w:date="2026-03-01T20:13:00Z" w16du:dateUtc="2026-03-02T04:13:00Z">
         <w:r>
           <w:rPr>
             <w:rFonts w:ascii="Times New Roman" w:hAnsi="Times New Roman" w:cs="Times New Roman"/>
@@ -4538,7 +4683,7 @@
           <w:t xml:space="preserve"> </w:t>
         </w:r>
       </w:ins>
-      <w:del w:id="53" w:author="Benjamin J. Makhlouf" w:date="2026-03-01T20:12:00Z" w16du:dateUtc="2026-03-02T04:12:00Z">
+      <w:del w:id="71" w:author="Benjamin J. Makhlouf" w:date="2026-03-01T20:12:00Z" w16du:dateUtc="2026-03-02T04:12:00Z">
         <w:r>
           <w:rPr>
             <w:rFonts w:ascii="Times New Roman" w:hAnsi="Times New Roman" w:cs="Times New Roman"/>
@@ -4546,7 +4691,7 @@
           <w:delText xml:space="preserve">and </w:delText>
         </w:r>
       </w:del>
-      <w:del w:id="54" w:author="Benjamin J. Makhlouf" w:date="2026-03-01T20:13:00Z" w16du:dateUtc="2026-03-02T04:13:00Z">
+      <w:del w:id="72" w:author="Benjamin J. Makhlouf" w:date="2026-03-01T20:13:00Z" w16du:dateUtc="2026-03-02T04:13:00Z">
         <w:r>
           <w:rPr>
             <w:rFonts w:ascii="Times New Roman" w:hAnsi="Times New Roman" w:cs="Times New Roman"/>
@@ -4650,7 +4795,73 @@
         <w:rPr>
           <w:rFonts w:ascii="Times New Roman" w:hAnsi="Times New Roman" w:cs="Times New Roman"/>
         </w:rPr>
-        <w:t xml:space="preserve"> (971 Yukon, 875 Kuskokwim, and 685 Nushagak). </w:t>
+        <w:t xml:space="preserve"> (97</w:t>
+      </w:r>
+      <w:ins w:id="73" w:author="Benjamin J. Makhlouf" w:date="2026-03-02T16:02:00Z" w16du:dateUtc="2026-03-03T00:02:00Z">
+        <w:r>
+          <w:rPr>
+            <w:rFonts w:ascii="Times New Roman" w:hAnsi="Times New Roman" w:cs="Times New Roman"/>
+          </w:rPr>
+          <w:t>4</w:t>
+        </w:r>
+      </w:ins>
+      <w:del w:id="74" w:author="Benjamin J. Makhlouf" w:date="2026-03-02T16:02:00Z" w16du:dateUtc="2026-03-03T00:02:00Z">
+        <w:r>
+          <w:rPr>
+            <w:rFonts w:ascii="Times New Roman" w:hAnsi="Times New Roman" w:cs="Times New Roman"/>
+          </w:rPr>
+          <w:delText>1</w:delText>
+        </w:r>
+      </w:del>
+      <w:r>
+        <w:rPr>
+          <w:rFonts w:ascii="Times New Roman" w:hAnsi="Times New Roman" w:cs="Times New Roman"/>
+        </w:rPr>
+        <w:t xml:space="preserve"> Yukon, 87</w:t>
+      </w:r>
+      <w:ins w:id="75" w:author="Benjamin J. Makhlouf" w:date="2026-03-02T16:02:00Z" w16du:dateUtc="2026-03-03T00:02:00Z">
+        <w:r>
+          <w:rPr>
+            <w:rFonts w:ascii="Times New Roman" w:hAnsi="Times New Roman" w:cs="Times New Roman"/>
+          </w:rPr>
+          <w:t>7</w:t>
+        </w:r>
+      </w:ins>
+      <w:del w:id="76" w:author="Benjamin J. Makhlouf" w:date="2026-03-02T16:02:00Z" w16du:dateUtc="2026-03-03T00:02:00Z">
+        <w:r>
+          <w:rPr>
+            <w:rFonts w:ascii="Times New Roman" w:hAnsi="Times New Roman" w:cs="Times New Roman"/>
+          </w:rPr>
+          <w:delText>5</w:delText>
+        </w:r>
+      </w:del>
+      <w:r>
+        <w:rPr>
+          <w:rFonts w:ascii="Times New Roman" w:hAnsi="Times New Roman" w:cs="Times New Roman"/>
+        </w:rPr>
+        <w:t xml:space="preserve"> Kuskokwim, and 68</w:t>
+      </w:r>
+      <w:ins w:id="77" w:author="Benjamin J. Makhlouf" w:date="2026-03-02T16:02:00Z" w16du:dateUtc="2026-03-03T00:02:00Z">
+        <w:r>
+          <w:rPr>
+            <w:rFonts w:ascii="Times New Roman" w:hAnsi="Times New Roman" w:cs="Times New Roman"/>
+          </w:rPr>
+          <w:t>6</w:t>
+        </w:r>
+      </w:ins>
+      <w:del w:id="78" w:author="Benjamin J. Makhlouf" w:date="2026-03-02T16:02:00Z" w16du:dateUtc="2026-03-03T00:02:00Z">
+        <w:r>
+          <w:rPr>
+            <w:rFonts w:ascii="Times New Roman" w:hAnsi="Times New Roman" w:cs="Times New Roman"/>
+          </w:rPr>
+          <w:delText>5</w:delText>
+        </w:r>
+      </w:del>
+      <w:r>
+        <w:rPr>
+          <w:rFonts w:ascii="Times New Roman" w:hAnsi="Times New Roman" w:cs="Times New Roman"/>
+        </w:rPr>
+        <w:t xml:space="preserve"> Nushagak). </w:t>
       </w:r>
     </w:p>
     <w:p>
@@ -4665,7 +4876,6 @@
         <w:rPr>
           <w:rFonts w:ascii="Times New Roman" w:hAnsi="Times New Roman" w:cs="Times New Roman"/>
         </w:rPr>
-        <w:lastRenderedPageBreak/>
         <w:t>To test whether</w:t>
       </w:r>
       <w:r>
@@ -5123,7 +5333,14 @@
         <w:rPr>
           <w:rFonts w:ascii="Times New Roman" w:hAnsi="Times New Roman" w:cs="Times New Roman"/>
         </w:rPr>
-        <w:t xml:space="preserve">into uncorrelated principal components that capture the greatest variance in the dataset, thereby highlighting variability among </w:t>
+        <w:t xml:space="preserve">into uncorrelated principal </w:t>
+      </w:r>
+      <w:r>
+        <w:rPr>
+          <w:rFonts w:ascii="Times New Roman" w:hAnsi="Times New Roman" w:cs="Times New Roman"/>
+        </w:rPr>
+        <w:lastRenderedPageBreak/>
+        <w:t xml:space="preserve">components that capture the greatest variance in the dataset, thereby highlighting variability among </w:t>
       </w:r>
       <w:r>
         <w:rPr>
@@ -5285,14 +5502,7 @@
         <w:rPr>
           <w:rFonts w:ascii="Times New Roman" w:hAnsi="Times New Roman" w:cs="Times New Roman"/>
         </w:rPr>
-        <w:t xml:space="preserve">% of variance) </w:t>
-      </w:r>
-      <w:r>
-        <w:rPr>
-          <w:rFonts w:ascii="Times New Roman" w:hAnsi="Times New Roman" w:cs="Times New Roman"/>
-        </w:rPr>
-        <w:lastRenderedPageBreak/>
-        <w:t>and PC2 (20.9% of variance) as well as between PC1 and PC3 (10.2% of variance)</w:t>
+        <w:t>% of variance) and PC2 (20.9% of variance) as well as between PC1 and PC3 (10.2% of variance)</w:t>
       </w:r>
       <w:r>
         <w:rPr>
@@ -5688,6 +5898,7 @@
         <w:ind w:firstLine="720"/>
       </w:pPr>
       <w:r>
+        <w:lastRenderedPageBreak/>
         <w:t xml:space="preserve">Trained models were </w:t>
       </w:r>
       <w:r>
@@ -5745,11 +5956,7 @@
         <w:t>referred</w:t>
       </w:r>
       <w:r>
-        <w:t xml:space="preserve"> to as the </w:t>
-      </w:r>
-      <w:r>
-        <w:lastRenderedPageBreak/>
-        <w:t>“</w:t>
+        <w:t xml:space="preserve"> to as the “</w:t>
       </w:r>
       <w:r>
         <w:t>Restricted”</w:t>
@@ -6000,7 +6207,11 @@
         <w:t xml:space="preserve"> accuracy of fish from within the CWAK (Coastal Western Alaska) genetic reporting group by removing individuals</w:t>
       </w:r>
       <w:r>
-        <w:t xml:space="preserve"> from the testing set</w:t>
+        <w:t xml:space="preserve"> </w:t>
+      </w:r>
+      <w:r>
+        <w:lastRenderedPageBreak/>
+        <w:t>from the testing set</w:t>
       </w:r>
       <w:r>
         <w:t xml:space="preserve"> with genetic assignments </w:t>
@@ -6074,11 +6285,7 @@
         <w:t xml:space="preserve">that </w:t>
       </w:r>
       <w:r>
-        <w:t xml:space="preserve">correctly identify rank class likelihood but produce estimated probability values that </w:t>
-      </w:r>
-      <w:r>
-        <w:lastRenderedPageBreak/>
-        <w:t>do</w:t>
+        <w:t>correctly identify rank class likelihood but produce estimated probability values that do</w:t>
       </w:r>
       <w:r>
         <w:t xml:space="preserve"> not accurately reflect </w:t>
@@ -6251,12 +6458,12 @@
       <w:r>
         <w:t xml:space="preserve"> </w:t>
       </w:r>
-      <w:ins w:id="55" w:author="Benjamin J. Makhlouf" w:date="2026-03-01T20:21:00Z" w16du:dateUtc="2026-03-02T04:21:00Z">
+      <w:ins w:id="79" w:author="Benjamin J. Makhlouf" w:date="2026-03-01T20:21:00Z" w16du:dateUtc="2026-03-02T04:21:00Z">
         <w:r>
           <w:t>2</w:t>
         </w:r>
       </w:ins>
-      <w:del w:id="56" w:author="Benjamin J. Makhlouf" w:date="2026-03-01T20:21:00Z" w16du:dateUtc="2026-03-02T04:21:00Z">
+      <w:del w:id="80" w:author="Benjamin J. Makhlouf" w:date="2026-03-01T20:21:00Z" w16du:dateUtc="2026-03-02T04:21:00Z">
         <w:r>
           <w:delText>1.</w:delText>
         </w:r>
@@ -6331,7 +6538,11 @@
         <w:t>above</w:t>
       </w:r>
       <w:r>
-        <w:t xml:space="preserve"> calibrated</w:t>
+        <w:t xml:space="preserve"> </w:t>
+      </w:r>
+      <w:r>
+        <w:lastRenderedPageBreak/>
+        <w:t>calibrated</w:t>
       </w:r>
       <w:r>
         <w:t xml:space="preserve"> confidence thresholds ranging from </w:t>
@@ -6389,7 +6600,6 @@
           <w:b/>
           <w:bCs/>
         </w:rPr>
-        <w:lastRenderedPageBreak/>
         <w:t xml:space="preserve">Results </w:t>
       </w:r>
     </w:p>
@@ -6437,12 +6647,12 @@
       <w:r>
         <w:t xml:space="preserve">Principal component analysis of the full GAM-smoothed dataset (n = 2,531) revealed </w:t>
       </w:r>
-      <w:ins w:id="57" w:author="Benjamin J. Makhlouf" w:date="2026-03-01T20:18:00Z" w16du:dateUtc="2026-03-02T04:18:00Z">
+      <w:ins w:id="81" w:author="Benjamin J. Makhlouf" w:date="2026-03-01T20:18:00Z" w16du:dateUtc="2026-03-02T04:18:00Z">
         <w:r>
           <w:t xml:space="preserve">substantial </w:t>
         </w:r>
       </w:ins>
-      <w:del w:id="58" w:author="Benjamin J. Makhlouf" w:date="2026-03-01T20:18:00Z" w16du:dateUtc="2026-03-02T04:18:00Z">
+      <w:del w:id="82" w:author="Benjamin J. Makhlouf" w:date="2026-03-01T20:18:00Z" w16du:dateUtc="2026-03-02T04:18:00Z">
         <w:r>
           <w:delText xml:space="preserve">significant </w:delText>
         </w:r>
@@ -6580,7 +6790,14 @@
         <w:rPr>
           <w:rFonts w:ascii="Times New Roman" w:hAnsi="Times New Roman" w:cs="Times New Roman"/>
         </w:rPr>
-        <w:t xml:space="preserve"> revealed distinct regions driving class separation. The first principal component showed high loading values in the middle portion of the </w:t>
+        <w:t xml:space="preserve"> revealed distinct regions driving class separation. The first principal component showed high </w:t>
+      </w:r>
+      <w:r>
+        <w:rPr>
+          <w:rFonts w:ascii="Times New Roman" w:hAnsi="Times New Roman" w:cs="Times New Roman"/>
+        </w:rPr>
+        <w:lastRenderedPageBreak/>
+        <w:t xml:space="preserve">loading values in the middle portion of the </w:t>
       </w:r>
       <w:r>
         <w:rPr>
@@ -6758,14 +6975,7 @@
         <w:rPr>
           <w:rFonts w:ascii="Times New Roman" w:hAnsi="Times New Roman" w:cs="Times New Roman"/>
         </w:rPr>
-        <w:t xml:space="preserve"> either a dip in </w:t>
-      </w:r>
-      <w:r>
-        <w:rPr>
-          <w:rFonts w:ascii="Times New Roman" w:hAnsi="Times New Roman" w:cs="Times New Roman"/>
-        </w:rPr>
-        <w:lastRenderedPageBreak/>
-        <w:t xml:space="preserve">⁸⁷Sr/⁸⁶Sr for Nushagak fish, an increase for Yukon fish, or a more subtle increase for Kuskokwim fish before the marine cutoff (Figure </w:t>
+        <w:t xml:space="preserve"> either a dip in ⁸⁷Sr/⁸⁶Sr for Nushagak fish, an increase for Yukon fish, or a more subtle increase for Kuskokwim fish before the marine cutoff (Figure </w:t>
       </w:r>
       <w:r>
         <w:rPr>
@@ -7070,7 +7280,14 @@
         <w:rPr>
           <w:rFonts w:ascii="Times New Roman" w:hAnsi="Times New Roman" w:cs="Times New Roman"/>
         </w:rPr>
-        <w:t xml:space="preserve"> inhibited model performance by obscuring meaningful patterns. Among model types KNN consistently </w:t>
+        <w:t xml:space="preserve"> inhibited model performance by obscuring meaningful patterns. Among model types </w:t>
+      </w:r>
+      <w:r>
+        <w:rPr>
+          <w:rFonts w:ascii="Times New Roman" w:hAnsi="Times New Roman" w:cs="Times New Roman"/>
+        </w:rPr>
+        <w:lastRenderedPageBreak/>
+        <w:t xml:space="preserve">KNN consistently </w:t>
       </w:r>
       <w:r>
         <w:rPr>
@@ -7181,7 +7398,6 @@
         <w:rPr>
           <w:rFonts w:ascii="Times New Roman" w:hAnsi="Times New Roman" w:cs="Times New Roman"/>
         </w:rPr>
-        <w:lastRenderedPageBreak/>
         <w:t>The best p</w:t>
       </w:r>
       <w:r>
@@ -7372,7 +7588,7 @@
         </w:rPr>
         <w:t xml:space="preserve">Classification accuracy within the CWAK reporting group, which includes the Kuskokwim, Nushagak, and Lower Yukon regions was 90.0%. Classification accuracy for regions in our dataset not within CWAK was 97.9%. Yukon classification accuracy for those within the CWAK group fell to 73.3%. However, it should be noted that the sample size of CWAK Yukon individuals was </w:t>
       </w:r>
-      <w:ins w:id="59" w:author="Benjamin J. Makhlouf" w:date="2026-03-01T20:19:00Z" w16du:dateUtc="2026-03-02T04:19:00Z">
+      <w:ins w:id="83" w:author="Benjamin J. Makhlouf" w:date="2026-03-01T20:19:00Z" w16du:dateUtc="2026-03-02T04:19:00Z">
         <w:r>
           <w:rPr>
             <w:rFonts w:ascii="Times New Roman" w:hAnsi="Times New Roman" w:cs="Times New Roman"/>
@@ -7380,7 +7596,7 @@
           <w:t xml:space="preserve">substantially </w:t>
         </w:r>
       </w:ins>
-      <w:del w:id="60" w:author="Benjamin J. Makhlouf" w:date="2026-03-01T20:19:00Z" w16du:dateUtc="2026-03-02T04:19:00Z">
+      <w:del w:id="84" w:author="Benjamin J. Makhlouf" w:date="2026-03-01T20:19:00Z" w16du:dateUtc="2026-03-02T04:19:00Z">
         <w:r>
           <w:rPr>
             <w:rFonts w:ascii="Times New Roman" w:hAnsi="Times New Roman" w:cs="Times New Roman"/>
@@ -7420,7 +7636,14 @@
         <w:rPr>
           <w:rFonts w:ascii="Times New Roman" w:hAnsi="Times New Roman" w:cs="Times New Roman"/>
         </w:rPr>
-        <w:t xml:space="preserve"> , resulting in a more pronounced impact to class- specific accuracy from misassignment to relatively few individuals. </w:t>
+        <w:t xml:space="preserve"> , resulting in a </w:t>
+      </w:r>
+      <w:r>
+        <w:rPr>
+          <w:rFonts w:ascii="Times New Roman" w:hAnsi="Times New Roman" w:cs="Times New Roman"/>
+        </w:rPr>
+        <w:lastRenderedPageBreak/>
+        <w:t xml:space="preserve">more pronounced impact to class- specific accuracy from misassignment to relatively few individuals. </w:t>
       </w:r>
     </w:p>
     <w:p>
@@ -7522,14 +7745,7 @@
         <w:rPr>
           <w:rFonts w:ascii="Times New Roman" w:hAnsi="Times New Roman" w:cs="Times New Roman"/>
         </w:rPr>
-        <w:t xml:space="preserve"> Visual assessments indicated improved calibration, with the relationship between predicted and </w:t>
-      </w:r>
-      <w:r>
-        <w:rPr>
-          <w:rFonts w:ascii="Times New Roman" w:hAnsi="Times New Roman" w:cs="Times New Roman"/>
-        </w:rPr>
-        <w:lastRenderedPageBreak/>
-        <w:t>observed probabilities approximating a 1:1 line across all classes and model–data type combinations (ex. Supp. Fig</w:t>
+        <w:t xml:space="preserve"> Visual assessments indicated improved calibration, with the relationship between predicted and observed probabilities approximating a 1:1 line across all classes and model–data type combinations (ex. Supp. Fig</w:t>
       </w:r>
       <w:r>
         <w:rPr>
@@ -7567,7 +7783,7 @@
         </w:rPr>
         <w:t>accuracy ranged from 91</w:t>
       </w:r>
-      <w:ins w:id="61" w:author="Benjamin J. Makhlouf" w:date="2026-03-01T20:23:00Z" w16du:dateUtc="2026-03-02T04:23:00Z">
+      <w:ins w:id="85" w:author="Benjamin J. Makhlouf" w:date="2026-03-01T20:23:00Z" w16du:dateUtc="2026-03-02T04:23:00Z">
         <w:r>
           <w:rPr>
             <w:rFonts w:ascii="Times New Roman" w:hAnsi="Times New Roman" w:cs="Times New Roman"/>
@@ -7581,7 +7797,7 @@
         </w:rPr>
         <w:t xml:space="preserve"> </w:t>
       </w:r>
-      <w:ins w:id="62" w:author="Benjamin J. Makhlouf" w:date="2026-03-01T20:23:00Z" w16du:dateUtc="2026-03-02T04:23:00Z">
+      <w:ins w:id="86" w:author="Benjamin J. Makhlouf" w:date="2026-03-01T20:23:00Z" w16du:dateUtc="2026-03-02T04:23:00Z">
         <w:r>
           <w:rPr>
             <w:rFonts w:ascii="Times New Roman" w:hAnsi="Times New Roman" w:cs="Times New Roman"/>
@@ -7589,7 +7805,7 @@
           <w:t xml:space="preserve">to </w:t>
         </w:r>
       </w:ins>
-      <w:del w:id="63" w:author="Benjamin J. Makhlouf" w:date="2026-03-01T20:23:00Z" w16du:dateUtc="2026-03-02T04:23:00Z">
+      <w:del w:id="87" w:author="Benjamin J. Makhlouf" w:date="2026-03-01T20:23:00Z" w16du:dateUtc="2026-03-02T04:23:00Z">
         <w:r>
           <w:rPr>
             <w:rFonts w:ascii="Times New Roman" w:hAnsi="Times New Roman" w:cs="Times New Roman"/>
@@ -7804,14 +8020,7 @@
         <w:rPr>
           <w:rFonts w:ascii="Times New Roman" w:hAnsi="Times New Roman" w:cs="Times New Roman"/>
         </w:rPr>
-        <w:t xml:space="preserve">smoothed datasets. Notably, even our simplest model (KNN) performed </w:t>
-      </w:r>
-      <w:r>
-        <w:rPr>
-          <w:rFonts w:ascii="Times New Roman" w:hAnsi="Times New Roman" w:cs="Times New Roman"/>
-        </w:rPr>
-        <w:lastRenderedPageBreak/>
-        <w:t xml:space="preserve">well, delivering reasonably high classification accuracy across both testing sets. </w:t>
+        <w:t xml:space="preserve">smoothed datasets. Notably, even our simplest model (KNN) performed well, delivering reasonably high classification accuracy across both testing sets. </w:t>
       </w:r>
       <w:r>
         <w:rPr>
@@ -7837,7 +8046,7 @@
         </w:rPr>
         <w:t xml:space="preserve"> smoothing techniques s</w:t>
       </w:r>
-      <w:ins w:id="64" w:author="Benjamin J. Makhlouf" w:date="2026-03-01T20:17:00Z" w16du:dateUtc="2026-03-02T04:17:00Z">
+      <w:ins w:id="88" w:author="Benjamin J. Makhlouf" w:date="2026-03-01T20:17:00Z" w16du:dateUtc="2026-03-02T04:17:00Z">
         <w:r>
           <w:rPr>
             <w:rFonts w:ascii="Times New Roman" w:hAnsi="Times New Roman" w:cs="Times New Roman"/>
@@ -7845,7 +8054,7 @@
           <w:t xml:space="preserve">ubstantially </w:t>
         </w:r>
       </w:ins>
-      <w:del w:id="65" w:author="Benjamin J. Makhlouf" w:date="2026-03-01T20:17:00Z" w16du:dateUtc="2026-03-02T04:17:00Z">
+      <w:del w:id="89" w:author="Benjamin J. Makhlouf" w:date="2026-03-01T20:17:00Z" w16du:dateUtc="2026-03-02T04:17:00Z">
         <w:r>
           <w:rPr>
             <w:rFonts w:ascii="Times New Roman" w:hAnsi="Times New Roman" w:cs="Times New Roman"/>
@@ -8076,9 +8285,16 @@
         <w:rPr>
           <w:rFonts w:ascii="Times New Roman" w:hAnsi="Times New Roman" w:cs="Times New Roman"/>
         </w:rPr>
-        <w:t xml:space="preserve">This limitation is further illustrated in the confidence threshold analysis, in which we imposed the additional requirement that the model must assign to the correct class with a calibrated probability value above a given threshold. Preforming this analysis on the total dataset resulted in a </w:t>
-      </w:r>
-      <w:ins w:id="66" w:author="Benjamin J. Makhlouf" w:date="2026-03-01T20:18:00Z" w16du:dateUtc="2026-03-02T04:18:00Z">
+        <w:t xml:space="preserve">This limitation is further illustrated in the confidence threshold analysis, in which we </w:t>
+      </w:r>
+      <w:r>
+        <w:rPr>
+          <w:rFonts w:ascii="Times New Roman" w:hAnsi="Times New Roman" w:cs="Times New Roman"/>
+        </w:rPr>
+        <w:lastRenderedPageBreak/>
+        <w:t xml:space="preserve">imposed the additional requirement that the model must assign to the correct class with a calibrated probability value above a given threshold. Preforming this analysis on the total dataset resulted in a </w:t>
+      </w:r>
+      <w:ins w:id="90" w:author="Benjamin J. Makhlouf" w:date="2026-03-01T20:18:00Z" w16du:dateUtc="2026-03-02T04:18:00Z">
         <w:r>
           <w:rPr>
             <w:rFonts w:ascii="Times New Roman" w:hAnsi="Times New Roman" w:cs="Times New Roman"/>
@@ -8086,7 +8302,7 @@
           <w:t xml:space="preserve">substantial </w:t>
         </w:r>
       </w:ins>
-      <w:del w:id="67" w:author="Benjamin J. Makhlouf" w:date="2026-03-01T20:18:00Z" w16du:dateUtc="2026-03-02T04:18:00Z">
+      <w:del w:id="91" w:author="Benjamin J. Makhlouf" w:date="2026-03-01T20:18:00Z" w16du:dateUtc="2026-03-02T04:18:00Z">
         <w:r>
           <w:rPr>
             <w:rFonts w:ascii="Times New Roman" w:hAnsi="Times New Roman" w:cs="Times New Roman"/>
@@ -8170,14 +8386,7 @@
         <w:rPr>
           <w:rFonts w:ascii="Times New Roman" w:hAnsi="Times New Roman" w:cs="Times New Roman"/>
         </w:rPr>
-        <w:t xml:space="preserve"> which were distinct compared to the other watersheds either because of natal origin </w:t>
-      </w:r>
-      <w:r>
-        <w:rPr>
-          <w:rFonts w:ascii="Times New Roman" w:hAnsi="Times New Roman" w:cs="Times New Roman"/>
-        </w:rPr>
-        <w:lastRenderedPageBreak/>
-        <w:t>values</w:t>
+        <w:t xml:space="preserve"> which were distinct compared to the other watersheds either because of natal origin values</w:t>
       </w:r>
       <w:r>
         <w:rPr>
@@ -8444,6 +8653,7 @@
         <w:rPr>
           <w:rFonts w:ascii="Times New Roman" w:hAnsi="Times New Roman" w:cs="Times New Roman"/>
         </w:rPr>
+        <w:lastRenderedPageBreak/>
         <w:t>In addition to the ability to distinguish among major watersheds, t</w:t>
       </w:r>
       <w:r>
@@ -8627,14 +8837,7 @@
         <w:rPr>
           <w:rFonts w:ascii="Times New Roman" w:hAnsi="Times New Roman" w:cs="Times New Roman"/>
         </w:rPr>
-        <w:t xml:space="preserve">However, these preliminary observations suggest that similar approaches to the one outlined here may have the </w:t>
-      </w:r>
-      <w:r>
-        <w:rPr>
-          <w:rFonts w:ascii="Times New Roman" w:hAnsi="Times New Roman" w:cs="Times New Roman"/>
-        </w:rPr>
-        <w:lastRenderedPageBreak/>
-        <w:t xml:space="preserve">potential to improve assignment precision to the sub-basin scale without the need for additional data sources. </w:t>
+        <w:t xml:space="preserve">However, these preliminary observations suggest that similar approaches to the one outlined here may have the potential to improve assignment precision to the sub-basin scale without the need for additional data sources. </w:t>
       </w:r>
     </w:p>
     <w:p>
@@ -8687,7 +8890,7 @@
       <w:r>
         <w:t xml:space="preserve">of hypotheses of declining population health by allowing for an explicit assessment of marine mortality on stock specific health. </w:t>
       </w:r>
-      <w:bookmarkStart w:id="68" w:name="_Hlk223339650"/>
+      <w:bookmarkStart w:id="92" w:name="_Hlk223339650"/>
       <w:r>
         <w:t xml:space="preserve">The </w:t>
       </w:r>
@@ -8721,7 +8924,7 @@
       <w:r>
         <w:t xml:space="preserve"> </w:t>
       </w:r>
-      <w:ins w:id="69" w:author="Benjamin J. Makhlouf" w:date="2026-03-02T10:14:00Z" w16du:dateUtc="2026-03-02T18:14:00Z">
+      <w:ins w:id="93" w:author="Benjamin J. Makhlouf" w:date="2026-03-02T10:14:00Z" w16du:dateUtc="2026-03-02T18:14:00Z">
         <w:r>
           <w:t xml:space="preserve">a </w:t>
         </w:r>
@@ -8729,7 +8932,7 @@
       <w:r>
         <w:t xml:space="preserve">calibrated </w:t>
       </w:r>
-      <w:ins w:id="70" w:author="Benjamin J. Makhlouf" w:date="2026-03-02T10:14:00Z" w16du:dateUtc="2026-03-02T18:14:00Z">
+      <w:ins w:id="94" w:author="Benjamin J. Makhlouf" w:date="2026-03-02T10:14:00Z" w16du:dateUtc="2026-03-02T18:14:00Z">
         <w:r>
           <w:t xml:space="preserve">classification model that </w:t>
         </w:r>
@@ -8740,17 +8943,21 @@
       <w:r>
         <w:t>s</w:t>
       </w:r>
-      <w:bookmarkEnd w:id="68"/>
+      <w:bookmarkEnd w:id="92"/>
       <w:r>
         <w:t xml:space="preserve">. </w:t>
       </w:r>
       <w:r>
-        <w:t xml:space="preserve">Our dataset is unusually large for its type and includes samples collected across several years and from nearly all parts of the sampled watersheds. As such, we expect it to be broadly representative of the natural variability among years, and that the model presented here will generalize well to new years of data. However, due to sample size constraints we did not include a true validation set from a year excluded from the training and testing data, leaving open the possibility that some degree of overfitting to this dataset could affect assignment accuracy for unseen years. </w:t>
+        <w:t xml:space="preserve">Our dataset is unusually large for its type and includes samples collected across several years and from nearly all parts of the sampled watersheds. As such, we expect it to be broadly representative of the natural variability among years, and that the model presented here will </w:t>
+      </w:r>
+      <w:r>
+        <w:lastRenderedPageBreak/>
+        <w:t xml:space="preserve">generalize well to new years of data. However, due to sample size constraints we did not include a true validation set from a year excluded from the training and testing data, leaving open the possibility that some degree of overfitting to this dataset could affect assignment accuracy for unseen years. </w:t>
       </w:r>
       <w:r>
         <w:rPr>
           <w:highlight w:val="yellow"/>
-          <w:rPrChange w:id="71" w:author="Benjamin J. Makhlouf" w:date="2026-03-02T10:25:00Z" w16du:dateUtc="2026-03-02T18:25:00Z">
+          <w:rPrChange w:id="95" w:author="Benjamin J. Makhlouf" w:date="2026-03-02T10:25:00Z" w16du:dateUtc="2026-03-02T18:25:00Z">
             <w:rPr/>
           </w:rPrChange>
         </w:rPr>
@@ -8768,11 +8975,7 @@
         <w:t xml:space="preserve"> they support the potential for this model to generalize to new years of data, </w:t>
       </w:r>
       <w:r>
-        <w:t xml:space="preserve">which we plan to further </w:t>
-      </w:r>
-      <w:r>
-        <w:lastRenderedPageBreak/>
-        <w:t xml:space="preserve">evaluate as additional, currently unprocessed years of otolith data become available. </w:t>
+        <w:t xml:space="preserve">which we plan to further evaluate as additional, currently unprocessed years of otolith data become available. </w:t>
       </w:r>
       <w:r>
         <w:t xml:space="preserve">Additionally, sample preparation procedures and </w:t>
@@ -8819,12 +9022,12 @@
       <w:r>
         <w:fldChar w:fldCharType="end"/>
       </w:r>
-      <w:ins w:id="72" w:author="Benjamin J. Makhlouf" w:date="2026-03-02T10:27:00Z" w16du:dateUtc="2026-03-02T18:27:00Z">
+      <w:ins w:id="96" w:author="Benjamin J. Makhlouf" w:date="2026-03-02T10:27:00Z" w16du:dateUtc="2026-03-02T18:27:00Z">
         <w:r>
           <w:t xml:space="preserve"> </w:t>
         </w:r>
       </w:ins>
-      <w:del w:id="73" w:author="Benjamin J. Makhlouf" w:date="2026-03-02T10:25:00Z" w16du:dateUtc="2026-03-02T18:25:00Z">
+      <w:del w:id="97" w:author="Benjamin J. Makhlouf" w:date="2026-03-02T10:25:00Z" w16du:dateUtc="2026-03-02T18:25:00Z">
         <w:r>
           <w:delText>(Arai et al., 2025 (</w:delText>
         </w:r>
@@ -8906,7 +9109,11 @@
         <w:t xml:space="preserve">class estimates with </w:t>
       </w:r>
       <w:r>
-        <w:t xml:space="preserve">a true measure of model uncertainty. </w:t>
+        <w:t xml:space="preserve">a true measure of </w:t>
+      </w:r>
+      <w:r>
+        <w:lastRenderedPageBreak/>
+        <w:t xml:space="preserve">model uncertainty. </w:t>
       </w:r>
       <w:r>
         <w:t xml:space="preserve">In turn, </w:t>
@@ -8987,13 +9194,9 @@
         <w:t>s</w:t>
       </w:r>
       <w:r>
-        <w:t xml:space="preserve"> limited for in-season management or rapid research applications. Otolith LA-ICPMS is costly and labor-intensive, making large-scale, </w:t>
-      </w:r>
-      <w:r>
-        <w:lastRenderedPageBreak/>
-        <w:t>real-time assessment of river origin for marine-caught samples impractical. Moreover, otolith collection is lethal, which may be prohibitive given the increasingly endangered status of Chinook salmon in this region</w:t>
-      </w:r>
-      <w:ins w:id="74" w:author="Benjamin J. Makhlouf" w:date="2026-03-02T10:29:00Z" w16du:dateUtc="2026-03-02T18:29:00Z">
+        <w:t xml:space="preserve"> limited for in-season management or rapid research applications. Otolith LA-ICPMS is costly and labor-intensive, making large-scale, real-time assessment of river origin for marine-caught samples impractical. Moreover, otolith collection is lethal, which may be prohibitive given the increasingly endangered status of Chinook salmon in this region</w:t>
+      </w:r>
+      <w:ins w:id="98" w:author="Benjamin J. Makhlouf" w:date="2026-03-02T10:29:00Z" w16du:dateUtc="2026-03-02T18:29:00Z">
         <w:r>
           <w:t xml:space="preserve"> </w:t>
         </w:r>
@@ -9105,7 +9308,14 @@
         <w:rPr>
           <w:rFonts w:ascii="Times New Roman" w:hAnsi="Times New Roman" w:cs="Times New Roman"/>
         </w:rPr>
-        <w:t xml:space="preserve"> In this case, enabling river-basin scale determination of provenance for marine-caught Chinook salmon allows managers to connect region-wide salmon population patterns with river-specific population health. </w:t>
+        <w:t xml:space="preserve"> In this case, enabling river-basin scale determination of provenance for marine-caught Chinook salmon allows managers to connect region-wide salmon population patterns with river-specific </w:t>
+      </w:r>
+      <w:r>
+        <w:rPr>
+          <w:rFonts w:ascii="Times New Roman" w:hAnsi="Times New Roman" w:cs="Times New Roman"/>
+        </w:rPr>
+        <w:lastRenderedPageBreak/>
+        <w:t xml:space="preserve">population health. </w:t>
       </w:r>
       <w:r>
         <w:rPr>
@@ -9207,15 +9417,7 @@
           <w:color w:val="222222"/>
           <w:shd w:val="clear" w:color="auto" w:fill="FFFFFF"/>
         </w:rPr>
-        <w:t xml:space="preserve">to advance isotope-based </w:t>
-      </w:r>
-      <w:r>
-        <w:rPr>
-          <w:color w:val="222222"/>
-          <w:shd w:val="clear" w:color="auto" w:fill="FFFFFF"/>
-        </w:rPr>
-        <w:lastRenderedPageBreak/>
-        <w:t>methods </w:t>
+        <w:t>to advance isotope-based methods </w:t>
       </w:r>
       <w:r>
         <w:rPr>
@@ -9651,7 +9853,6 @@
         </w:rPr>
       </w:pPr>
       <w:r>
-        <w:lastRenderedPageBreak/>
         <w:fldChar w:fldCharType="begin"/>
       </w:r>
       <w:r>
@@ -9672,31 +9873,55 @@
           <w:i/>
           <w:iCs/>
         </w:rPr>
-        <w:t xml:space="preserve">Nushagak River King Salmon—Stock Status </w:t>
-      </w:r>
-      <w:proofErr w:type="gramStart"/>
+        <w:t>Nushagak River King Salmon—Stock Status And Action Plan</w:t>
+      </w:r>
+      <w:r>
+        <w:rPr>
+          <w:rFonts w:ascii="Times New Roman" w:hAnsi="Times New Roman" w:cs="Times New Roman"/>
+        </w:rPr>
+        <w:t>. https://www.adfg.alaska.gov/static/regulations/regprocess/fisheriesboard/pdfs/2022-2023/bb/rcs/rc004_Nushagak_King_Salmon_Action_Plan.pdf</w:t>
+      </w:r>
+    </w:p>
+    <w:p>
+      <w:pPr>
+        <w:pStyle w:val="Bibliography"/>
+        <w:rPr>
+          <w:rFonts w:ascii="Times New Roman" w:hAnsi="Times New Roman" w:cs="Times New Roman"/>
+        </w:rPr>
+      </w:pPr>
+      <w:r>
+        <w:rPr>
+          <w:rFonts w:ascii="Times New Roman" w:hAnsi="Times New Roman" w:cs="Times New Roman"/>
+        </w:rPr>
+        <w:t xml:space="preserve">Arai, K., Castonguay, M., Lyubchich, V., &amp; Secor, D. H. (2023). Integrating machine learning with otolith isoscapes: Reconstructing connectivity of a marine fish over four decades. </w:t>
+      </w:r>
       <w:r>
         <w:rPr>
           <w:rFonts w:ascii="Times New Roman" w:hAnsi="Times New Roman" w:cs="Times New Roman"/>
           <w:i/>
           <w:iCs/>
         </w:rPr>
-        <w:t>And</w:t>
-      </w:r>
-      <w:proofErr w:type="gramEnd"/>
+        <w:t>PLOS ONE</w:t>
+      </w:r>
+      <w:r>
+        <w:rPr>
+          <w:rFonts w:ascii="Times New Roman" w:hAnsi="Times New Roman" w:cs="Times New Roman"/>
+        </w:rPr>
+        <w:t xml:space="preserve">, </w:t>
+      </w:r>
       <w:r>
         <w:rPr>
           <w:rFonts w:ascii="Times New Roman" w:hAnsi="Times New Roman" w:cs="Times New Roman"/>
           <w:i/>
           <w:iCs/>
         </w:rPr>
-        <w:t xml:space="preserve"> Action Plan</w:t>
-      </w:r>
-      <w:r>
-        <w:rPr>
-          <w:rFonts w:ascii="Times New Roman" w:hAnsi="Times New Roman" w:cs="Times New Roman"/>
-        </w:rPr>
-        <w:t>. https://www.adfg.alaska.gov/static/regulations/regprocess/fisheriesboard/pdfs/2022-2023/bb/rcs/rc004_Nushagak_King_Salmon_Action_Plan.pdf</w:t>
+        <w:t>18</w:t>
+      </w:r>
+      <w:r>
+        <w:rPr>
+          <w:rFonts w:ascii="Times New Roman" w:hAnsi="Times New Roman" w:cs="Times New Roman"/>
+        </w:rPr>
+        <w:t>(5), e0285702. https://doi.org/10.1371/journal.pone.0285702</w:t>
       </w:r>
     </w:p>
     <w:p>
@@ -9710,35 +9935,7 @@
         <w:rPr>
           <w:rFonts w:ascii="Times New Roman" w:hAnsi="Times New Roman" w:cs="Times New Roman"/>
         </w:rPr>
-        <w:t xml:space="preserve">Arai, K., Castonguay, M., </w:t>
-      </w:r>
-      <w:proofErr w:type="spellStart"/>
-      <w:r>
-        <w:rPr>
-          <w:rFonts w:ascii="Times New Roman" w:hAnsi="Times New Roman" w:cs="Times New Roman"/>
-        </w:rPr>
-        <w:t>Lyubchich</w:t>
-      </w:r>
-      <w:proofErr w:type="spellEnd"/>
-      <w:r>
-        <w:rPr>
-          <w:rFonts w:ascii="Times New Roman" w:hAnsi="Times New Roman" w:cs="Times New Roman"/>
-        </w:rPr>
-        <w:t xml:space="preserve">, V., &amp; Secor, D. H. (2023). Integrating machine learning with otolith </w:t>
-      </w:r>
-      <w:proofErr w:type="spellStart"/>
-      <w:r>
-        <w:rPr>
-          <w:rFonts w:ascii="Times New Roman" w:hAnsi="Times New Roman" w:cs="Times New Roman"/>
-        </w:rPr>
-        <w:t>isoscapes</w:t>
-      </w:r>
-      <w:proofErr w:type="spellEnd"/>
-      <w:r>
-        <w:rPr>
-          <w:rFonts w:ascii="Times New Roman" w:hAnsi="Times New Roman" w:cs="Times New Roman"/>
-        </w:rPr>
-        <w:t xml:space="preserve">: Reconstructing connectivity of a marine fish over four decades. </w:t>
+        <w:t xml:space="preserve">Arai, K., Willmes, M., Johnson, R. C., &amp; Sturrock, A. M. (2025). </w:t>
       </w:r>
       <w:r>
         <w:rPr>
@@ -9746,13 +9943,27 @@
           <w:i/>
           <w:iCs/>
         </w:rPr>
-        <w:t>PLOS ONE</w:t>
-      </w:r>
-      <w:r>
-        <w:rPr>
-          <w:rFonts w:ascii="Times New Roman" w:hAnsi="Times New Roman" w:cs="Times New Roman"/>
-        </w:rPr>
-        <w:t xml:space="preserve">, </w:t>
+        <w:t>Advancing Provenance Assignment using Machine Learning and Time Series Analysis of Chemical Chronologies in Archival Tissues</w:t>
+      </w:r>
+      <w:r>
+        <w:rPr>
+          <w:rFonts w:ascii="Times New Roman" w:hAnsi="Times New Roman" w:cs="Times New Roman"/>
+        </w:rPr>
+        <w:t xml:space="preserve"> (p. 2025.08.19.671102). bioRxiv. https://doi.org/10.1101/2025.08.19.671102</w:t>
+      </w:r>
+    </w:p>
+    <w:p>
+      <w:pPr>
+        <w:pStyle w:val="Bibliography"/>
+        <w:rPr>
+          <w:rFonts w:ascii="Times New Roman" w:hAnsi="Times New Roman" w:cs="Times New Roman"/>
+        </w:rPr>
+      </w:pPr>
+      <w:r>
+        <w:rPr>
+          <w:rFonts w:ascii="Times New Roman" w:hAnsi="Times New Roman" w:cs="Times New Roman"/>
+        </w:rPr>
+        <w:t xml:space="preserve">Arai, K., Willmes, M., Johnson, R. C., &amp; Sturrock, A. M. (2026). Advancing provenance assignment using machine learning and time series analysis of chemical chronologies in archival tissues. </w:t>
       </w:r>
       <w:r>
         <w:rPr>
@@ -9760,27 +9971,13 @@
           <w:i/>
           <w:iCs/>
         </w:rPr>
-        <w:t>18</w:t>
-      </w:r>
-      <w:r>
-        <w:rPr>
-          <w:rFonts w:ascii="Times New Roman" w:hAnsi="Times New Roman" w:cs="Times New Roman"/>
-        </w:rPr>
-        <w:t>(5), e0285702. https://doi.org/10.1371/journal.pone.0285702</w:t>
-      </w:r>
-    </w:p>
-    <w:p>
-      <w:pPr>
-        <w:pStyle w:val="Bibliography"/>
-        <w:rPr>
-          <w:rFonts w:ascii="Times New Roman" w:hAnsi="Times New Roman" w:cs="Times New Roman"/>
-        </w:rPr>
-      </w:pPr>
-      <w:r>
-        <w:rPr>
-          <w:rFonts w:ascii="Times New Roman" w:hAnsi="Times New Roman" w:cs="Times New Roman"/>
-        </w:rPr>
-        <w:t xml:space="preserve">Arai, K., Willmes, M., Johnson, R. C., &amp; Sturrock, A. M. (2025). </w:t>
+        <w:t>Ecological Informatics</w:t>
+      </w:r>
+      <w:r>
+        <w:rPr>
+          <w:rFonts w:ascii="Times New Roman" w:hAnsi="Times New Roman" w:cs="Times New Roman"/>
+        </w:rPr>
+        <w:t xml:space="preserve">, </w:t>
       </w:r>
       <w:r>
         <w:rPr>
@@ -9788,27 +9985,13 @@
           <w:i/>
           <w:iCs/>
         </w:rPr>
-        <w:t>Advancing Provenance Assignment using Machine Learning and Time Series Analysis of Chemical Chronologies in Archival Tissues</w:t>
-      </w:r>
-      <w:r>
-        <w:rPr>
-          <w:rFonts w:ascii="Times New Roman" w:hAnsi="Times New Roman" w:cs="Times New Roman"/>
-        </w:rPr>
-        <w:t xml:space="preserve"> (p. 2025.08.19.671102). </w:t>
-      </w:r>
-      <w:proofErr w:type="spellStart"/>
-      <w:r>
-        <w:rPr>
-          <w:rFonts w:ascii="Times New Roman" w:hAnsi="Times New Roman" w:cs="Times New Roman"/>
-        </w:rPr>
-        <w:t>bioRxiv</w:t>
-      </w:r>
-      <w:proofErr w:type="spellEnd"/>
-      <w:r>
-        <w:rPr>
-          <w:rFonts w:ascii="Times New Roman" w:hAnsi="Times New Roman" w:cs="Times New Roman"/>
-        </w:rPr>
-        <w:t>. https://doi.org/10.1101/2025.08.19.671102</w:t>
+        <w:t>93</w:t>
+      </w:r>
+      <w:r>
+        <w:rPr>
+          <w:rFonts w:ascii="Times New Roman" w:hAnsi="Times New Roman" w:cs="Times New Roman"/>
+        </w:rPr>
+        <w:t>, 103604. https://doi.org/10.1016/j.ecoinf.2026.103604</w:t>
       </w:r>
     </w:p>
     <w:p>
@@ -9822,7 +10005,7 @@
         <w:rPr>
           <w:rFonts w:ascii="Times New Roman" w:hAnsi="Times New Roman" w:cs="Times New Roman"/>
         </w:rPr>
-        <w:t xml:space="preserve">Arai, K., Willmes, M., Johnson, R. C., &amp; Sturrock, A. M. (2026). Advancing provenance assignment using machine learning and time series analysis of chemical chronologies in archival tissues. </w:t>
+        <w:t xml:space="preserve">Bataille, C. P., &amp; Bowen, G. J. (2012). Mapping 87Sr/86Sr variations in bedrock and water for large scale provenance studies. </w:t>
       </w:r>
       <w:r>
         <w:rPr>
@@ -9830,7 +10013,7 @@
           <w:i/>
           <w:iCs/>
         </w:rPr>
-        <w:t>Ecological Informatics</w:t>
+        <w:t>Chemical Geology</w:t>
       </w:r>
       <w:r>
         <w:rPr>
@@ -9844,13 +10027,13 @@
           <w:i/>
           <w:iCs/>
         </w:rPr>
-        <w:t>93</w:t>
-      </w:r>
-      <w:r>
-        <w:rPr>
-          <w:rFonts w:ascii="Times New Roman" w:hAnsi="Times New Roman" w:cs="Times New Roman"/>
-        </w:rPr>
-        <w:t>, 103604. https://doi.org/10.1016/j.ecoinf.2026.103604</w:t>
+        <w:t>304–305</w:t>
+      </w:r>
+      <w:r>
+        <w:rPr>
+          <w:rFonts w:ascii="Times New Roman" w:hAnsi="Times New Roman" w:cs="Times New Roman"/>
+        </w:rPr>
+        <w:t>, 39–52. https://doi.org/10.1016/j.chemgeo.2012.01.028</w:t>
       </w:r>
     </w:p>
     <w:p>
@@ -9864,7 +10047,7 @@
         <w:rPr>
           <w:rFonts w:ascii="Times New Roman" w:hAnsi="Times New Roman" w:cs="Times New Roman"/>
         </w:rPr>
-        <w:t xml:space="preserve">Bataille, C. P., &amp; Bowen, G. J. (2012). Mapping 87Sr/86Sr variations in bedrock and water for large scale provenance studies. </w:t>
+        <w:t xml:space="preserve">Beacham, T. D., Lapointe, M., Candy, J. R., Miller, K. M., &amp; Withler, R. E. (2004). DNA in Action: Rapid Application of DNA Variation to Sockeye Salmon Fisheries Management. </w:t>
       </w:r>
       <w:r>
         <w:rPr>
@@ -9872,7 +10055,7 @@
           <w:i/>
           <w:iCs/>
         </w:rPr>
-        <w:t>Chemical Geology</w:t>
+        <w:t>Conservation Genetics</w:t>
       </w:r>
       <w:r>
         <w:rPr>
@@ -9886,13 +10069,13 @@
           <w:i/>
           <w:iCs/>
         </w:rPr>
-        <w:t>304–305</w:t>
-      </w:r>
-      <w:r>
-        <w:rPr>
-          <w:rFonts w:ascii="Times New Roman" w:hAnsi="Times New Roman" w:cs="Times New Roman"/>
-        </w:rPr>
-        <w:t>, 39–52. https://doi.org/10.1016/j.chemgeo.2012.01.028</w:t>
+        <w:t>5</w:t>
+      </w:r>
+      <w:r>
+        <w:rPr>
+          <w:rFonts w:ascii="Times New Roman" w:hAnsi="Times New Roman" w:cs="Times New Roman"/>
+        </w:rPr>
+        <w:t>(3), 411–416. https://doi.org/10.1023/B:COGE.0000031140.41379.73</w:t>
       </w:r>
     </w:p>
     <w:p>
@@ -9906,21 +10089,7 @@
         <w:rPr>
           <w:rFonts w:ascii="Times New Roman" w:hAnsi="Times New Roman" w:cs="Times New Roman"/>
         </w:rPr>
-        <w:t xml:space="preserve">Beacham, T. D., Lapointe, M., Candy, J. R., Miller, K. M., &amp; </w:t>
-      </w:r>
-      <w:proofErr w:type="spellStart"/>
-      <w:r>
-        <w:rPr>
-          <w:rFonts w:ascii="Times New Roman" w:hAnsi="Times New Roman" w:cs="Times New Roman"/>
-        </w:rPr>
-        <w:t>Withler</w:t>
-      </w:r>
-      <w:proofErr w:type="spellEnd"/>
-      <w:r>
-        <w:rPr>
-          <w:rFonts w:ascii="Times New Roman" w:hAnsi="Times New Roman" w:cs="Times New Roman"/>
-        </w:rPr>
-        <w:t xml:space="preserve">, R. E. (2004). DNA in Action: Rapid Application of DNA Variation to Sockeye Salmon Fisheries Management. </w:t>
+        <w:t xml:space="preserve">Brennan, S. R., Cline, T. J., &amp; Schindler, D. E. (2019). Quantifying habitat use of migratory fish across riverscapes using space-time isotope models. </w:t>
       </w:r>
       <w:r>
         <w:rPr>
@@ -9928,7 +10097,7 @@
           <w:i/>
           <w:iCs/>
         </w:rPr>
-        <w:t>Conservation Genetics</w:t>
+        <w:t>Methods in Ecology and Evolution</w:t>
       </w:r>
       <w:r>
         <w:rPr>
@@ -9942,13 +10111,13 @@
           <w:i/>
           <w:iCs/>
         </w:rPr>
-        <w:t>5</w:t>
-      </w:r>
-      <w:r>
-        <w:rPr>
-          <w:rFonts w:ascii="Times New Roman" w:hAnsi="Times New Roman" w:cs="Times New Roman"/>
-        </w:rPr>
-        <w:t>(3), 411–416. https://doi.org/10.1023/B:COGE.0000031140.41379.73</w:t>
+        <w:t>10</w:t>
+      </w:r>
+      <w:r>
+        <w:rPr>
+          <w:rFonts w:ascii="Times New Roman" w:hAnsi="Times New Roman" w:cs="Times New Roman"/>
+        </w:rPr>
+        <w:t>(7), 1036–1047. https://doi.org/10.1111/2041-210X.13191</w:t>
       </w:r>
     </w:p>
     <w:p>
@@ -9962,7 +10131,7 @@
         <w:rPr>
           <w:rFonts w:ascii="Times New Roman" w:hAnsi="Times New Roman" w:cs="Times New Roman"/>
         </w:rPr>
-        <w:t xml:space="preserve">Brennan, S. R., Cline, T. J., &amp; Schindler, D. E. (2019). Quantifying habitat use of migratory fish across riverscapes using space-time isotope models. </w:t>
+        <w:t xml:space="preserve">Brennan, S. R., &amp; Schindler, D. E. (2017). Linking otolith microchemistry and dendritic isoscapes to map heterogeneous production of fish across river basins. </w:t>
       </w:r>
       <w:r>
         <w:rPr>
@@ -9970,7 +10139,7 @@
           <w:i/>
           <w:iCs/>
         </w:rPr>
-        <w:t>Methods in Ecology and Evolution</w:t>
+        <w:t>Ecological Applications</w:t>
       </w:r>
       <w:r>
         <w:rPr>
@@ -9984,13 +10153,13 @@
           <w:i/>
           <w:iCs/>
         </w:rPr>
-        <w:t>10</w:t>
-      </w:r>
-      <w:r>
-        <w:rPr>
-          <w:rFonts w:ascii="Times New Roman" w:hAnsi="Times New Roman" w:cs="Times New Roman"/>
-        </w:rPr>
-        <w:t>(7), 1036–1047. https://doi.org/10.1111/2041-210X.13191</w:t>
+        <w:t>27</w:t>
+      </w:r>
+      <w:r>
+        <w:rPr>
+          <w:rFonts w:ascii="Times New Roman" w:hAnsi="Times New Roman" w:cs="Times New Roman"/>
+        </w:rPr>
+        <w:t>(2), 363–377. https://doi.org/10.1002/eap.1474</w:t>
       </w:r>
     </w:p>
     <w:p>
@@ -10004,21 +10173,8 @@
         <w:rPr>
           <w:rFonts w:ascii="Times New Roman" w:hAnsi="Times New Roman" w:cs="Times New Roman"/>
         </w:rPr>
-        <w:t xml:space="preserve">Brennan, S. R., &amp; Schindler, D. E. (2017). Linking otolith microchemistry and dendritic </w:t>
-      </w:r>
-      <w:proofErr w:type="spellStart"/>
-      <w:r>
-        <w:rPr>
-          <w:rFonts w:ascii="Times New Roman" w:hAnsi="Times New Roman" w:cs="Times New Roman"/>
-        </w:rPr>
-        <w:t>isoscapes</w:t>
-      </w:r>
-      <w:proofErr w:type="spellEnd"/>
-      <w:r>
-        <w:rPr>
-          <w:rFonts w:ascii="Times New Roman" w:hAnsi="Times New Roman" w:cs="Times New Roman"/>
-        </w:rPr>
-        <w:t xml:space="preserve"> to map heterogeneous production of fish across river basins. </w:t>
+        <w:lastRenderedPageBreak/>
+        <w:t xml:space="preserve">Brennan, S. R., Zimmerman, C. E., Fernandez, D. P., Cerling, T. E., McPhee, M. V., &amp; Wooller, M. J. (2015). Strontium isotopes delineate fine-scale natal origins and migration histories of Pacific salmon. </w:t>
       </w:r>
       <w:r>
         <w:rPr>
@@ -10026,7 +10182,7 @@
           <w:i/>
           <w:iCs/>
         </w:rPr>
-        <w:t>Ecological Applications</w:t>
+        <w:t>Science Advances</w:t>
       </w:r>
       <w:r>
         <w:rPr>
@@ -10040,13 +10196,13 @@
           <w:i/>
           <w:iCs/>
         </w:rPr>
-        <w:t>27</w:t>
-      </w:r>
-      <w:r>
-        <w:rPr>
-          <w:rFonts w:ascii="Times New Roman" w:hAnsi="Times New Roman" w:cs="Times New Roman"/>
-        </w:rPr>
-        <w:t>(2), 363–377. https://doi.org/10.1002/eap.1474</w:t>
+        <w:t>1</w:t>
+      </w:r>
+      <w:r>
+        <w:rPr>
+          <w:rFonts w:ascii="Times New Roman" w:hAnsi="Times New Roman" w:cs="Times New Roman"/>
+        </w:rPr>
+        <w:t>(4), e1400124. https://doi.org/10.1126/sciadv.1400124</w:t>
       </w:r>
     </w:p>
     <w:p>
@@ -10060,21 +10216,7 @@
         <w:rPr>
           <w:rFonts w:ascii="Times New Roman" w:hAnsi="Times New Roman" w:cs="Times New Roman"/>
         </w:rPr>
-        <w:t xml:space="preserve">Brennan, S. R., Zimmerman, C. E., Fernandez, D. P., </w:t>
-      </w:r>
-      <w:proofErr w:type="spellStart"/>
-      <w:r>
-        <w:rPr>
-          <w:rFonts w:ascii="Times New Roman" w:hAnsi="Times New Roman" w:cs="Times New Roman"/>
-        </w:rPr>
-        <w:t>Cerling</w:t>
-      </w:r>
-      <w:proofErr w:type="spellEnd"/>
-      <w:r>
-        <w:rPr>
-          <w:rFonts w:ascii="Times New Roman" w:hAnsi="Times New Roman" w:cs="Times New Roman"/>
-        </w:rPr>
-        <w:t xml:space="preserve">, T. E., McPhee, M. V., &amp; Wooller, M. J. (2015). Strontium isotopes delineate fine-scale natal origins and migration histories of Pacific salmon. </w:t>
+        <w:t xml:space="preserve">Campana, S. (1999). Chemistry and composition of fish otoliths:pathways, mechanisms and applications. </w:t>
       </w:r>
       <w:r>
         <w:rPr>
@@ -10082,7 +10224,7 @@
           <w:i/>
           <w:iCs/>
         </w:rPr>
-        <w:t>Science Advances</w:t>
+        <w:t>Marine Ecology Progress Series</w:t>
       </w:r>
       <w:r>
         <w:rPr>
@@ -10096,13 +10238,13 @@
           <w:i/>
           <w:iCs/>
         </w:rPr>
-        <w:t>1</w:t>
-      </w:r>
-      <w:r>
-        <w:rPr>
-          <w:rFonts w:ascii="Times New Roman" w:hAnsi="Times New Roman" w:cs="Times New Roman"/>
-        </w:rPr>
-        <w:t>(4), e1400124. https://doi.org/10.1126/sciadv.1400124</w:t>
+        <w:t>188</w:t>
+      </w:r>
+      <w:r>
+        <w:rPr>
+          <w:rFonts w:ascii="Times New Roman" w:hAnsi="Times New Roman" w:cs="Times New Roman"/>
+        </w:rPr>
+        <w:t>, 263–297. https://doi.org/10.3354/meps188263</w:t>
       </w:r>
     </w:p>
     <w:p>
@@ -10116,23 +10258,7 @@
         <w:rPr>
           <w:rFonts w:ascii="Times New Roman" w:hAnsi="Times New Roman" w:cs="Times New Roman"/>
         </w:rPr>
-        <w:t xml:space="preserve">Campana, S. (1999). Chemistry and composition of fish </w:t>
-      </w:r>
-      <w:proofErr w:type="spellStart"/>
-      <w:proofErr w:type="gramStart"/>
-      <w:r>
-        <w:rPr>
-          <w:rFonts w:ascii="Times New Roman" w:hAnsi="Times New Roman" w:cs="Times New Roman"/>
-        </w:rPr>
-        <w:t>otoliths:pathways</w:t>
-      </w:r>
-      <w:proofErr w:type="spellEnd"/>
-      <w:proofErr w:type="gramEnd"/>
-      <w:r>
-        <w:rPr>
-          <w:rFonts w:ascii="Times New Roman" w:hAnsi="Times New Roman" w:cs="Times New Roman"/>
-        </w:rPr>
-        <w:t xml:space="preserve">, mechanisms and applications. </w:t>
+        <w:t xml:space="preserve">Capo, R. C., Stewart, B. W., &amp; Chadwick, O. A. (1998). Strontium isotopes as tracers of ecosystem processes: Theory and methods. </w:t>
       </w:r>
       <w:r>
         <w:rPr>
@@ -10140,7 +10266,7 @@
           <w:i/>
           <w:iCs/>
         </w:rPr>
-        <w:t>Marine Ecology Progress Series</w:t>
+        <w:t>Geoderma</w:t>
       </w:r>
       <w:r>
         <w:rPr>
@@ -10154,13 +10280,13 @@
           <w:i/>
           <w:iCs/>
         </w:rPr>
-        <w:t>188</w:t>
-      </w:r>
-      <w:r>
-        <w:rPr>
-          <w:rFonts w:ascii="Times New Roman" w:hAnsi="Times New Roman" w:cs="Times New Roman"/>
-        </w:rPr>
-        <w:t>, 263–297. https://doi.org/10.3354/meps188263</w:t>
+        <w:t>82</w:t>
+      </w:r>
+      <w:r>
+        <w:rPr>
+          <w:rFonts w:ascii="Times New Roman" w:hAnsi="Times New Roman" w:cs="Times New Roman"/>
+        </w:rPr>
+        <w:t>(1), 197–225. https://doi.org/10.1016/S0016-7061(97)00102-X</w:t>
       </w:r>
     </w:p>
     <w:p>
@@ -10174,18 +10300,16 @@
         <w:rPr>
           <w:rFonts w:ascii="Times New Roman" w:hAnsi="Times New Roman" w:cs="Times New Roman"/>
         </w:rPr>
-        <w:t xml:space="preserve">Capo, R. C., Stewart, B. W., &amp; Chadwick, O. A. (1998). Strontium isotopes as tracers of ecosystem processes: Theory and methods. </w:t>
-      </w:r>
-      <w:proofErr w:type="spellStart"/>
+        <w:t xml:space="preserve">DeMaster, D., Alexander, E., Wiese, F. K., Baker, B., Froehlich, E., Harris, C., Schaeffer, J., Schoen, E., &amp; Shahbazi, A. H. (2025). Food security crisis in the Yukon River Basin: Where have the salmon gone and what can be done? </w:t>
+      </w:r>
       <w:r>
         <w:rPr>
           <w:rFonts w:ascii="Times New Roman" w:hAnsi="Times New Roman" w:cs="Times New Roman"/>
           <w:i/>
           <w:iCs/>
         </w:rPr>
-        <w:t>Geoderma</w:t>
-      </w:r>
-      <w:proofErr w:type="spellEnd"/>
+        <w:t>Arctic, Antarctic, and Alpine Research</w:t>
+      </w:r>
       <w:r>
         <w:rPr>
           <w:rFonts w:ascii="Times New Roman" w:hAnsi="Times New Roman" w:cs="Times New Roman"/>
@@ -10198,13 +10322,13 @@
           <w:i/>
           <w:iCs/>
         </w:rPr>
-        <w:t>82</w:t>
-      </w:r>
-      <w:r>
-        <w:rPr>
-          <w:rFonts w:ascii="Times New Roman" w:hAnsi="Times New Roman" w:cs="Times New Roman"/>
-        </w:rPr>
-        <w:t>(1), 197–225. https://doi.org/10.1016/S0016-7061(97)00102-X</w:t>
+        <w:t>57</w:t>
+      </w:r>
+      <w:r>
+        <w:rPr>
+          <w:rFonts w:ascii="Times New Roman" w:hAnsi="Times New Roman" w:cs="Times New Roman"/>
+        </w:rPr>
+        <w:t>(1), 2510793. https://doi.org/10.1080/15230430.2025.2510793</w:t>
       </w:r>
     </w:p>
     <w:p>
@@ -10218,14 +10342,7 @@
         <w:rPr>
           <w:rFonts w:ascii="Times New Roman" w:hAnsi="Times New Roman" w:cs="Times New Roman"/>
         </w:rPr>
-        <w:t xml:space="preserve">DeMaster, D., Alexander, E., Wiese, F. K., Baker, B., Froehlich, E., Harris, C., Schaeffer, J., Schoen, E., &amp; Shahbazi, A. H. (2025). Food security crisis in the Yukon River Basin: Where </w:t>
-      </w:r>
-      <w:r>
-        <w:rPr>
-          <w:rFonts w:ascii="Times New Roman" w:hAnsi="Times New Roman" w:cs="Times New Roman"/>
-        </w:rPr>
-        <w:lastRenderedPageBreak/>
-        <w:t xml:space="preserve">have the salmon gone and what can be done? </w:t>
+        <w:t xml:space="preserve">Donohoe, C. J., &amp; Zimmerman, C. E. (2010). A method of mounting multiple otoliths for beam-based microchemical analyses. </w:t>
       </w:r>
       <w:r>
         <w:rPr>
@@ -10233,7 +10350,7 @@
           <w:i/>
           <w:iCs/>
         </w:rPr>
-        <w:t>Arctic, Antarctic, and Alpine Research</w:t>
+        <w:t>Environmental Biology of Fishes</w:t>
       </w:r>
       <w:r>
         <w:rPr>
@@ -10247,13 +10364,13 @@
           <w:i/>
           <w:iCs/>
         </w:rPr>
-        <w:t>57</w:t>
-      </w:r>
-      <w:r>
-        <w:rPr>
-          <w:rFonts w:ascii="Times New Roman" w:hAnsi="Times New Roman" w:cs="Times New Roman"/>
-        </w:rPr>
-        <w:t>(1), 2510793. https://doi.org/10.1080/15230430.2025.2510793</w:t>
+        <w:t>89</w:t>
+      </w:r>
+      <w:r>
+        <w:rPr>
+          <w:rFonts w:ascii="Times New Roman" w:hAnsi="Times New Roman" w:cs="Times New Roman"/>
+        </w:rPr>
+        <w:t>(3), 473–477. https://doi.org/10.1007/s10641-010-9680-3</w:t>
       </w:r>
     </w:p>
     <w:p>
@@ -10267,7 +10384,7 @@
         <w:rPr>
           <w:rFonts w:ascii="Times New Roman" w:hAnsi="Times New Roman" w:cs="Times New Roman"/>
         </w:rPr>
-        <w:t xml:space="preserve">Donohoe, C. J., &amp; Zimmerman, C. E. (2010). A method of mounting multiple otoliths for beam-based microchemical analyses. </w:t>
+        <w:t xml:space="preserve">Dormann, C. F. (2020). Calibration of probability predictions from machine-learning and statistical models. </w:t>
       </w:r>
       <w:r>
         <w:rPr>
@@ -10275,7 +10392,7 @@
           <w:i/>
           <w:iCs/>
         </w:rPr>
-        <w:t>Environmental Biology of Fishes</w:t>
+        <w:t>Global Ecology and Biogeography</w:t>
       </w:r>
       <w:r>
         <w:rPr>
@@ -10289,13 +10406,13 @@
           <w:i/>
           <w:iCs/>
         </w:rPr>
-        <w:t>89</w:t>
-      </w:r>
-      <w:r>
-        <w:rPr>
-          <w:rFonts w:ascii="Times New Roman" w:hAnsi="Times New Roman" w:cs="Times New Roman"/>
-        </w:rPr>
-        <w:t>(3), 473–477. https://doi.org/10.1007/s10641-010-9680-3</w:t>
+        <w:t>29</w:t>
+      </w:r>
+      <w:r>
+        <w:rPr>
+          <w:rFonts w:ascii="Times New Roman" w:hAnsi="Times New Roman" w:cs="Times New Roman"/>
+        </w:rPr>
+        <w:t>(4), 760–765. https://doi.org/10.1111/geb.13070</w:t>
       </w:r>
     </w:p>
     <w:p>
@@ -10309,7 +10426,7 @@
         <w:rPr>
           <w:rFonts w:ascii="Times New Roman" w:hAnsi="Times New Roman" w:cs="Times New Roman"/>
         </w:rPr>
-        <w:t xml:space="preserve">Dormann, C. F. (2020). Calibration of probability predictions from machine-learning and statistical models. </w:t>
+        <w:t xml:space="preserve">Feddern, M. L., Schoen, E. R., Shaftel, R., Cunningham, C. J., Chythlook, C., Connors, B. M., Murdoch, A. D., von Biela, V. R., &amp; Woods, B. (2023). Kings of the North: Bridging Disciplines to Understand the Effects of Changing Climate on Chinook Salmon in the Arctic-Yukon-Kuskokwim Region. </w:t>
       </w:r>
       <w:r>
         <w:rPr>
@@ -10317,7 +10434,7 @@
           <w:i/>
           <w:iCs/>
         </w:rPr>
-        <w:t>Global Ecology and Biogeography</w:t>
+        <w:t>FISHERIES</w:t>
       </w:r>
       <w:r>
         <w:rPr>
@@ -10331,13 +10448,13 @@
           <w:i/>
           <w:iCs/>
         </w:rPr>
-        <w:t>29</w:t>
-      </w:r>
-      <w:r>
-        <w:rPr>
-          <w:rFonts w:ascii="Times New Roman" w:hAnsi="Times New Roman" w:cs="Times New Roman"/>
-        </w:rPr>
-        <w:t>(4), 760–765. https://doi.org/10.1111/geb.13070</w:t>
+        <w:t>48</w:t>
+      </w:r>
+      <w:r>
+        <w:rPr>
+          <w:rFonts w:ascii="Times New Roman" w:hAnsi="Times New Roman" w:cs="Times New Roman"/>
+        </w:rPr>
+        <w:t>(8), 331–343. https://doi.org/10.1002/fsh.10923</w:t>
       </w:r>
     </w:p>
     <w:p>
@@ -10351,35 +10468,7 @@
         <w:rPr>
           <w:rFonts w:ascii="Times New Roman" w:hAnsi="Times New Roman" w:cs="Times New Roman"/>
         </w:rPr>
-        <w:t xml:space="preserve">Feddern, M. L., Schoen, E. R., </w:t>
-      </w:r>
-      <w:proofErr w:type="spellStart"/>
-      <w:r>
-        <w:rPr>
-          <w:rFonts w:ascii="Times New Roman" w:hAnsi="Times New Roman" w:cs="Times New Roman"/>
-        </w:rPr>
-        <w:t>Shaftel</w:t>
-      </w:r>
-      <w:proofErr w:type="spellEnd"/>
-      <w:r>
-        <w:rPr>
-          <w:rFonts w:ascii="Times New Roman" w:hAnsi="Times New Roman" w:cs="Times New Roman"/>
-        </w:rPr>
-        <w:t xml:space="preserve">, R., Cunningham, C. J., </w:t>
-      </w:r>
-      <w:proofErr w:type="spellStart"/>
-      <w:r>
-        <w:rPr>
-          <w:rFonts w:ascii="Times New Roman" w:hAnsi="Times New Roman" w:cs="Times New Roman"/>
-        </w:rPr>
-        <w:t>Chythlook</w:t>
-      </w:r>
-      <w:proofErr w:type="spellEnd"/>
-      <w:r>
-        <w:rPr>
-          <w:rFonts w:ascii="Times New Roman" w:hAnsi="Times New Roman" w:cs="Times New Roman"/>
-        </w:rPr>
-        <w:t xml:space="preserve">, C., Connors, B. M., Murdoch, A. D., von Biela, V. R., &amp; Woods, B. (2023). Kings of the North: Bridging Disciplines to Understand the Effects of Changing Climate on Chinook Salmon in the Arctic-Yukon-Kuskokwim Region. </w:t>
+        <w:t xml:space="preserve">Hegg, J. C., &amp; Kennedy, B. P. (2021). Let’s do the time warp again: Non-linear time series matching as a tool for sequentially structured data in ecology. </w:t>
       </w:r>
       <w:r>
         <w:rPr>
@@ -10387,7 +10476,7 @@
           <w:i/>
           <w:iCs/>
         </w:rPr>
-        <w:t>FISHERIES</w:t>
+        <w:t>Ecosphere</w:t>
       </w:r>
       <w:r>
         <w:rPr>
@@ -10401,13 +10490,13 @@
           <w:i/>
           <w:iCs/>
         </w:rPr>
-        <w:t>48</w:t>
-      </w:r>
-      <w:r>
-        <w:rPr>
-          <w:rFonts w:ascii="Times New Roman" w:hAnsi="Times New Roman" w:cs="Times New Roman"/>
-        </w:rPr>
-        <w:t>(8), 331–343. https://doi.org/10.1002/fsh.10923</w:t>
+        <w:t>12</w:t>
+      </w:r>
+      <w:r>
+        <w:rPr>
+          <w:rFonts w:ascii="Times New Roman" w:hAnsi="Times New Roman" w:cs="Times New Roman"/>
+        </w:rPr>
+        <w:t>(9), e03742. https://doi.org/10.1002/ecs2.3742</w:t>
       </w:r>
     </w:p>
     <w:p>
@@ -10421,7 +10510,7 @@
         <w:rPr>
           <w:rFonts w:ascii="Times New Roman" w:hAnsi="Times New Roman" w:cs="Times New Roman"/>
         </w:rPr>
-        <w:t xml:space="preserve">Hegg, J. C., &amp; Kennedy, B. P. (2021). Let’s do the time warp again: Non-linear time series matching as a tool for sequentially structured data in ecology. </w:t>
+        <w:t xml:space="preserve">Hegg, J. C., Kennedy, B. P., &amp; Chittaro, P. (2019). What did you say about my mother? The complexities of maternally derived chemical signatures in otoliths. </w:t>
       </w:r>
       <w:r>
         <w:rPr>
@@ -10429,7 +10518,7 @@
           <w:i/>
           <w:iCs/>
         </w:rPr>
-        <w:t>Ecosphere</w:t>
+        <w:t>Canadian Journal of Fisheries and Aquatic Sciences</w:t>
       </w:r>
       <w:r>
         <w:rPr>
@@ -10443,13 +10532,13 @@
           <w:i/>
           <w:iCs/>
         </w:rPr>
-        <w:t>12</w:t>
-      </w:r>
-      <w:r>
-        <w:rPr>
-          <w:rFonts w:ascii="Times New Roman" w:hAnsi="Times New Roman" w:cs="Times New Roman"/>
-        </w:rPr>
-        <w:t>(9), e03742. https://doi.org/10.1002/ecs2.3742</w:t>
+        <w:t>76</w:t>
+      </w:r>
+      <w:r>
+        <w:rPr>
+          <w:rFonts w:ascii="Times New Roman" w:hAnsi="Times New Roman" w:cs="Times New Roman"/>
+        </w:rPr>
+        <w:t>(1), 81–94. https://doi.org/10.1139/cjfas-2017-0341</w:t>
       </w:r>
     </w:p>
     <w:p>
@@ -10463,21 +10552,7 @@
         <w:rPr>
           <w:rFonts w:ascii="Times New Roman" w:hAnsi="Times New Roman" w:cs="Times New Roman"/>
         </w:rPr>
-        <w:t xml:space="preserve">Hegg, J. C., Kennedy, B. P., &amp; </w:t>
-      </w:r>
-      <w:proofErr w:type="spellStart"/>
-      <w:r>
-        <w:rPr>
-          <w:rFonts w:ascii="Times New Roman" w:hAnsi="Times New Roman" w:cs="Times New Roman"/>
-        </w:rPr>
-        <w:t>Chittaro</w:t>
-      </w:r>
-      <w:proofErr w:type="spellEnd"/>
-      <w:r>
-        <w:rPr>
-          <w:rFonts w:ascii="Times New Roman" w:hAnsi="Times New Roman" w:cs="Times New Roman"/>
-        </w:rPr>
-        <w:t xml:space="preserve">, P. (2019). What did you say about my mother? The complexities of maternally derived chemical signatures in otoliths. </w:t>
+        <w:t xml:space="preserve">Hess, J. E., Whiteaker, J. M., Fryer, J. K., &amp; Narum, S. R. (2014). Monitoring Stock‐Specific Abundance, Run Timing, and Straying of Chinook Salmon in the Columbia River Using Genetic Stock Identification (GSI). </w:t>
       </w:r>
       <w:r>
         <w:rPr>
@@ -10485,7 +10560,7 @@
           <w:i/>
           <w:iCs/>
         </w:rPr>
-        <w:t>Canadian Journal of Fisheries and Aquatic Sciences</w:t>
+        <w:t>North American Journal of Fisheries Management</w:t>
       </w:r>
       <w:r>
         <w:rPr>
@@ -10499,13 +10574,13 @@
           <w:i/>
           <w:iCs/>
         </w:rPr>
-        <w:t>76</w:t>
-      </w:r>
-      <w:r>
-        <w:rPr>
-          <w:rFonts w:ascii="Times New Roman" w:hAnsi="Times New Roman" w:cs="Times New Roman"/>
-        </w:rPr>
-        <w:t>(1), 81–94. https://doi.org/10.1139/cjfas-2017-0341</w:t>
+        <w:t>34</w:t>
+      </w:r>
+      <w:r>
+        <w:rPr>
+          <w:rFonts w:ascii="Times New Roman" w:hAnsi="Times New Roman" w:cs="Times New Roman"/>
+        </w:rPr>
+        <w:t>(1), 184–201. https://doi.org/10.1080/02755947.2013.862192</w:t>
       </w:r>
     </w:p>
     <w:p>
@@ -10519,7 +10594,7 @@
         <w:rPr>
           <w:rFonts w:ascii="Times New Roman" w:hAnsi="Times New Roman" w:cs="Times New Roman"/>
         </w:rPr>
-        <w:t xml:space="preserve">Hess, J. E., Whiteaker, J. M., Fryer, J. K., &amp; Narum, S. R. (2014). Monitoring Stock‐Specific Abundance, Run Timing, and Straying of Chinook Salmon in the Columbia River Using Genetic Stock Identification (GSI). </w:t>
+        <w:t xml:space="preserve">Kennedy, B. P., Folt, C. L., Blum, J. D., &amp; Chamberlain, C. P. (1997). Natural isotope markers in salmon. </w:t>
       </w:r>
       <w:r>
         <w:rPr>
@@ -10527,7 +10602,7 @@
           <w:i/>
           <w:iCs/>
         </w:rPr>
-        <w:t>North American Journal of Fisheries Management</w:t>
+        <w:t>Nature</w:t>
       </w:r>
       <w:r>
         <w:rPr>
@@ -10541,13 +10616,13 @@
           <w:i/>
           <w:iCs/>
         </w:rPr>
-        <w:t>34</w:t>
-      </w:r>
-      <w:r>
-        <w:rPr>
-          <w:rFonts w:ascii="Times New Roman" w:hAnsi="Times New Roman" w:cs="Times New Roman"/>
-        </w:rPr>
-        <w:t>(1), 184–201. https://doi.org/10.1080/02755947.2013.862192</w:t>
+        <w:t>387</w:t>
+      </w:r>
+      <w:r>
+        <w:rPr>
+          <w:rFonts w:ascii="Times New Roman" w:hAnsi="Times New Roman" w:cs="Times New Roman"/>
+        </w:rPr>
+        <w:t>(6635), Article 6635. https://doi.org/10.1038/42835</w:t>
       </w:r>
     </w:p>
     <w:p>
@@ -10561,7 +10636,8 @@
         <w:rPr>
           <w:rFonts w:ascii="Times New Roman" w:hAnsi="Times New Roman" w:cs="Times New Roman"/>
         </w:rPr>
-        <w:t xml:space="preserve">Kennedy, B. P., Folt, C. L., Blum, J. D., &amp; Chamberlain, C. P. (1997). Natural isotope markers in salmon. </w:t>
+        <w:lastRenderedPageBreak/>
+        <w:t xml:space="preserve">Kuhn, M., Vaughn, D., &amp; Ruiz, E. (2025). </w:t>
       </w:r>
       <w:r>
         <w:rPr>
@@ -10569,13 +10645,27 @@
           <w:i/>
           <w:iCs/>
         </w:rPr>
-        <w:t>Nature</w:t>
-      </w:r>
-      <w:r>
-        <w:rPr>
-          <w:rFonts w:ascii="Times New Roman" w:hAnsi="Times New Roman" w:cs="Times New Roman"/>
-        </w:rPr>
-        <w:t xml:space="preserve">, </w:t>
+        <w:t>probably: Tools for Post-Processing Predicted Values</w:t>
+      </w:r>
+      <w:r>
+        <w:rPr>
+          <w:rFonts w:ascii="Times New Roman" w:hAnsi="Times New Roman" w:cs="Times New Roman"/>
+        </w:rPr>
+        <w:t xml:space="preserve"> [Computer software]. https://github.com/tidymodels/probably</w:t>
+      </w:r>
+    </w:p>
+    <w:p>
+      <w:pPr>
+        <w:pStyle w:val="Bibliography"/>
+        <w:rPr>
+          <w:rFonts w:ascii="Times New Roman" w:hAnsi="Times New Roman" w:cs="Times New Roman"/>
+        </w:rPr>
+      </w:pPr>
+      <w:r>
+        <w:rPr>
+          <w:rFonts w:ascii="Times New Roman" w:hAnsi="Times New Roman" w:cs="Times New Roman"/>
+        </w:rPr>
+        <w:t xml:space="preserve">Kuhn, M., &amp; Wickam, H. (2020). </w:t>
       </w:r>
       <w:r>
         <w:rPr>
@@ -10583,13 +10673,13 @@
           <w:i/>
           <w:iCs/>
         </w:rPr>
-        <w:t>387</w:t>
-      </w:r>
-      <w:r>
-        <w:rPr>
-          <w:rFonts w:ascii="Times New Roman" w:hAnsi="Times New Roman" w:cs="Times New Roman"/>
-        </w:rPr>
-        <w:t>(6635), Article 6635. https://doi.org/10.1038/42835</w:t>
+        <w:t>Tidymodels: A collection of packages for modeling and machine learning using tidyverse principles.</w:t>
+      </w:r>
+      <w:r>
+        <w:rPr>
+          <w:rFonts w:ascii="Times New Roman" w:hAnsi="Times New Roman" w:cs="Times New Roman"/>
+        </w:rPr>
+        <w:t xml:space="preserve"> [Computer software]. https://www.tidymodels.org</w:t>
       </w:r>
     </w:p>
     <w:p>
@@ -10603,7 +10693,7 @@
         <w:rPr>
           <w:rFonts w:ascii="Times New Roman" w:hAnsi="Times New Roman" w:cs="Times New Roman"/>
         </w:rPr>
-        <w:t xml:space="preserve">Kuhn, M., Vaughn, D., &amp; Ruiz, E. (2025). </w:t>
+        <w:t xml:space="preserve">Lamborn, C. C., Ohlberger, J., Walsworth, T. E., Westley, P. A. H., Cunningham, C. J., Wynsma, S., &amp; Smith, J. W. (2025). A Synthesis of Factors Related to Trends in Abundance and Demography of Alaska Chinook Salmon (Oncorhynchus tshawytscha, Salmonidae): Implications for Research, Management, and Policy. </w:t>
       </w:r>
       <w:r>
         <w:rPr>
@@ -10611,97 +10701,97 @@
           <w:i/>
           <w:iCs/>
         </w:rPr>
-        <w:t>probably: Tools for Post-Processing Predicted Values</w:t>
-      </w:r>
-      <w:r>
-        <w:rPr>
-          <w:rFonts w:ascii="Times New Roman" w:hAnsi="Times New Roman" w:cs="Times New Roman"/>
-        </w:rPr>
-        <w:t xml:space="preserve"> [Computer software]. https://github.com/tidymodels/probably</w:t>
-      </w:r>
-    </w:p>
-    <w:p>
-      <w:pPr>
-        <w:pStyle w:val="Bibliography"/>
-        <w:rPr>
-          <w:rFonts w:ascii="Times New Roman" w:hAnsi="Times New Roman" w:cs="Times New Roman"/>
-        </w:rPr>
-      </w:pPr>
-      <w:r>
-        <w:rPr>
-          <w:rFonts w:ascii="Times New Roman" w:hAnsi="Times New Roman" w:cs="Times New Roman"/>
-        </w:rPr>
-        <w:t xml:space="preserve">Kuhn, M., &amp; Wickam, H. (2020). </w:t>
-      </w:r>
-      <w:proofErr w:type="spellStart"/>
+        <w:t>Fish and Fisheries</w:t>
+      </w:r>
+      <w:r>
+        <w:rPr>
+          <w:rFonts w:ascii="Times New Roman" w:hAnsi="Times New Roman" w:cs="Times New Roman"/>
+        </w:rPr>
+        <w:t xml:space="preserve">, </w:t>
+      </w:r>
       <w:r>
         <w:rPr>
           <w:rFonts w:ascii="Times New Roman" w:hAnsi="Times New Roman" w:cs="Times New Roman"/>
           <w:i/>
           <w:iCs/>
         </w:rPr>
-        <w:t>Tidymodels</w:t>
-      </w:r>
-      <w:proofErr w:type="spellEnd"/>
+        <w:t>n/a</w:t>
+      </w:r>
+      <w:r>
+        <w:rPr>
+          <w:rFonts w:ascii="Times New Roman" w:hAnsi="Times New Roman" w:cs="Times New Roman"/>
+        </w:rPr>
+        <w:t>(n/a). https://doi.org/10.1111/faf.12895</w:t>
+      </w:r>
+    </w:p>
+    <w:p>
+      <w:pPr>
+        <w:pStyle w:val="Bibliography"/>
+        <w:rPr>
+          <w:rFonts w:ascii="Times New Roman" w:hAnsi="Times New Roman" w:cs="Times New Roman"/>
+        </w:rPr>
+      </w:pPr>
+      <w:r>
+        <w:rPr>
+          <w:rFonts w:ascii="Times New Roman" w:hAnsi="Times New Roman" w:cs="Times New Roman"/>
+        </w:rPr>
+        <w:t xml:space="preserve">Larson, W. A., Seeb, J. E., Pascal, C. E., Templin, W. D., &amp; Seeb, L. W. (2014). Single-nucleotide polymorphisms (SNPs) identified through genotyping-by-sequencing improve genetic stock identification of Chinook salmon (Oncorhynchus tshawytscha) from western Alaska. </w:t>
+      </w:r>
       <w:r>
         <w:rPr>
           <w:rFonts w:ascii="Times New Roman" w:hAnsi="Times New Roman" w:cs="Times New Roman"/>
           <w:i/>
           <w:iCs/>
         </w:rPr>
-        <w:t xml:space="preserve">: A collection of packages for modeling and machine learning using </w:t>
-      </w:r>
-      <w:proofErr w:type="spellStart"/>
+        <w:t>Canadian Journal of Fisheries and Aquatic Sciences</w:t>
+      </w:r>
+      <w:r>
+        <w:rPr>
+          <w:rFonts w:ascii="Times New Roman" w:hAnsi="Times New Roman" w:cs="Times New Roman"/>
+        </w:rPr>
+        <w:t xml:space="preserve">, </w:t>
+      </w:r>
       <w:r>
         <w:rPr>
           <w:rFonts w:ascii="Times New Roman" w:hAnsi="Times New Roman" w:cs="Times New Roman"/>
           <w:i/>
           <w:iCs/>
         </w:rPr>
-        <w:t>tidyverse</w:t>
-      </w:r>
-      <w:proofErr w:type="spellEnd"/>
+        <w:t>71</w:t>
+      </w:r>
+      <w:r>
+        <w:rPr>
+          <w:rFonts w:ascii="Times New Roman" w:hAnsi="Times New Roman" w:cs="Times New Roman"/>
+        </w:rPr>
+        <w:t>(5), 698–708. https://doi.org/10.1139/cjfas-2013-0502</w:t>
+      </w:r>
+    </w:p>
+    <w:p>
+      <w:pPr>
+        <w:pStyle w:val="Bibliography"/>
+        <w:rPr>
+          <w:rFonts w:ascii="Times New Roman" w:hAnsi="Times New Roman" w:cs="Times New Roman"/>
+        </w:rPr>
+      </w:pPr>
+      <w:r>
+        <w:rPr>
+          <w:rFonts w:ascii="Times New Roman" w:hAnsi="Times New Roman" w:cs="Times New Roman"/>
+        </w:rPr>
+        <w:t xml:space="preserve">Makhlouf, B., Cline, T. J., Fernandez, D., Seeb, L., Lee, E., Gilk-Baumer, S., Whited, D., Zimmerman, C. E., &amp; Schindler, D. E. (2025). Combining genetic and isotope frameworks improves reconstruction of fish provenance across riverscapes. </w:t>
+      </w:r>
       <w:r>
         <w:rPr>
           <w:rFonts w:ascii="Times New Roman" w:hAnsi="Times New Roman" w:cs="Times New Roman"/>
           <w:i/>
           <w:iCs/>
         </w:rPr>
-        <w:t xml:space="preserve"> principles.</w:t>
-      </w:r>
-      <w:r>
-        <w:rPr>
-          <w:rFonts w:ascii="Times New Roman" w:hAnsi="Times New Roman" w:cs="Times New Roman"/>
-        </w:rPr>
-        <w:t xml:space="preserve"> [Computer software]. https://www.tidymodels.org</w:t>
-      </w:r>
-    </w:p>
-    <w:p>
-      <w:pPr>
-        <w:pStyle w:val="Bibliography"/>
-        <w:rPr>
-          <w:rFonts w:ascii="Times New Roman" w:hAnsi="Times New Roman" w:cs="Times New Roman"/>
-        </w:rPr>
-      </w:pPr>
-      <w:r>
-        <w:rPr>
-          <w:rFonts w:ascii="Times New Roman" w:hAnsi="Times New Roman" w:cs="Times New Roman"/>
-        </w:rPr>
-        <w:t xml:space="preserve">Lamborn, C. C., </w:t>
-      </w:r>
-      <w:proofErr w:type="spellStart"/>
-      <w:r>
-        <w:rPr>
-          <w:rFonts w:ascii="Times New Roman" w:hAnsi="Times New Roman" w:cs="Times New Roman"/>
-        </w:rPr>
-        <w:t>Ohlberger</w:t>
-      </w:r>
-      <w:proofErr w:type="spellEnd"/>
-      <w:r>
-        <w:rPr>
-          <w:rFonts w:ascii="Times New Roman" w:hAnsi="Times New Roman" w:cs="Times New Roman"/>
-        </w:rPr>
-        <w:t xml:space="preserve">, J., Walsworth, T. E., Westley, P. A. H., Cunningham, C. J., Wynsma, S., &amp; Smith, J. W. (2025). A Synthesis of Factors Related to Trends in Abundance and Demography of Alaska Chinook Salmon (Oncorhynchus tshawytscha, Salmonidae): Implications for Research, Management, and Policy. </w:t>
+        <w:t>Limnology and Oceanography Letters</w:t>
+      </w:r>
+      <w:r>
+        <w:rPr>
+          <w:rFonts w:ascii="Times New Roman" w:hAnsi="Times New Roman" w:cs="Times New Roman"/>
+        </w:rPr>
+        <w:t xml:space="preserve">, </w:t>
       </w:r>
       <w:r>
         <w:rPr>
@@ -10709,13 +10799,27 @@
           <w:i/>
           <w:iCs/>
         </w:rPr>
-        <w:t>Fish and Fisheries</w:t>
-      </w:r>
-      <w:r>
-        <w:rPr>
-          <w:rFonts w:ascii="Times New Roman" w:hAnsi="Times New Roman" w:cs="Times New Roman"/>
-        </w:rPr>
-        <w:t xml:space="preserve">, </w:t>
+        <w:t>n/a</w:t>
+      </w:r>
+      <w:r>
+        <w:rPr>
+          <w:rFonts w:ascii="Times New Roman" w:hAnsi="Times New Roman" w:cs="Times New Roman"/>
+        </w:rPr>
+        <w:t>(n/a). https://doi.org/10.1002/lol2.70025</w:t>
+      </w:r>
+    </w:p>
+    <w:p>
+      <w:pPr>
+        <w:pStyle w:val="Bibliography"/>
+        <w:rPr>
+          <w:rFonts w:ascii="Times New Roman" w:hAnsi="Times New Roman" w:cs="Times New Roman"/>
+        </w:rPr>
+      </w:pPr>
+      <w:r>
+        <w:rPr>
+          <w:rFonts w:ascii="Times New Roman" w:hAnsi="Times New Roman" w:cs="Times New Roman"/>
+        </w:rPr>
+        <w:t xml:space="preserve">Mercier, L., Darnaude, A. M., Bruguier, O., Vasconcelos, R. P., Cabral, H. N., Costa, M. J., Lara, M., Jones, D. L., &amp; Mouillot, D. (2011). Selecting statistical models and variable combinations for optimal classification using otolith microchemistry. </w:t>
       </w:r>
       <w:r>
         <w:rPr>
@@ -10723,34 +10827,13 @@
           <w:i/>
           <w:iCs/>
         </w:rPr>
-        <w:t>n/a</w:t>
-      </w:r>
-      <w:r>
-        <w:rPr>
-          <w:rFonts w:ascii="Times New Roman" w:hAnsi="Times New Roman" w:cs="Times New Roman"/>
-        </w:rPr>
-        <w:t>(n/a). https://doi.org/10.1111/faf.12895</w:t>
-      </w:r>
-    </w:p>
-    <w:p>
-      <w:pPr>
-        <w:pStyle w:val="Bibliography"/>
-        <w:rPr>
-          <w:rFonts w:ascii="Times New Roman" w:hAnsi="Times New Roman" w:cs="Times New Roman"/>
-        </w:rPr>
-      </w:pPr>
-      <w:r>
-        <w:rPr>
-          <w:rFonts w:ascii="Times New Roman" w:hAnsi="Times New Roman" w:cs="Times New Roman"/>
-        </w:rPr>
-        <w:t xml:space="preserve">Larson, W. A., Seeb, J. E., Pascal, C. E., Templin, W. D., &amp; Seeb, L. W. (2014). Single-nucleotide polymorphisms (SNPs) identified through genotyping-by-sequencing improve genetic </w:t>
-      </w:r>
-      <w:r>
-        <w:rPr>
-          <w:rFonts w:ascii="Times New Roman" w:hAnsi="Times New Roman" w:cs="Times New Roman"/>
-        </w:rPr>
-        <w:lastRenderedPageBreak/>
-        <w:t xml:space="preserve">stock identification of Chinook salmon (Oncorhynchus tshawytscha) from western Alaska. </w:t>
+        <w:t>Ecological Applications</w:t>
+      </w:r>
+      <w:r>
+        <w:rPr>
+          <w:rFonts w:ascii="Times New Roman" w:hAnsi="Times New Roman" w:cs="Times New Roman"/>
+        </w:rPr>
+        <w:t xml:space="preserve">, </w:t>
       </w:r>
       <w:r>
         <w:rPr>
@@ -10758,13 +10841,27 @@
           <w:i/>
           <w:iCs/>
         </w:rPr>
-        <w:t>Canadian Journal of Fisheries and Aquatic Sciences</w:t>
-      </w:r>
-      <w:r>
-        <w:rPr>
-          <w:rFonts w:ascii="Times New Roman" w:hAnsi="Times New Roman" w:cs="Times New Roman"/>
-        </w:rPr>
-        <w:t xml:space="preserve">, </w:t>
+        <w:t>21</w:t>
+      </w:r>
+      <w:r>
+        <w:rPr>
+          <w:rFonts w:ascii="Times New Roman" w:hAnsi="Times New Roman" w:cs="Times New Roman"/>
+        </w:rPr>
+        <w:t>(4), 1352–1364. https://doi.org/10.1890/09-1887.1</w:t>
+      </w:r>
+    </w:p>
+    <w:p>
+      <w:pPr>
+        <w:pStyle w:val="Bibliography"/>
+        <w:rPr>
+          <w:rFonts w:ascii="Times New Roman" w:hAnsi="Times New Roman" w:cs="Times New Roman"/>
+        </w:rPr>
+      </w:pPr>
+      <w:r>
+        <w:rPr>
+          <w:rFonts w:ascii="Times New Roman" w:hAnsi="Times New Roman" w:cs="Times New Roman"/>
+        </w:rPr>
+        <w:t xml:space="preserve">Ohlberger, J., Ward, E. J., Schindler, D. E., &amp; Lewis, B. (2018). Demographic changes in Chinook salmon across the Northeast Pacific Ocean. </w:t>
       </w:r>
       <w:r>
         <w:rPr>
@@ -10772,41 +10869,13 @@
           <w:i/>
           <w:iCs/>
         </w:rPr>
-        <w:t>71</w:t>
-      </w:r>
-      <w:r>
-        <w:rPr>
-          <w:rFonts w:ascii="Times New Roman" w:hAnsi="Times New Roman" w:cs="Times New Roman"/>
-        </w:rPr>
-        <w:t>(5), 698–708. https://doi.org/10.1139/cjfas-2013-0502</w:t>
-      </w:r>
-    </w:p>
-    <w:p>
-      <w:pPr>
-        <w:pStyle w:val="Bibliography"/>
-        <w:rPr>
-          <w:rFonts w:ascii="Times New Roman" w:hAnsi="Times New Roman" w:cs="Times New Roman"/>
-        </w:rPr>
-      </w:pPr>
-      <w:r>
-        <w:rPr>
-          <w:rFonts w:ascii="Times New Roman" w:hAnsi="Times New Roman" w:cs="Times New Roman"/>
-        </w:rPr>
-        <w:t>Makhlouf, B., Cline, T. J., Fernandez, D., Seeb, L., Lee, E., Gilk-</w:t>
-      </w:r>
-      <w:proofErr w:type="spellStart"/>
-      <w:r>
-        <w:rPr>
-          <w:rFonts w:ascii="Times New Roman" w:hAnsi="Times New Roman" w:cs="Times New Roman"/>
-        </w:rPr>
-        <w:t>Baumer</w:t>
-      </w:r>
-      <w:proofErr w:type="spellEnd"/>
-      <w:r>
-        <w:rPr>
-          <w:rFonts w:ascii="Times New Roman" w:hAnsi="Times New Roman" w:cs="Times New Roman"/>
-        </w:rPr>
-        <w:t xml:space="preserve">, S., Whited, D., Zimmerman, C. E., &amp; Schindler, D. E. (2025). Combining genetic and isotope frameworks improves reconstruction of fish provenance across riverscapes. </w:t>
+        <w:t>Fish and Fisheries</w:t>
+      </w:r>
+      <w:r>
+        <w:rPr>
+          <w:rFonts w:ascii="Times New Roman" w:hAnsi="Times New Roman" w:cs="Times New Roman"/>
+        </w:rPr>
+        <w:t xml:space="preserve">, </w:t>
       </w:r>
       <w:r>
         <w:rPr>
@@ -10814,13 +10883,27 @@
           <w:i/>
           <w:iCs/>
         </w:rPr>
-        <w:t>Limnology and Oceanography Letters</w:t>
-      </w:r>
-      <w:r>
-        <w:rPr>
-          <w:rFonts w:ascii="Times New Roman" w:hAnsi="Times New Roman" w:cs="Times New Roman"/>
-        </w:rPr>
-        <w:t xml:space="preserve">, </w:t>
+        <w:t>19</w:t>
+      </w:r>
+      <w:r>
+        <w:rPr>
+          <w:rFonts w:ascii="Times New Roman" w:hAnsi="Times New Roman" w:cs="Times New Roman"/>
+        </w:rPr>
+        <w:t>(3), 533–546. https://doi.org/10.1111/faf.12272</w:t>
+      </w:r>
+    </w:p>
+    <w:p>
+      <w:pPr>
+        <w:pStyle w:val="Bibliography"/>
+        <w:rPr>
+          <w:rFonts w:ascii="Times New Roman" w:hAnsi="Times New Roman" w:cs="Times New Roman"/>
+        </w:rPr>
+      </w:pPr>
+      <w:r>
+        <w:rPr>
+          <w:rFonts w:ascii="Times New Roman" w:hAnsi="Times New Roman" w:cs="Times New Roman"/>
+        </w:rPr>
+        <w:t xml:space="preserve">Reis-Santos, P., Gillanders, B. M., Sturrock, A. M., Izzo, C., Oxman, D. S., Lueders-Dumont, J. A., Hüssy, K., Tanner, S. E., Rogers, T., Doubleday, Z. A., Andrews, A. H., Trueman, C., Brophy, D., Thiem, J. D., Baumgartner, L. J., Willmes, M., Chung, M.-T., Charapata, P., Johnson, R. C., … Walther, B. D. (2022). Reading the biomineralized book of life: Expanding otolith biogeochemical research and applications for fisheries and ecosystem-based management. </w:t>
       </w:r>
       <w:r>
         <w:rPr>
@@ -10828,13 +10911,13 @@
           <w:i/>
           <w:iCs/>
         </w:rPr>
-        <w:t>n/a</w:t>
-      </w:r>
-      <w:r>
-        <w:rPr>
-          <w:rFonts w:ascii="Times New Roman" w:hAnsi="Times New Roman" w:cs="Times New Roman"/>
-        </w:rPr>
-        <w:t>(n/a). https://doi.org/10.1002/lol2.70025</w:t>
+        <w:t>Reviews in Fish Biology and Fisheries</w:t>
+      </w:r>
+      <w:r>
+        <w:rPr>
+          <w:rFonts w:ascii="Times New Roman" w:hAnsi="Times New Roman" w:cs="Times New Roman"/>
+        </w:rPr>
+        <w:t>. https://doi.org/10.1007/s11160-022-09720-z</w:t>
       </w:r>
     </w:p>
     <w:p>
@@ -10848,35 +10931,7 @@
         <w:rPr>
           <w:rFonts w:ascii="Times New Roman" w:hAnsi="Times New Roman" w:cs="Times New Roman"/>
         </w:rPr>
-        <w:t xml:space="preserve">Mercier, L., </w:t>
-      </w:r>
-      <w:proofErr w:type="spellStart"/>
-      <w:r>
-        <w:rPr>
-          <w:rFonts w:ascii="Times New Roman" w:hAnsi="Times New Roman" w:cs="Times New Roman"/>
-        </w:rPr>
-        <w:t>Darnaude</w:t>
-      </w:r>
-      <w:proofErr w:type="spellEnd"/>
-      <w:r>
-        <w:rPr>
-          <w:rFonts w:ascii="Times New Roman" w:hAnsi="Times New Roman" w:cs="Times New Roman"/>
-        </w:rPr>
-        <w:t xml:space="preserve">, A. M., Bruguier, O., Vasconcelos, R. P., Cabral, H. N., Costa, M. J., Lara, M., Jones, D. L., &amp; </w:t>
-      </w:r>
-      <w:proofErr w:type="spellStart"/>
-      <w:r>
-        <w:rPr>
-          <w:rFonts w:ascii="Times New Roman" w:hAnsi="Times New Roman" w:cs="Times New Roman"/>
-        </w:rPr>
-        <w:t>Mouillot</w:t>
-      </w:r>
-      <w:proofErr w:type="spellEnd"/>
-      <w:r>
-        <w:rPr>
-          <w:rFonts w:ascii="Times New Roman" w:hAnsi="Times New Roman" w:cs="Times New Roman"/>
-        </w:rPr>
-        <w:t xml:space="preserve">, D. (2011). Selecting statistical models and variable combinations for optimal classification using otolith microchemistry. </w:t>
+        <w:t xml:space="preserve">Schindler, D. E., Krueger, C., Bisson, P., Bradford, M. J., Clark, B., Conitz, J., Howard, K., Jones, M., Murphy, J., Myers, K. W., Scheuerell, M., Volk, E. C., &amp; Winton, J. (2013). </w:t>
       </w:r>
       <w:r>
         <w:rPr>
@@ -10884,13 +10939,28 @@
           <w:i/>
           <w:iCs/>
         </w:rPr>
-        <w:t>Ecological Applications</w:t>
-      </w:r>
-      <w:r>
-        <w:rPr>
-          <w:rFonts w:ascii="Times New Roman" w:hAnsi="Times New Roman" w:cs="Times New Roman"/>
-        </w:rPr>
-        <w:t xml:space="preserve">, </w:t>
+        <w:t>Arctic-Yukon-Kuskokwim Chinook Salmon Research Action Plan: Evidence of Decline of Chinook Salmon Populations and Recommendations for Future Research. Prepared for the AYK Sustainable Salmon Initiative</w:t>
+      </w:r>
+      <w:r>
+        <w:rPr>
+          <w:rFonts w:ascii="Times New Roman" w:hAnsi="Times New Roman" w:cs="Times New Roman"/>
+        </w:rPr>
+        <w:t>.</w:t>
+      </w:r>
+    </w:p>
+    <w:p>
+      <w:pPr>
+        <w:pStyle w:val="Bibliography"/>
+        <w:rPr>
+          <w:rFonts w:ascii="Times New Roman" w:hAnsi="Times New Roman" w:cs="Times New Roman"/>
+        </w:rPr>
+      </w:pPr>
+      <w:r>
+        <w:rPr>
+          <w:rFonts w:ascii="Times New Roman" w:hAnsi="Times New Roman" w:cs="Times New Roman"/>
+        </w:rPr>
+        <w:lastRenderedPageBreak/>
+        <w:t xml:space="preserve">Silva Filho, T., Song, H., Perello-Nieto, M., Santos-Rodriguez, R., Kull, M., &amp; Flach, P. (2023). Classifier calibration: A survey on how to assess and improve predicted class probabilities. </w:t>
       </w:r>
       <w:r>
         <w:rPr>
@@ -10898,35 +10968,13 @@
           <w:i/>
           <w:iCs/>
         </w:rPr>
-        <w:t>21</w:t>
-      </w:r>
-      <w:r>
-        <w:rPr>
-          <w:rFonts w:ascii="Times New Roman" w:hAnsi="Times New Roman" w:cs="Times New Roman"/>
-        </w:rPr>
-        <w:t>(4), 1352–1364. https://doi.org/10.1890/09-1887.1</w:t>
-      </w:r>
-    </w:p>
-    <w:p>
-      <w:pPr>
-        <w:pStyle w:val="Bibliography"/>
-        <w:rPr>
-          <w:rFonts w:ascii="Times New Roman" w:hAnsi="Times New Roman" w:cs="Times New Roman"/>
-        </w:rPr>
-      </w:pPr>
-      <w:proofErr w:type="spellStart"/>
-      <w:r>
-        <w:rPr>
-          <w:rFonts w:ascii="Times New Roman" w:hAnsi="Times New Roman" w:cs="Times New Roman"/>
-        </w:rPr>
-        <w:t>Ohlberger</w:t>
-      </w:r>
-      <w:proofErr w:type="spellEnd"/>
-      <w:r>
-        <w:rPr>
-          <w:rFonts w:ascii="Times New Roman" w:hAnsi="Times New Roman" w:cs="Times New Roman"/>
-        </w:rPr>
-        <w:t xml:space="preserve">, J., Ward, E. J., Schindler, D. E., &amp; Lewis, B. (2018). Demographic changes in Chinook salmon across the Northeast Pacific Ocean. </w:t>
+        <w:t>Machine Learning</w:t>
+      </w:r>
+      <w:r>
+        <w:rPr>
+          <w:rFonts w:ascii="Times New Roman" w:hAnsi="Times New Roman" w:cs="Times New Roman"/>
+        </w:rPr>
+        <w:t xml:space="preserve">, </w:t>
       </w:r>
       <w:r>
         <w:rPr>
@@ -10934,13 +10982,27 @@
           <w:i/>
           <w:iCs/>
         </w:rPr>
-        <w:t>Fish and Fisheries</w:t>
-      </w:r>
-      <w:r>
-        <w:rPr>
-          <w:rFonts w:ascii="Times New Roman" w:hAnsi="Times New Roman" w:cs="Times New Roman"/>
-        </w:rPr>
-        <w:t xml:space="preserve">, </w:t>
+        <w:t>112</w:t>
+      </w:r>
+      <w:r>
+        <w:rPr>
+          <w:rFonts w:ascii="Times New Roman" w:hAnsi="Times New Roman" w:cs="Times New Roman"/>
+        </w:rPr>
+        <w:t>(9), 3211–3260. https://doi.org/10.1007/s10994-023-06336-7</w:t>
+      </w:r>
+    </w:p>
+    <w:p>
+      <w:pPr>
+        <w:pStyle w:val="Bibliography"/>
+        <w:rPr>
+          <w:rFonts w:ascii="Times New Roman" w:hAnsi="Times New Roman" w:cs="Times New Roman"/>
+        </w:rPr>
+      </w:pPr>
+      <w:r>
+        <w:rPr>
+          <w:rFonts w:ascii="Times New Roman" w:hAnsi="Times New Roman" w:cs="Times New Roman"/>
+        </w:rPr>
+        <w:t xml:space="preserve">Templin, W. D., Seeb, J. E., Jasper, J. R., Barclay, A. W., &amp; Seeb, L. W. (2011). Genetic differentiation of Alaska Chinook salmon: The missing link for migratory studies. </w:t>
       </w:r>
       <w:r>
         <w:rPr>
@@ -10948,41 +11010,13 @@
           <w:i/>
           <w:iCs/>
         </w:rPr>
-        <w:t>19</w:t>
-      </w:r>
-      <w:r>
-        <w:rPr>
-          <w:rFonts w:ascii="Times New Roman" w:hAnsi="Times New Roman" w:cs="Times New Roman"/>
-        </w:rPr>
-        <w:t>(3), 533–546. https://doi.org/10.1111/faf.12272</w:t>
-      </w:r>
-    </w:p>
-    <w:p>
-      <w:pPr>
-        <w:pStyle w:val="Bibliography"/>
-        <w:rPr>
-          <w:rFonts w:ascii="Times New Roman" w:hAnsi="Times New Roman" w:cs="Times New Roman"/>
-        </w:rPr>
-      </w:pPr>
-      <w:r>
-        <w:rPr>
-          <w:rFonts w:ascii="Times New Roman" w:hAnsi="Times New Roman" w:cs="Times New Roman"/>
-        </w:rPr>
-        <w:t xml:space="preserve">Reis-Santos, P., Gillanders, B. M., Sturrock, A. M., Izzo, C., Oxman, D. S., Lueders-Dumont, J. A., </w:t>
-      </w:r>
-      <w:proofErr w:type="spellStart"/>
-      <w:r>
-        <w:rPr>
-          <w:rFonts w:ascii="Times New Roman" w:hAnsi="Times New Roman" w:cs="Times New Roman"/>
-        </w:rPr>
-        <w:t>Hüssy</w:t>
-      </w:r>
-      <w:proofErr w:type="spellEnd"/>
-      <w:r>
-        <w:rPr>
-          <w:rFonts w:ascii="Times New Roman" w:hAnsi="Times New Roman" w:cs="Times New Roman"/>
-        </w:rPr>
-        <w:t xml:space="preserve">, K., Tanner, S. E., Rogers, T., Doubleday, Z. A., Andrews, A. H., Trueman, C., Brophy, D., Thiem, J. D., Baumgartner, L. J., Willmes, M., Chung, M.-T., Charapata, P., Johnson, R. C., … Walther, B. D. (2022). Reading the biomineralized book of life: Expanding otolith biogeochemical research and applications for fisheries and ecosystem-based management. </w:t>
+        <w:t>Molecular Ecology Resources</w:t>
+      </w:r>
+      <w:r>
+        <w:rPr>
+          <w:rFonts w:ascii="Times New Roman" w:hAnsi="Times New Roman" w:cs="Times New Roman"/>
+        </w:rPr>
+        <w:t xml:space="preserve">, </w:t>
       </w:r>
       <w:r>
         <w:rPr>
@@ -10990,13 +11024,13 @@
           <w:i/>
           <w:iCs/>
         </w:rPr>
-        <w:t>Reviews in Fish Biology and Fisheries</w:t>
-      </w:r>
-      <w:r>
-        <w:rPr>
-          <w:rFonts w:ascii="Times New Roman" w:hAnsi="Times New Roman" w:cs="Times New Roman"/>
-        </w:rPr>
-        <w:t>. https://doi.org/10.1007/s11160-022-09720-z</w:t>
+        <w:t>11</w:t>
+      </w:r>
+      <w:r>
+        <w:rPr>
+          <w:rFonts w:ascii="Times New Roman" w:hAnsi="Times New Roman" w:cs="Times New Roman"/>
+        </w:rPr>
+        <w:t>(s1), 226–246. https://doi.org/10.1111/j.1755-0998.2010.02968.x</w:t>
       </w:r>
     </w:p>
     <w:p>
@@ -11010,21 +11044,7 @@
         <w:rPr>
           <w:rFonts w:ascii="Times New Roman" w:hAnsi="Times New Roman" w:cs="Times New Roman"/>
         </w:rPr>
-        <w:t xml:space="preserve">Schindler, D. E., Krueger, C., Bisson, P., Bradford, M. J., Clark, B., </w:t>
-      </w:r>
-      <w:proofErr w:type="spellStart"/>
-      <w:r>
-        <w:rPr>
-          <w:rFonts w:ascii="Times New Roman" w:hAnsi="Times New Roman" w:cs="Times New Roman"/>
-        </w:rPr>
-        <w:t>Conitz</w:t>
-      </w:r>
-      <w:proofErr w:type="spellEnd"/>
-      <w:r>
-        <w:rPr>
-          <w:rFonts w:ascii="Times New Roman" w:hAnsi="Times New Roman" w:cs="Times New Roman"/>
-        </w:rPr>
-        <w:t xml:space="preserve">, J., Howard, K., Jones, M., Murphy, J., Myers, K. W., Scheuerell, M., Volk, E. C., &amp; Winton, J. (2013). </w:t>
+        <w:t xml:space="preserve">Van Doornik, D. M., Moran, P., Rondeau, E. B., Nichols, K. M., Narum, S. R., Campbell, M. R., Clemento, A. J., Hargrove, J. S., Hess, J. E., Horn, R. L., Seeb, L. W., Stephenson, J. J., &amp; McKinney, G. J. (2024). A new, standardized international Pacific Rim baseline for genetic stock identification (GSI) of Chinook Salmon. </w:t>
       </w:r>
       <w:r>
         <w:rPr>
@@ -11032,27 +11052,13 @@
           <w:i/>
           <w:iCs/>
         </w:rPr>
-        <w:t>Arctic-Yukon-Kuskokwim Chinook Salmon Research Action Plan: Evidence of Decline of Chinook Salmon Populations and Recommendations for Future Research. Prepared for the AYK Sustainable Salmon Initiative</w:t>
-      </w:r>
-      <w:r>
-        <w:rPr>
-          <w:rFonts w:ascii="Times New Roman" w:hAnsi="Times New Roman" w:cs="Times New Roman"/>
-        </w:rPr>
-        <w:t>.</w:t>
-      </w:r>
-    </w:p>
-    <w:p>
-      <w:pPr>
-        <w:pStyle w:val="Bibliography"/>
-        <w:rPr>
-          <w:rFonts w:ascii="Times New Roman" w:hAnsi="Times New Roman" w:cs="Times New Roman"/>
-        </w:rPr>
-      </w:pPr>
-      <w:r>
-        <w:rPr>
-          <w:rFonts w:ascii="Times New Roman" w:hAnsi="Times New Roman" w:cs="Times New Roman"/>
-        </w:rPr>
-        <w:t xml:space="preserve">Silva Filho, T., Song, H., Perello-Nieto, M., Santos-Rodriguez, R., Kull, M., &amp; Flach, P. (2023). Classifier calibration: A survey on how to assess and improve predicted class probabilities. </w:t>
+        <w:t>North American Journal of Fisheries Management</w:t>
+      </w:r>
+      <w:r>
+        <w:rPr>
+          <w:rFonts w:ascii="Times New Roman" w:hAnsi="Times New Roman" w:cs="Times New Roman"/>
+        </w:rPr>
+        <w:t xml:space="preserve">, </w:t>
       </w:r>
       <w:r>
         <w:rPr>
@@ -11060,27 +11066,13 @@
           <w:i/>
           <w:iCs/>
         </w:rPr>
-        <w:t>Machine Learning</w:t>
-      </w:r>
-      <w:r>
-        <w:rPr>
-          <w:rFonts w:ascii="Times New Roman" w:hAnsi="Times New Roman" w:cs="Times New Roman"/>
-        </w:rPr>
-        <w:t xml:space="preserve">, </w:t>
-      </w:r>
-      <w:r>
-        <w:rPr>
-          <w:rFonts w:ascii="Times New Roman" w:hAnsi="Times New Roman" w:cs="Times New Roman"/>
-          <w:i/>
-          <w:iCs/>
-        </w:rPr>
-        <w:t>112</w:t>
-      </w:r>
-      <w:r>
-        <w:rPr>
-          <w:rFonts w:ascii="Times New Roman" w:hAnsi="Times New Roman" w:cs="Times New Roman"/>
-        </w:rPr>
-        <w:t>(9), 3211–3260. https://doi.org/10.1007/s10994-023-06336-7</w:t>
+        <w:t>44</w:t>
+      </w:r>
+      <w:r>
+        <w:rPr>
+          <w:rFonts w:ascii="Times New Roman" w:hAnsi="Times New Roman" w:cs="Times New Roman"/>
+        </w:rPr>
+        <w:t>(4), 857–869. https://doi.org/10.1002/nafm.11019</w:t>
       </w:r>
     </w:p>
     <w:p>
@@ -11094,106 +11086,7 @@
         <w:rPr>
           <w:rFonts w:ascii="Times New Roman" w:hAnsi="Times New Roman" w:cs="Times New Roman"/>
         </w:rPr>
-        <w:t xml:space="preserve">Templin, W. D., Seeb, J. E., Jasper, J. R., Barclay, A. W., &amp; Seeb, L. W. (2011). Genetic differentiation of Alaska Chinook salmon: The missing link for migratory studies. </w:t>
-      </w:r>
-      <w:r>
-        <w:rPr>
-          <w:rFonts w:ascii="Times New Roman" w:hAnsi="Times New Roman" w:cs="Times New Roman"/>
-          <w:i/>
-          <w:iCs/>
-        </w:rPr>
-        <w:t>Molecular Ecology Resources</w:t>
-      </w:r>
-      <w:r>
-        <w:rPr>
-          <w:rFonts w:ascii="Times New Roman" w:hAnsi="Times New Roman" w:cs="Times New Roman"/>
-        </w:rPr>
-        <w:t xml:space="preserve">, </w:t>
-      </w:r>
-      <w:r>
-        <w:rPr>
-          <w:rFonts w:ascii="Times New Roman" w:hAnsi="Times New Roman" w:cs="Times New Roman"/>
-          <w:i/>
-          <w:iCs/>
-        </w:rPr>
-        <w:t>11</w:t>
-      </w:r>
-      <w:r>
-        <w:rPr>
-          <w:rFonts w:ascii="Times New Roman" w:hAnsi="Times New Roman" w:cs="Times New Roman"/>
-        </w:rPr>
-        <w:t>(s1), 226–246. https://doi.org/10.1111/j.1755-0998.2010.02968.x</w:t>
-      </w:r>
-    </w:p>
-    <w:p>
-      <w:pPr>
-        <w:pStyle w:val="Bibliography"/>
-        <w:rPr>
-          <w:rFonts w:ascii="Times New Roman" w:hAnsi="Times New Roman" w:cs="Times New Roman"/>
-        </w:rPr>
-      </w:pPr>
-      <w:r>
-        <w:rPr>
-          <w:rFonts w:ascii="Times New Roman" w:hAnsi="Times New Roman" w:cs="Times New Roman"/>
-        </w:rPr>
-        <w:t xml:space="preserve">Van Doornik, D. M., Moran, P., Rondeau, E. B., Nichols, K. M., Narum, S. R., Campbell, M. R., Clemento, A. J., Hargrove, J. S., Hess, J. E., Horn, R. L., Seeb, L. W., Stephenson, J. J., &amp; McKinney, G. J. (2024). A new, standardized international Pacific Rim baseline for genetic stock identification (GSI) of Chinook Salmon. </w:t>
-      </w:r>
-      <w:r>
-        <w:rPr>
-          <w:rFonts w:ascii="Times New Roman" w:hAnsi="Times New Roman" w:cs="Times New Roman"/>
-          <w:i/>
-          <w:iCs/>
-        </w:rPr>
-        <w:t>North American Journal of Fisheries Management</w:t>
-      </w:r>
-      <w:r>
-        <w:rPr>
-          <w:rFonts w:ascii="Times New Roman" w:hAnsi="Times New Roman" w:cs="Times New Roman"/>
-        </w:rPr>
-        <w:t xml:space="preserve">, </w:t>
-      </w:r>
-      <w:r>
-        <w:rPr>
-          <w:rFonts w:ascii="Times New Roman" w:hAnsi="Times New Roman" w:cs="Times New Roman"/>
-          <w:i/>
-          <w:iCs/>
-        </w:rPr>
-        <w:t>44</w:t>
-      </w:r>
-      <w:r>
-        <w:rPr>
-          <w:rFonts w:ascii="Times New Roman" w:hAnsi="Times New Roman" w:cs="Times New Roman"/>
-        </w:rPr>
-        <w:t>(4), 857–869. https://doi.org/10.1002/nafm.11019</w:t>
-      </w:r>
-    </w:p>
-    <w:p>
-      <w:pPr>
-        <w:pStyle w:val="Bibliography"/>
-        <w:rPr>
-          <w:rFonts w:ascii="Times New Roman" w:hAnsi="Times New Roman" w:cs="Times New Roman"/>
-        </w:rPr>
-      </w:pPr>
-      <w:r>
-        <w:rPr>
-          <w:rFonts w:ascii="Times New Roman" w:hAnsi="Times New Roman" w:cs="Times New Roman"/>
-        </w:rPr>
-        <w:lastRenderedPageBreak/>
-        <w:t xml:space="preserve">Van </w:t>
-      </w:r>
-      <w:proofErr w:type="spellStart"/>
-      <w:r>
-        <w:rPr>
-          <w:rFonts w:ascii="Times New Roman" w:hAnsi="Times New Roman" w:cs="Times New Roman"/>
-        </w:rPr>
-        <w:t>Rijsbergen</w:t>
-      </w:r>
-      <w:proofErr w:type="spellEnd"/>
-      <w:r>
-        <w:rPr>
-          <w:rFonts w:ascii="Times New Roman" w:hAnsi="Times New Roman" w:cs="Times New Roman"/>
-        </w:rPr>
-        <w:t xml:space="preserve">, C. J. (1975). </w:t>
+        <w:t xml:space="preserve">Van Rijsbergen, C. J. (1975). </w:t>
       </w:r>
       <w:r>
         <w:rPr>
@@ -11730,7 +11623,7 @@
         </w:rPr>
         <w:t xml:space="preserve"> Principal Component analysis of GAM smoothed timeseries data (n = 2,531 otoliths). S</w:t>
       </w:r>
-      <w:ins w:id="75" w:author="Benjamin J. Makhlouf" w:date="2026-03-01T20:18:00Z" w16du:dateUtc="2026-03-02T04:18:00Z">
+      <w:ins w:id="99" w:author="Benjamin J. Makhlouf" w:date="2026-03-01T20:18:00Z" w16du:dateUtc="2026-03-02T04:18:00Z">
         <w:r>
           <w:rPr>
             <w:rFonts w:ascii="Times New Roman" w:hAnsi="Times New Roman" w:cs="Times New Roman"/>
@@ -11738,7 +11631,7 @@
           <w:t>ubstantial</w:t>
         </w:r>
       </w:ins>
-      <w:del w:id="76" w:author="Benjamin J. Makhlouf" w:date="2026-03-01T20:18:00Z" w16du:dateUtc="2026-03-02T04:18:00Z">
+      <w:del w:id="100" w:author="Benjamin J. Makhlouf" w:date="2026-03-01T20:18:00Z" w16du:dateUtc="2026-03-02T04:18:00Z">
         <w:r>
           <w:rPr>
             <w:rFonts w:ascii="Times New Roman" w:hAnsi="Times New Roman" w:cs="Times New Roman"/>

</xml_diff>

<commit_message>
fixed figure to include sampling sites, added to R1_Main
</commit_message>
<xml_diff>
--- a/Docs/ICES_JMS/R1/R1_MainDocument.docx
+++ b/Docs/ICES_JMS/R1/R1_MainDocument.docx
@@ -11239,10 +11239,10 @@
         </w:rPr>
         <w:lastRenderedPageBreak/>
         <w:drawing>
-          <wp:inline distT="0" distB="0" distL="0" distR="0" wp14:anchorId="205ED14F" wp14:editId="70908A5B">
-            <wp:extent cx="4140485" cy="6398842"/>
-            <wp:effectExtent l="0" t="0" r="0" b="2540"/>
-            <wp:docPr id="956025252" name="Picture 1" descr="A map of the river&#10;&#10;AI-generated content may be incorrect."/>
+          <wp:inline distT="0" distB="0" distL="0" distR="0" wp14:anchorId="67EED484" wp14:editId="296B9702">
+            <wp:extent cx="3813717" cy="5893844"/>
+            <wp:effectExtent l="0" t="0" r="0" b="0"/>
+            <wp:docPr id="1296109259" name="Picture 2" descr="A map of the river&#10;&#10;AI-generated content may be incorrect."/>
             <wp:cNvGraphicFramePr>
               <a:graphicFrameLocks xmlns:a="http://schemas.openxmlformats.org/drawingml/2006/main" noChangeAspect="1"/>
             </wp:cNvGraphicFramePr>
@@ -11250,7 +11250,7 @@
               <a:graphicData uri="http://schemas.openxmlformats.org/drawingml/2006/picture">
                 <pic:pic xmlns:pic="http://schemas.openxmlformats.org/drawingml/2006/picture">
                   <pic:nvPicPr>
-                    <pic:cNvPr id="956025252" name="Picture 1" descr="A map of the river&#10;&#10;AI-generated content may be incorrect."/>
+                    <pic:cNvPr id="1296109259" name="Picture 2" descr="A map of the river&#10;&#10;AI-generated content may be incorrect."/>
                     <pic:cNvPicPr/>
                   </pic:nvPicPr>
                   <pic:blipFill>
@@ -11268,7 +11268,7 @@
                   <pic:spPr>
                     <a:xfrm>
                       <a:off x="0" y="0"/>
-                      <a:ext cx="4166999" cy="6439818"/>
+                      <a:ext cx="3828559" cy="5916781"/>
                     </a:xfrm>
                     <a:prstGeom prst="rect">
                       <a:avLst/>

</xml_diff>

<commit_message>
another go through of reviewer comments, getting closer
</commit_message>
<xml_diff>
--- a/Docs/ICES_JMS/R1/R1_MainDocument.docx
+++ b/Docs/ICES_JMS/R1/R1_MainDocument.docx
@@ -6691,7 +6691,75 @@
         <w:t>samples</w:t>
       </w:r>
       <w:r>
-        <w:t>. Yukon samples</w:t>
+        <w:t>.</w:t>
+      </w:r>
+      <w:ins w:id="83" w:author="Benjamin J. Makhlouf" w:date="2026-03-03T12:01:00Z" w16du:dateUtc="2026-03-03T20:01:00Z">
+        <w:r>
+          <w:t xml:space="preserve"> In fact, nearly the entirety of the principal component space occupied by Kuskokwim samples are overlapped </w:t>
+        </w:r>
+      </w:ins>
+      <w:ins w:id="84" w:author="Benjamin J. Makhlouf" w:date="2026-03-03T12:04:00Z" w16du:dateUtc="2026-03-03T20:04:00Z">
+        <w:r>
+          <w:t>by</w:t>
+        </w:r>
+      </w:ins>
+      <w:ins w:id="85" w:author="Benjamin J. Makhlouf" w:date="2026-03-03T12:01:00Z" w16du:dateUtc="2026-03-03T20:01:00Z">
+        <w:r>
+          <w:t xml:space="preserve"> Yukon or Kuskokwim samples</w:t>
+        </w:r>
+      </w:ins>
+      <w:ins w:id="86" w:author="Benjamin J. Makhlouf" w:date="2026-03-03T12:04:00Z" w16du:dateUtc="2026-03-03T20:04:00Z">
+        <w:r>
+          <w:t xml:space="preserve">. This analysis alone indicated </w:t>
+        </w:r>
+      </w:ins>
+      <w:ins w:id="87" w:author="Benjamin J. Makhlouf" w:date="2026-03-03T12:02:00Z" w16du:dateUtc="2026-03-03T20:02:00Z">
+        <w:r>
+          <w:t>very poor discriminat</w:t>
+        </w:r>
+      </w:ins>
+      <w:ins w:id="88" w:author="Benjamin J. Makhlouf" w:date="2026-03-03T12:04:00Z" w16du:dateUtc="2026-03-03T20:04:00Z">
+        <w:r>
+          <w:t xml:space="preserve">ory power </w:t>
+        </w:r>
+      </w:ins>
+      <w:ins w:id="89" w:author="Benjamin J. Makhlouf" w:date="2026-03-03T12:05:00Z" w16du:dateUtc="2026-03-03T20:05:00Z">
+        <w:r>
+          <w:t xml:space="preserve">using </w:t>
+        </w:r>
+      </w:ins>
+      <w:proofErr w:type="spellStart"/>
+      <w:ins w:id="90" w:author="Benjamin J. Makhlouf" w:date="2026-03-03T12:02:00Z" w16du:dateUtc="2026-03-03T20:02:00Z">
+        <w:r>
+          <w:t>using</w:t>
+        </w:r>
+        <w:proofErr w:type="spellEnd"/>
+        <w:r>
+          <w:t xml:space="preserve"> met</w:t>
+        </w:r>
+      </w:ins>
+      <w:ins w:id="91" w:author="Benjamin J. Makhlouf" w:date="2026-03-03T12:03:00Z" w16du:dateUtc="2026-03-03T20:03:00Z">
+        <w:r>
+          <w:t>hods that are not flexible enough to handle complex multidimension relationships in the data</w:t>
+        </w:r>
+      </w:ins>
+      <w:ins w:id="92" w:author="Benjamin J. Makhlouf" w:date="2026-03-03T12:05:00Z" w16du:dateUtc="2026-03-03T20:05:00Z">
+        <w:r>
+          <w:t xml:space="preserve"> beyond those indicated from principal component analysis</w:t>
+        </w:r>
+      </w:ins>
+      <w:ins w:id="93" w:author="Benjamin J. Makhlouf" w:date="2026-03-03T12:03:00Z" w16du:dateUtc="2026-03-03T20:03:00Z">
+        <w:r>
+          <w:t xml:space="preserve">. </w:t>
+        </w:r>
+      </w:ins>
+      <w:del w:id="94" w:author="Benjamin J. Makhlouf" w:date="2026-03-03T12:02:00Z" w16du:dateUtc="2026-03-03T20:02:00Z">
+        <w:r>
+          <w:delText xml:space="preserve"> </w:delText>
+        </w:r>
+      </w:del>
+      <w:r>
+        <w:t>Yukon samples</w:t>
       </w:r>
       <w:r>
         <w:t xml:space="preserve"> (Figure </w:t>
@@ -6724,6 +6792,7 @@
         <w:rPr>
           <w:rFonts w:ascii="Times New Roman" w:hAnsi="Times New Roman" w:cs="Times New Roman"/>
         </w:rPr>
+        <w:lastRenderedPageBreak/>
         <w:t>The pattern observed in the full dataset was also found among only individuals with the same natal origin value (0.7080 – 0.7085)</w:t>
       </w:r>
       <w:r>
@@ -6790,14 +6859,7 @@
         <w:rPr>
           <w:rFonts w:ascii="Times New Roman" w:hAnsi="Times New Roman" w:cs="Times New Roman"/>
         </w:rPr>
-        <w:t xml:space="preserve"> revealed distinct regions driving class separation. The first principal component showed high </w:t>
-      </w:r>
-      <w:r>
-        <w:rPr>
-          <w:rFonts w:ascii="Times New Roman" w:hAnsi="Times New Roman" w:cs="Times New Roman"/>
-        </w:rPr>
-        <w:lastRenderedPageBreak/>
-        <w:t xml:space="preserve">loading values in the middle portion of the </w:t>
+        <w:t xml:space="preserve"> revealed distinct regions driving class separation. The first principal component showed high loading values in the middle portion of the </w:t>
       </w:r>
       <w:r>
         <w:rPr>
@@ -7143,6 +7205,7 @@
           <w:b/>
           <w:bCs/>
         </w:rPr>
+        <w:lastRenderedPageBreak/>
         <w:t xml:space="preserve">Model Performance </w:t>
       </w:r>
     </w:p>
@@ -7280,14 +7343,7 @@
         <w:rPr>
           <w:rFonts w:ascii="Times New Roman" w:hAnsi="Times New Roman" w:cs="Times New Roman"/>
         </w:rPr>
-        <w:t xml:space="preserve"> inhibited model performance by obscuring meaningful patterns. Among model types </w:t>
-      </w:r>
-      <w:r>
-        <w:rPr>
-          <w:rFonts w:ascii="Times New Roman" w:hAnsi="Times New Roman" w:cs="Times New Roman"/>
-        </w:rPr>
-        <w:lastRenderedPageBreak/>
-        <w:t xml:space="preserve">KNN consistently </w:t>
+        <w:t xml:space="preserve"> inhibited model performance by obscuring meaningful patterns. Among model types KNN consistently </w:t>
       </w:r>
       <w:r>
         <w:rPr>
@@ -7568,7 +7624,14 @@
         <w:rPr>
           <w:rFonts w:ascii="Times New Roman" w:hAnsi="Times New Roman" w:cs="Times New Roman"/>
         </w:rPr>
-        <w:t xml:space="preserve"> 8 in the </w:t>
+        <w:t xml:space="preserve"> 8 </w:t>
+      </w:r>
+      <w:r>
+        <w:rPr>
+          <w:rFonts w:ascii="Times New Roman" w:hAnsi="Times New Roman" w:cs="Times New Roman"/>
+        </w:rPr>
+        <w:lastRenderedPageBreak/>
+        <w:t xml:space="preserve">in the </w:t>
       </w:r>
       <w:r>
         <w:rPr>
@@ -7588,7 +7651,7 @@
         </w:rPr>
         <w:t xml:space="preserve">Classification accuracy within the CWAK reporting group, which includes the Kuskokwim, Nushagak, and Lower Yukon regions was 90.0%. Classification accuracy for regions in our dataset not within CWAK was 97.9%. Yukon classification accuracy for those within the CWAK group fell to 73.3%. However, it should be noted that the sample size of CWAK Yukon individuals was </w:t>
       </w:r>
-      <w:ins w:id="83" w:author="Benjamin J. Makhlouf" w:date="2026-03-01T20:19:00Z" w16du:dateUtc="2026-03-02T04:19:00Z">
+      <w:ins w:id="95" w:author="Benjamin J. Makhlouf" w:date="2026-03-01T20:19:00Z" w16du:dateUtc="2026-03-02T04:19:00Z">
         <w:r>
           <w:rPr>
             <w:rFonts w:ascii="Times New Roman" w:hAnsi="Times New Roman" w:cs="Times New Roman"/>
@@ -7596,7 +7659,7 @@
           <w:t xml:space="preserve">substantially </w:t>
         </w:r>
       </w:ins>
-      <w:del w:id="84" w:author="Benjamin J. Makhlouf" w:date="2026-03-01T20:19:00Z" w16du:dateUtc="2026-03-02T04:19:00Z">
+      <w:del w:id="96" w:author="Benjamin J. Makhlouf" w:date="2026-03-01T20:19:00Z" w16du:dateUtc="2026-03-02T04:19:00Z">
         <w:r>
           <w:rPr>
             <w:rFonts w:ascii="Times New Roman" w:hAnsi="Times New Roman" w:cs="Times New Roman"/>
@@ -7610,40 +7673,127 @@
         </w:rPr>
         <w:t xml:space="preserve">lower than other groups </w:t>
       </w:r>
-      <w:proofErr w:type="gramStart"/>
-      <w:r>
-        <w:rPr>
-          <w:rFonts w:ascii="Times New Roman" w:hAnsi="Times New Roman" w:cs="Times New Roman"/>
-        </w:rPr>
-        <w:t>( n</w:t>
-      </w:r>
-      <w:proofErr w:type="gramEnd"/>
-      <w:r>
-        <w:rPr>
-          <w:rFonts w:ascii="Times New Roman" w:hAnsi="Times New Roman" w:cs="Times New Roman"/>
-        </w:rPr>
-        <w:t xml:space="preserve"> = </w:t>
-      </w:r>
-      <w:proofErr w:type="gramStart"/>
-      <w:r>
-        <w:rPr>
-          <w:rFonts w:ascii="Times New Roman" w:hAnsi="Times New Roman" w:cs="Times New Roman"/>
-        </w:rPr>
-        <w:t>29 )</w:t>
-      </w:r>
-      <w:proofErr w:type="gramEnd"/>
-      <w:r>
-        <w:rPr>
-          <w:rFonts w:ascii="Times New Roman" w:hAnsi="Times New Roman" w:cs="Times New Roman"/>
-        </w:rPr>
-        <w:t xml:space="preserve"> , resulting in a </w:t>
-      </w:r>
-      <w:r>
-        <w:rPr>
-          <w:rFonts w:ascii="Times New Roman" w:hAnsi="Times New Roman" w:cs="Times New Roman"/>
-        </w:rPr>
-        <w:lastRenderedPageBreak/>
-        <w:t xml:space="preserve">more pronounced impact to class- specific accuracy from misassignment to relatively few individuals. </w:t>
+      <w:r>
+        <w:rPr>
+          <w:rFonts w:ascii="Times New Roman" w:hAnsi="Times New Roman" w:cs="Times New Roman"/>
+        </w:rPr>
+        <w:t xml:space="preserve">( </w:t>
+      </w:r>
+      <w:del w:id="97" w:author="Benjamin J. Makhlouf" w:date="2026-03-03T12:07:00Z" w16du:dateUtc="2026-03-03T20:07:00Z">
+        <w:r>
+          <w:rPr>
+            <w:rFonts w:ascii="Times New Roman" w:hAnsi="Times New Roman" w:cs="Times New Roman"/>
+          </w:rPr>
+          <w:delText xml:space="preserve">n = 29 </w:delText>
+        </w:r>
+      </w:del>
+      <w:ins w:id="98" w:author="Benjamin J. Makhlouf" w:date="2026-03-03T12:07:00Z" w16du:dateUtc="2026-03-03T20:07:00Z">
+        <w:r>
+          <w:rPr>
+            <w:rFonts w:ascii="Times New Roman" w:hAnsi="Times New Roman" w:cs="Times New Roman"/>
+          </w:rPr>
+          <w:t xml:space="preserve">CWAK Yukon (n = </w:t>
+        </w:r>
+      </w:ins>
+      <w:ins w:id="99" w:author="Benjamin J. Makhlouf" w:date="2026-03-03T12:10:00Z" w16du:dateUtc="2026-03-03T20:10:00Z">
+        <w:r>
+          <w:rPr>
+            <w:rFonts w:ascii="Times New Roman" w:hAnsi="Times New Roman" w:cs="Times New Roman"/>
+            <w:rPrChange w:id="100" w:author="Benjamin J. Makhlouf" w:date="2026-03-03T12:11:00Z" w16du:dateUtc="2026-03-03T20:11:00Z">
+              <w:rPr>
+                <w:rFonts w:ascii="Times New Roman" w:hAnsi="Times New Roman" w:cs="Times New Roman"/>
+                <w:highlight w:val="yellow"/>
+              </w:rPr>
+            </w:rPrChange>
+          </w:rPr>
+          <w:t>2</w:t>
+        </w:r>
+      </w:ins>
+      <w:ins w:id="101" w:author="Benjamin J. Makhlouf" w:date="2026-03-03T12:12:00Z" w16du:dateUtc="2026-03-03T20:12:00Z">
+        <w:r>
+          <w:rPr>
+            <w:rFonts w:ascii="Times New Roman" w:hAnsi="Times New Roman" w:cs="Times New Roman"/>
+          </w:rPr>
+          <w:t>9</w:t>
+        </w:r>
+      </w:ins>
+      <w:ins w:id="102" w:author="Benjamin J. Makhlouf" w:date="2026-03-03T12:07:00Z" w16du:dateUtc="2026-03-03T20:07:00Z">
+        <w:r>
+          <w:rPr>
+            <w:rFonts w:ascii="Times New Roman" w:hAnsi="Times New Roman" w:cs="Times New Roman"/>
+          </w:rPr>
+          <w:t xml:space="preserve">), </w:t>
+        </w:r>
+      </w:ins>
+      <w:ins w:id="103" w:author="Benjamin J. Makhlouf" w:date="2026-03-03T12:11:00Z" w16du:dateUtc="2026-03-03T20:11:00Z">
+        <w:r>
+          <w:rPr>
+            <w:rFonts w:ascii="Times New Roman" w:hAnsi="Times New Roman" w:cs="Times New Roman"/>
+            <w:rPrChange w:id="104" w:author="Benjamin J. Makhlouf" w:date="2026-03-03T12:11:00Z" w16du:dateUtc="2026-03-03T20:11:00Z">
+              <w:rPr>
+                <w:rFonts w:ascii="Times New Roman" w:hAnsi="Times New Roman" w:cs="Times New Roman"/>
+                <w:highlight w:val="yellow"/>
+              </w:rPr>
+            </w:rPrChange>
+          </w:rPr>
+          <w:t xml:space="preserve">non CWAK Yukon (n = 145) </w:t>
+        </w:r>
+      </w:ins>
+      <w:ins w:id="105" w:author="Benjamin J. Makhlouf" w:date="2026-03-03T12:08:00Z" w16du:dateUtc="2026-03-03T20:08:00Z">
+        <w:r>
+          <w:rPr>
+            <w:rFonts w:ascii="Times New Roman" w:hAnsi="Times New Roman" w:cs="Times New Roman"/>
+          </w:rPr>
+          <w:t xml:space="preserve">Kuskokwim </w:t>
+        </w:r>
+      </w:ins>
+      <w:ins w:id="106" w:author="Benjamin J. Makhlouf" w:date="2026-03-03T12:11:00Z" w16du:dateUtc="2026-03-03T20:11:00Z">
+        <w:r>
+          <w:rPr>
+            <w:rFonts w:ascii="Times New Roman" w:hAnsi="Times New Roman" w:cs="Times New Roman"/>
+            <w:rPrChange w:id="107" w:author="Benjamin J. Makhlouf" w:date="2026-03-03T12:11:00Z" w16du:dateUtc="2026-03-03T20:11:00Z">
+              <w:rPr>
+                <w:rFonts w:ascii="Times New Roman" w:hAnsi="Times New Roman" w:cs="Times New Roman"/>
+                <w:highlight w:val="yellow"/>
+              </w:rPr>
+            </w:rPrChange>
+          </w:rPr>
+          <w:t xml:space="preserve">(n = 162) </w:t>
+        </w:r>
+      </w:ins>
+      <w:ins w:id="108" w:author="Benjamin J. Makhlouf" w:date="2026-03-03T12:08:00Z" w16du:dateUtc="2026-03-03T20:08:00Z">
+        <w:r>
+          <w:rPr>
+            <w:rFonts w:ascii="Times New Roman" w:hAnsi="Times New Roman" w:cs="Times New Roman"/>
+          </w:rPr>
+          <w:t xml:space="preserve">, Nushagak </w:t>
+        </w:r>
+      </w:ins>
+      <w:ins w:id="109" w:author="Benjamin J. Makhlouf" w:date="2026-03-03T12:11:00Z" w16du:dateUtc="2026-03-03T20:11:00Z">
+        <w:r>
+          <w:rPr>
+            <w:rFonts w:ascii="Times New Roman" w:hAnsi="Times New Roman" w:cs="Times New Roman"/>
+            <w:rPrChange w:id="110" w:author="Benjamin J. Makhlouf" w:date="2026-03-03T12:11:00Z" w16du:dateUtc="2026-03-03T20:11:00Z">
+              <w:rPr>
+                <w:rFonts w:ascii="Times New Roman" w:hAnsi="Times New Roman" w:cs="Times New Roman"/>
+                <w:highlight w:val="yellow"/>
+              </w:rPr>
+            </w:rPrChange>
+          </w:rPr>
+          <w:t>(n = 139</w:t>
+        </w:r>
+      </w:ins>
+      <w:r>
+        <w:rPr>
+          <w:rFonts w:ascii="Times New Roman" w:hAnsi="Times New Roman" w:cs="Times New Roman"/>
+        </w:rPr>
+        <w:t>)</w:t>
+      </w:r>
+      <w:r>
+        <w:rPr>
+          <w:rFonts w:ascii="Times New Roman" w:hAnsi="Times New Roman" w:cs="Times New Roman"/>
+        </w:rPr>
+        <w:t xml:space="preserve"> , resulting in a more pronounced impact to class- specific accuracy from misassignment to relatively few individuals. </w:t>
       </w:r>
     </w:p>
     <w:p>
@@ -7783,7 +7933,7 @@
         </w:rPr>
         <w:t>accuracy ranged from 91</w:t>
       </w:r>
-      <w:ins w:id="85" w:author="Benjamin J. Makhlouf" w:date="2026-03-01T20:23:00Z" w16du:dateUtc="2026-03-02T04:23:00Z">
+      <w:ins w:id="111" w:author="Benjamin J. Makhlouf" w:date="2026-03-01T20:23:00Z" w16du:dateUtc="2026-03-02T04:23:00Z">
         <w:r>
           <w:rPr>
             <w:rFonts w:ascii="Times New Roman" w:hAnsi="Times New Roman" w:cs="Times New Roman"/>
@@ -7797,7 +7947,7 @@
         </w:rPr>
         <w:t xml:space="preserve"> </w:t>
       </w:r>
-      <w:ins w:id="86" w:author="Benjamin J. Makhlouf" w:date="2026-03-01T20:23:00Z" w16du:dateUtc="2026-03-02T04:23:00Z">
+      <w:ins w:id="112" w:author="Benjamin J. Makhlouf" w:date="2026-03-01T20:23:00Z" w16du:dateUtc="2026-03-02T04:23:00Z">
         <w:r>
           <w:rPr>
             <w:rFonts w:ascii="Times New Roman" w:hAnsi="Times New Roman" w:cs="Times New Roman"/>
@@ -7805,7 +7955,7 @@
           <w:t xml:space="preserve">to </w:t>
         </w:r>
       </w:ins>
-      <w:del w:id="87" w:author="Benjamin J. Makhlouf" w:date="2026-03-01T20:23:00Z" w16du:dateUtc="2026-03-02T04:23:00Z">
+      <w:del w:id="113" w:author="Benjamin J. Makhlouf" w:date="2026-03-01T20:23:00Z" w16du:dateUtc="2026-03-02T04:23:00Z">
         <w:r>
           <w:rPr>
             <w:rFonts w:ascii="Times New Roman" w:hAnsi="Times New Roman" w:cs="Times New Roman"/>
@@ -7895,7 +8045,14 @@
         <w:rPr>
           <w:rFonts w:ascii="Times New Roman" w:hAnsi="Times New Roman" w:cs="Times New Roman"/>
         </w:rPr>
-        <w:t xml:space="preserve">, however, fell steadily as the threshold was raised. Kuskokwim classification accuracy dropped steadily from 87% to 71% whereas Nushagak accuracy declined more quickly at higher probability thresholds from 92% to 75%. The </w:t>
+        <w:t xml:space="preserve">, however, fell steadily as the threshold was raised. Kuskokwim classification accuracy dropped steadily from 87% to 71% </w:t>
+      </w:r>
+      <w:r>
+        <w:rPr>
+          <w:rFonts w:ascii="Times New Roman" w:hAnsi="Times New Roman" w:cs="Times New Roman"/>
+        </w:rPr>
+        <w:lastRenderedPageBreak/>
+        <w:t xml:space="preserve">whereas Nushagak accuracy declined more quickly at higher probability thresholds from 92% to 75%. The </w:t>
       </w:r>
       <w:r>
         <w:rPr>
@@ -7953,6 +8110,7 @@
         <w:spacing w:line="480" w:lineRule="auto"/>
         <w:ind w:firstLine="720"/>
         <w:rPr>
+          <w:ins w:id="114" w:author="Benjamin J. Makhlouf" w:date="2026-03-03T13:42:00Z" w16du:dateUtc="2026-03-03T21:42:00Z"/>
           <w:rFonts w:ascii="Times New Roman" w:hAnsi="Times New Roman" w:cs="Times New Roman"/>
         </w:rPr>
       </w:pPr>
@@ -8046,7 +8204,7 @@
         </w:rPr>
         <w:t xml:space="preserve"> smoothing techniques s</w:t>
       </w:r>
-      <w:ins w:id="88" w:author="Benjamin J. Makhlouf" w:date="2026-03-01T20:17:00Z" w16du:dateUtc="2026-03-02T04:17:00Z">
+      <w:ins w:id="115" w:author="Benjamin J. Makhlouf" w:date="2026-03-01T20:17:00Z" w16du:dateUtc="2026-03-02T04:17:00Z">
         <w:r>
           <w:rPr>
             <w:rFonts w:ascii="Times New Roman" w:hAnsi="Times New Roman" w:cs="Times New Roman"/>
@@ -8054,7 +8212,7 @@
           <w:t xml:space="preserve">ubstantially </w:t>
         </w:r>
       </w:ins>
-      <w:del w:id="89" w:author="Benjamin J. Makhlouf" w:date="2026-03-01T20:17:00Z" w16du:dateUtc="2026-03-02T04:17:00Z">
+      <w:del w:id="116" w:author="Benjamin J. Makhlouf" w:date="2026-03-01T20:17:00Z" w16du:dateUtc="2026-03-02T04:17:00Z">
         <w:r>
           <w:rPr>
             <w:rFonts w:ascii="Times New Roman" w:hAnsi="Times New Roman" w:cs="Times New Roman"/>
@@ -8174,471 +8332,126 @@
         <w:rPr>
           <w:rFonts w:ascii="Times New Roman" w:hAnsi="Times New Roman" w:cs="Times New Roman"/>
         </w:rPr>
-        <w:t xml:space="preserve">. </w:t>
-      </w:r>
-      <w:r>
-        <w:rPr>
-          <w:rFonts w:ascii="Times New Roman" w:hAnsi="Times New Roman" w:cs="Times New Roman"/>
-        </w:rPr>
-        <w:t xml:space="preserve">Given the relatively small sample size in our testing set, we acknowledge that the relatively subtle difference in classification accuracy among methods may not be significant. However, even if the difference is insignificant, all methods presented here provide a high level of classification accuracy. </w:t>
-      </w:r>
+        <w:t>.</w:t>
+      </w:r>
+      <w:ins w:id="117" w:author="Benjamin J. Makhlouf" w:date="2026-03-03T13:44:00Z" w16du:dateUtc="2026-03-03T21:44:00Z">
+        <w:r>
+          <w:rPr>
+            <w:rFonts w:ascii="Times New Roman" w:hAnsi="Times New Roman" w:cs="Times New Roman"/>
+          </w:rPr>
+          <w:t xml:space="preserve"> For example, </w:t>
+        </w:r>
+      </w:ins>
+      <w:del w:id="118" w:author="Benjamin J. Makhlouf" w:date="2026-03-03T13:44:00Z" w16du:dateUtc="2026-03-03T21:44:00Z">
+        <w:r>
+          <w:rPr>
+            <w:rFonts w:ascii="Times New Roman" w:hAnsi="Times New Roman" w:cs="Times New Roman"/>
+          </w:rPr>
+          <w:delText xml:space="preserve"> </w:delText>
+        </w:r>
+      </w:del>
+      <w:ins w:id="119" w:author="Benjamin J. Makhlouf" w:date="2026-03-03T13:41:00Z" w16du:dateUtc="2026-03-03T21:41:00Z">
+        <w:r>
+          <w:rPr>
+            <w:rFonts w:ascii="Times New Roman" w:hAnsi="Times New Roman" w:cs="Times New Roman"/>
+          </w:rPr>
+          <w:t xml:space="preserve">timeseries analysis techniques are </w:t>
+        </w:r>
+      </w:ins>
+      <w:ins w:id="120" w:author="Benjamin J. Makhlouf" w:date="2026-03-03T13:44:00Z" w16du:dateUtc="2026-03-03T21:44:00Z">
+        <w:r>
+          <w:rPr>
+            <w:rFonts w:ascii="Times New Roman" w:hAnsi="Times New Roman" w:cs="Times New Roman"/>
+          </w:rPr>
+          <w:t xml:space="preserve">increasingly applied to </w:t>
+        </w:r>
+      </w:ins>
+      <w:ins w:id="121" w:author="Benjamin J. Makhlouf" w:date="2026-03-03T13:42:00Z" w16du:dateUtc="2026-03-03T21:42:00Z">
+        <w:r>
+          <w:rPr>
+            <w:rFonts w:ascii="Times New Roman" w:hAnsi="Times New Roman" w:cs="Times New Roman"/>
+          </w:rPr>
+          <w:t xml:space="preserve">otolith timeseries data including hidden Markov approaches, changepoint analysis, or smoothing techniques such as state-space models </w:t>
+        </w:r>
+      </w:ins>
+      <w:ins w:id="122" w:author="Benjamin J. Makhlouf" w:date="2026-03-03T13:43:00Z" w16du:dateUtc="2026-03-03T21:43:00Z">
+        <w:r>
+          <w:rPr>
+            <w:rFonts w:ascii="Times New Roman" w:hAnsi="Times New Roman" w:cs="Times New Roman"/>
+          </w:rPr>
+          <w:t>[ref, ref ref]. In addition, there are similar advancements</w:t>
+        </w:r>
+      </w:ins>
+      <w:ins w:id="123" w:author="Benjamin J. Makhlouf" w:date="2026-03-03T13:44:00Z" w16du:dateUtc="2026-03-03T21:44:00Z">
+        <w:r>
+          <w:rPr>
+            <w:rFonts w:ascii="Times New Roman" w:hAnsi="Times New Roman" w:cs="Times New Roman"/>
+          </w:rPr>
+          <w:t xml:space="preserve"> emerging</w:t>
+        </w:r>
+      </w:ins>
+      <w:ins w:id="124" w:author="Benjamin J. Makhlouf" w:date="2026-03-03T13:43:00Z" w16du:dateUtc="2026-03-03T21:43:00Z">
+        <w:r>
+          <w:rPr>
+            <w:rFonts w:ascii="Times New Roman" w:hAnsi="Times New Roman" w:cs="Times New Roman"/>
+          </w:rPr>
+          <w:t xml:space="preserve"> in </w:t>
+        </w:r>
+      </w:ins>
+      <w:ins w:id="125" w:author="Benjamin J. Makhlouf" w:date="2026-03-03T13:44:00Z" w16du:dateUtc="2026-03-03T21:44:00Z">
+        <w:r>
+          <w:rPr>
+            <w:rFonts w:ascii="Times New Roman" w:hAnsi="Times New Roman" w:cs="Times New Roman"/>
+          </w:rPr>
+          <w:t>the use of</w:t>
+        </w:r>
+      </w:ins>
+      <w:ins w:id="126" w:author="Benjamin J. Makhlouf" w:date="2026-03-03T13:45:00Z" w16du:dateUtc="2026-03-03T21:45:00Z">
+        <w:r>
+          <w:rPr>
+            <w:rFonts w:ascii="Times New Roman" w:hAnsi="Times New Roman" w:cs="Times New Roman"/>
+          </w:rPr>
+          <w:t xml:space="preserve"> the unique shape of these time structured data to compare against reference datasets such as those presented here or simulated datasets which </w:t>
+        </w:r>
+        <w:r>
+          <w:rPr>
+            <w:rFonts w:ascii="Times New Roman" w:hAnsi="Times New Roman" w:cs="Times New Roman"/>
+          </w:rPr>
+          <w:lastRenderedPageBreak/>
+          <w:t>replicate the expected patterns in otolith dat</w:t>
+        </w:r>
+      </w:ins>
+      <w:ins w:id="127" w:author="Benjamin J. Makhlouf" w:date="2026-03-03T13:46:00Z" w16du:dateUtc="2026-03-03T21:46:00Z">
+        <w:r>
+          <w:rPr>
+            <w:rFonts w:ascii="Times New Roman" w:hAnsi="Times New Roman" w:cs="Times New Roman"/>
+          </w:rPr>
+          <w:t xml:space="preserve">a [ref]. As our understanding of otolith bioaccumulation processes during migration continues to advance, there is increasing opportunity to extract and utilize time structured </w:t>
+        </w:r>
+      </w:ins>
+      <w:ins w:id="128" w:author="Benjamin J. Makhlouf" w:date="2026-03-03T13:47:00Z" w16du:dateUtc="2026-03-03T21:47:00Z">
+        <w:r>
+          <w:rPr>
+            <w:rFonts w:ascii="Times New Roman" w:hAnsi="Times New Roman" w:cs="Times New Roman"/>
+          </w:rPr>
+          <w:t xml:space="preserve">otolith data to discriminate finer spatial-scale estimates of provenance. </w:t>
+        </w:r>
+      </w:ins>
     </w:p>
     <w:p>
       <w:pPr>
         <w:spacing w:line="480" w:lineRule="auto"/>
         <w:ind w:firstLine="720"/>
         <w:rPr>
-          <w:rFonts w:ascii="Times New Roman" w:hAnsi="Times New Roman" w:cs="Times New Roman"/>
-        </w:rPr>
-      </w:pPr>
-      <w:r>
-        <w:rPr>
-          <w:rFonts w:ascii="Times New Roman" w:hAnsi="Times New Roman" w:cs="Times New Roman"/>
-        </w:rPr>
-        <w:t xml:space="preserve">Using the </w:t>
-      </w:r>
-      <w:r>
-        <w:rPr>
-          <w:rFonts w:ascii="Times New Roman" w:hAnsi="Times New Roman" w:cs="Times New Roman"/>
-        </w:rPr>
-        <w:t>best</w:t>
-      </w:r>
-      <w:r>
-        <w:rPr>
-          <w:rFonts w:ascii="Times New Roman" w:hAnsi="Times New Roman" w:cs="Times New Roman"/>
-        </w:rPr>
-        <w:t xml:space="preserve"> preforming</w:t>
-      </w:r>
-      <w:r>
-        <w:rPr>
-          <w:rFonts w:ascii="Times New Roman" w:hAnsi="Times New Roman" w:cs="Times New Roman"/>
-        </w:rPr>
-        <w:t xml:space="preserve"> model, </w:t>
-      </w:r>
-      <w:r>
-        <w:rPr>
-          <w:rFonts w:ascii="Times New Roman" w:hAnsi="Times New Roman" w:cs="Times New Roman"/>
-        </w:rPr>
-        <w:t xml:space="preserve">watershed-specific </w:t>
-      </w:r>
-      <w:r>
-        <w:rPr>
-          <w:rFonts w:ascii="Times New Roman" w:hAnsi="Times New Roman" w:cs="Times New Roman"/>
-        </w:rPr>
-        <w:t xml:space="preserve">classification </w:t>
-      </w:r>
-      <w:r>
-        <w:rPr>
-          <w:rFonts w:ascii="Times New Roman" w:hAnsi="Times New Roman" w:cs="Times New Roman"/>
-        </w:rPr>
-        <w:t>accuracies</w:t>
-      </w:r>
-      <w:r>
-        <w:rPr>
-          <w:rFonts w:ascii="Times New Roman" w:hAnsi="Times New Roman" w:cs="Times New Roman"/>
-        </w:rPr>
-        <w:t xml:space="preserve"> on the full testing dataset</w:t>
-      </w:r>
-      <w:r>
-        <w:rPr>
-          <w:rFonts w:ascii="Times New Roman" w:hAnsi="Times New Roman" w:cs="Times New Roman"/>
-        </w:rPr>
-        <w:t xml:space="preserve"> exceed</w:t>
-      </w:r>
-      <w:r>
-        <w:rPr>
-          <w:rFonts w:ascii="Times New Roman" w:hAnsi="Times New Roman" w:cs="Times New Roman"/>
-        </w:rPr>
-        <w:t>ed</w:t>
-      </w:r>
-      <w:r>
-        <w:rPr>
-          <w:rFonts w:ascii="Times New Roman" w:hAnsi="Times New Roman" w:cs="Times New Roman"/>
-        </w:rPr>
-        <w:t xml:space="preserve"> 90% for all three watersheds. Most misclassifications occurred between Nushagak and Kuskokwim fish, consistent with expectations given the greater overlap in </w:t>
-      </w:r>
-      <w:r>
-        <w:rPr>
-          <w:rFonts w:ascii="Times New Roman" w:hAnsi="Times New Roman" w:cs="Times New Roman"/>
-        </w:rPr>
-        <w:t xml:space="preserve">⁸⁷Sr/⁸⁶Sr </w:t>
-      </w:r>
-      <w:r>
-        <w:rPr>
-          <w:rFonts w:ascii="Times New Roman" w:hAnsi="Times New Roman" w:cs="Times New Roman"/>
-        </w:rPr>
-        <w:t xml:space="preserve">values </w:t>
-      </w:r>
-      <w:r>
-        <w:rPr>
-          <w:rFonts w:ascii="Times New Roman" w:hAnsi="Times New Roman" w:cs="Times New Roman"/>
-        </w:rPr>
-        <w:t xml:space="preserve">in potential strontium sources and </w:t>
-      </w:r>
-      <w:r>
-        <w:rPr>
-          <w:rFonts w:ascii="Times New Roman" w:hAnsi="Times New Roman" w:cs="Times New Roman"/>
-        </w:rPr>
-        <w:t xml:space="preserve">closer spatial proximity between these watersheds. </w:t>
-      </w:r>
-      <w:r>
-        <w:rPr>
-          <w:rFonts w:ascii="Times New Roman" w:hAnsi="Times New Roman" w:cs="Times New Roman"/>
-        </w:rPr>
-        <w:t xml:space="preserve">This limitation is further illustrated in the confidence threshold analysis, in which we </w:t>
-      </w:r>
-      <w:r>
-        <w:rPr>
-          <w:rFonts w:ascii="Times New Roman" w:hAnsi="Times New Roman" w:cs="Times New Roman"/>
-        </w:rPr>
-        <w:lastRenderedPageBreak/>
-        <w:t xml:space="preserve">imposed the additional requirement that the model must assign to the correct class with a calibrated probability value above a given threshold. Preforming this analysis on the total dataset resulted in a </w:t>
-      </w:r>
-      <w:ins w:id="90" w:author="Benjamin J. Makhlouf" w:date="2026-03-01T20:18:00Z" w16du:dateUtc="2026-03-02T04:18:00Z">
-        <w:r>
-          <w:rPr>
-            <w:rFonts w:ascii="Times New Roman" w:hAnsi="Times New Roman" w:cs="Times New Roman"/>
-          </w:rPr>
-          <w:t xml:space="preserve">substantial </w:t>
-        </w:r>
-      </w:ins>
-      <w:del w:id="91" w:author="Benjamin J. Makhlouf" w:date="2026-03-01T20:18:00Z" w16du:dateUtc="2026-03-02T04:18:00Z">
-        <w:r>
-          <w:rPr>
-            <w:rFonts w:ascii="Times New Roman" w:hAnsi="Times New Roman" w:cs="Times New Roman"/>
-          </w:rPr>
-          <w:delText xml:space="preserve">significant </w:delText>
-        </w:r>
-      </w:del>
-      <w:r>
-        <w:rPr>
-          <w:rFonts w:ascii="Times New Roman" w:hAnsi="Times New Roman" w:cs="Times New Roman"/>
-        </w:rPr>
-        <w:t xml:space="preserve">decrease in classification accuracy in the Nushagak and Kuskokwim as we increased the threshold probability value. This reflects the fact although the model correctly assigns individuals to these watersheds in most cases, the associated confidence of the model is much </w:t>
-      </w:r>
-      <w:r>
-        <w:rPr>
-          <w:rFonts w:ascii="Times New Roman" w:hAnsi="Times New Roman" w:cs="Times New Roman"/>
-        </w:rPr>
-        <w:t xml:space="preserve">lower for these classes given their similarity in time series shape. </w:t>
-      </w:r>
-      <w:r>
-        <w:rPr>
-          <w:rFonts w:ascii="Times New Roman" w:hAnsi="Times New Roman" w:cs="Times New Roman"/>
-        </w:rPr>
-        <w:t xml:space="preserve">In contrast, Yukon fish exhibited </w:t>
-      </w:r>
-      <w:r>
-        <w:rPr>
-          <w:rFonts w:ascii="Times New Roman" w:hAnsi="Times New Roman" w:cs="Times New Roman"/>
-        </w:rPr>
-        <w:t xml:space="preserve">unique </w:t>
-      </w:r>
-      <w:r>
-        <w:rPr>
-          <w:rFonts w:ascii="Times New Roman" w:hAnsi="Times New Roman" w:cs="Times New Roman"/>
-        </w:rPr>
-        <w:t>patterns</w:t>
-      </w:r>
-      <w:r>
-        <w:rPr>
-          <w:rFonts w:ascii="Times New Roman" w:hAnsi="Times New Roman" w:cs="Times New Roman"/>
-        </w:rPr>
-        <w:t xml:space="preserve"> in otolith LA data</w:t>
-      </w:r>
-      <w:r>
-        <w:rPr>
-          <w:rFonts w:ascii="Times New Roman" w:hAnsi="Times New Roman" w:cs="Times New Roman"/>
-        </w:rPr>
-        <w:t xml:space="preserve"> due to the watershed's extreme spatial scale, broader range of isotope values, and extended migration timing</w:t>
-      </w:r>
-      <w:r>
-        <w:rPr>
-          <w:rFonts w:ascii="Times New Roman" w:hAnsi="Times New Roman" w:cs="Times New Roman"/>
-        </w:rPr>
-        <w:t xml:space="preserve"> (</w:t>
-      </w:r>
-      <w:r>
-        <w:rPr>
-          <w:rFonts w:ascii="Times New Roman" w:hAnsi="Times New Roman" w:cs="Times New Roman"/>
-        </w:rPr>
-        <w:t>Figure 2</w:t>
-      </w:r>
-      <w:r>
-        <w:rPr>
-          <w:rFonts w:ascii="Times New Roman" w:hAnsi="Times New Roman" w:cs="Times New Roman"/>
-        </w:rPr>
-        <w:t>)</w:t>
-      </w:r>
-      <w:r>
-        <w:rPr>
-          <w:rFonts w:ascii="Times New Roman" w:hAnsi="Times New Roman" w:cs="Times New Roman"/>
-        </w:rPr>
-        <w:t xml:space="preserve">. This likely resulted in otolith </w:t>
-      </w:r>
-      <w:r>
-        <w:rPr>
-          <w:rFonts w:ascii="Times New Roman" w:hAnsi="Times New Roman" w:cs="Times New Roman"/>
-        </w:rPr>
-        <w:t>time series</w:t>
-      </w:r>
-      <w:r>
-        <w:rPr>
-          <w:rFonts w:ascii="Times New Roman" w:hAnsi="Times New Roman" w:cs="Times New Roman"/>
-        </w:rPr>
-        <w:t xml:space="preserve"> which were distinct compared to the other watersheds either because of natal origin values</w:t>
-      </w:r>
-      <w:r>
-        <w:rPr>
-          <w:rFonts w:ascii="Times New Roman" w:hAnsi="Times New Roman" w:cs="Times New Roman"/>
-        </w:rPr>
-        <w:t xml:space="preserve"> only found in the Yukon (⁸⁷Sr/⁸⁶Sr &gt; 0.71</w:t>
-      </w:r>
-      <w:r>
-        <w:rPr>
-          <w:rFonts w:ascii="Times New Roman" w:hAnsi="Times New Roman" w:cs="Times New Roman"/>
-        </w:rPr>
-        <w:t>3</w:t>
-      </w:r>
-      <w:r>
-        <w:rPr>
-          <w:rFonts w:ascii="Times New Roman" w:hAnsi="Times New Roman" w:cs="Times New Roman"/>
-        </w:rPr>
-        <w:t>)</w:t>
-      </w:r>
-      <w:r>
-        <w:rPr>
-          <w:rFonts w:ascii="Times New Roman" w:hAnsi="Times New Roman" w:cs="Times New Roman"/>
-        </w:rPr>
-        <w:t xml:space="preserve"> or prominent features </w:t>
-      </w:r>
-      <w:r>
-        <w:rPr>
-          <w:rFonts w:ascii="Times New Roman" w:hAnsi="Times New Roman" w:cs="Times New Roman"/>
-        </w:rPr>
-        <w:t xml:space="preserve">resulting from a longer </w:t>
-      </w:r>
-      <w:r>
-        <w:rPr>
-          <w:rFonts w:ascii="Times New Roman" w:hAnsi="Times New Roman" w:cs="Times New Roman"/>
-        </w:rPr>
-        <w:t>migration through the enriched mainstem tributary (</w:t>
-      </w:r>
-      <w:proofErr w:type="spellStart"/>
-      <w:r>
-        <w:rPr>
-          <w:rFonts w:ascii="Times New Roman" w:hAnsi="Times New Roman" w:cs="Times New Roman"/>
-        </w:rPr>
-        <w:t>i.e</w:t>
-      </w:r>
-      <w:proofErr w:type="spellEnd"/>
-      <w:r>
-        <w:rPr>
-          <w:rFonts w:ascii="Times New Roman" w:hAnsi="Times New Roman" w:cs="Times New Roman"/>
-        </w:rPr>
-        <w:t xml:space="preserve"> Figure </w:t>
-      </w:r>
-      <w:r>
-        <w:rPr>
-          <w:rFonts w:ascii="Times New Roman" w:hAnsi="Times New Roman" w:cs="Times New Roman"/>
-        </w:rPr>
-        <w:t>3</w:t>
-      </w:r>
-      <w:r>
-        <w:rPr>
-          <w:rFonts w:ascii="Times New Roman" w:hAnsi="Times New Roman" w:cs="Times New Roman"/>
-        </w:rPr>
-        <w:t xml:space="preserve">b, column 3). </w:t>
-      </w:r>
-      <w:r>
-        <w:rPr>
-          <w:rFonts w:ascii="Times New Roman" w:hAnsi="Times New Roman" w:cs="Times New Roman"/>
-        </w:rPr>
-        <w:t xml:space="preserve">Yukon classification accuracy dropped substantially in the </w:t>
-      </w:r>
-      <w:r>
-        <w:rPr>
-          <w:rFonts w:ascii="Times New Roman" w:hAnsi="Times New Roman" w:cs="Times New Roman"/>
-        </w:rPr>
-        <w:t>restricted</w:t>
-      </w:r>
-      <w:r>
-        <w:rPr>
-          <w:rFonts w:ascii="Times New Roman" w:hAnsi="Times New Roman" w:cs="Times New Roman"/>
-        </w:rPr>
-        <w:t xml:space="preserve"> </w:t>
-      </w:r>
-      <w:r>
-        <w:rPr>
-          <w:rFonts w:ascii="Times New Roman" w:hAnsi="Times New Roman" w:cs="Times New Roman"/>
-        </w:rPr>
-        <w:t xml:space="preserve">testing set (86.86% vs. 93.7% in the total testing set), despite similar numbers of misidentified individuals. </w:t>
-      </w:r>
-      <w:r>
-        <w:rPr>
-          <w:rFonts w:ascii="Times New Roman" w:hAnsi="Times New Roman" w:cs="Times New Roman"/>
-        </w:rPr>
-        <w:t xml:space="preserve">This </w:t>
-      </w:r>
-      <w:r>
-        <w:rPr>
-          <w:rFonts w:ascii="Times New Roman" w:hAnsi="Times New Roman" w:cs="Times New Roman"/>
-        </w:rPr>
-        <w:t>decline likely reflects the removal of the most easily classified cases</w:t>
-      </w:r>
-      <w:r>
-        <w:rPr>
-          <w:rFonts w:ascii="Times New Roman" w:hAnsi="Times New Roman" w:cs="Times New Roman"/>
-        </w:rPr>
-        <w:t>, which is further supported by</w:t>
-      </w:r>
-      <w:r>
-        <w:rPr>
-          <w:rFonts w:ascii="Times New Roman" w:hAnsi="Times New Roman" w:cs="Times New Roman"/>
-        </w:rPr>
-        <w:t xml:space="preserve"> </w:t>
-      </w:r>
-      <w:r>
-        <w:rPr>
-          <w:rFonts w:ascii="Times New Roman" w:hAnsi="Times New Roman" w:cs="Times New Roman"/>
-        </w:rPr>
-        <w:t>higher misclassification rates among CWAK individuals compared to those from the middle and upper Yukon regions</w:t>
-      </w:r>
-      <w:r>
-        <w:rPr>
-          <w:rFonts w:ascii="Times New Roman" w:hAnsi="Times New Roman" w:cs="Times New Roman"/>
-        </w:rPr>
-        <w:t xml:space="preserve"> (Supp. Figure </w:t>
-      </w:r>
-      <w:proofErr w:type="gramStart"/>
-      <w:r>
-        <w:rPr>
-          <w:rFonts w:ascii="Times New Roman" w:hAnsi="Times New Roman" w:cs="Times New Roman"/>
-        </w:rPr>
-        <w:t>2 )</w:t>
-      </w:r>
-      <w:proofErr w:type="gramEnd"/>
-      <w:r>
-        <w:rPr>
-          <w:rFonts w:ascii="Times New Roman" w:hAnsi="Times New Roman" w:cs="Times New Roman"/>
-        </w:rPr>
-        <w:t xml:space="preserve">. </w:t>
-      </w:r>
-      <w:r>
-        <w:rPr>
-          <w:rFonts w:ascii="Times New Roman" w:hAnsi="Times New Roman" w:cs="Times New Roman"/>
-        </w:rPr>
-        <w:t>The</w:t>
-      </w:r>
-      <w:r>
-        <w:rPr>
-          <w:rFonts w:ascii="Times New Roman" w:hAnsi="Times New Roman" w:cs="Times New Roman"/>
-        </w:rPr>
-        <w:t xml:space="preserve">se </w:t>
-      </w:r>
-      <w:r>
-        <w:rPr>
-          <w:rFonts w:ascii="Times New Roman" w:hAnsi="Times New Roman" w:cs="Times New Roman"/>
-        </w:rPr>
-        <w:t xml:space="preserve">challenges </w:t>
-      </w:r>
-      <w:r>
-        <w:rPr>
-          <w:rFonts w:ascii="Times New Roman" w:hAnsi="Times New Roman" w:cs="Times New Roman"/>
-        </w:rPr>
-        <w:t xml:space="preserve">likely stem </w:t>
-      </w:r>
-      <w:r>
-        <w:rPr>
-          <w:rFonts w:ascii="Times New Roman" w:hAnsi="Times New Roman" w:cs="Times New Roman"/>
-        </w:rPr>
-        <w:t>from shorter migration patterns that include less residence time in the mainstem Yukon River</w:t>
-      </w:r>
-      <w:r>
-        <w:rPr>
-          <w:rFonts w:ascii="Times New Roman" w:hAnsi="Times New Roman" w:cs="Times New Roman"/>
-        </w:rPr>
-        <w:t>, and, subsequently, a</w:t>
-      </w:r>
-      <w:r>
-        <w:rPr>
-          <w:rFonts w:ascii="Times New Roman" w:hAnsi="Times New Roman" w:cs="Times New Roman"/>
-        </w:rPr>
-        <w:t xml:space="preserve"> less pronounced increase in isotope values before marine entry</w:t>
-      </w:r>
-      <w:r>
-        <w:rPr>
-          <w:rFonts w:ascii="Times New Roman" w:hAnsi="Times New Roman" w:cs="Times New Roman"/>
-        </w:rPr>
-        <w:t xml:space="preserve">. </w:t>
-      </w:r>
-      <w:r>
-        <w:rPr>
-          <w:rFonts w:ascii="Times New Roman" w:hAnsi="Times New Roman" w:cs="Times New Roman"/>
-        </w:rPr>
-        <w:t xml:space="preserve">Without this distinguishing feature, CWAK individuals from the Yukon (i.e. Figure </w:t>
-      </w:r>
-      <w:r>
-        <w:rPr>
-          <w:rFonts w:ascii="Times New Roman" w:hAnsi="Times New Roman" w:cs="Times New Roman"/>
-        </w:rPr>
-        <w:t>3</w:t>
-      </w:r>
-      <w:r>
-        <w:rPr>
-          <w:rFonts w:ascii="Times New Roman" w:hAnsi="Times New Roman" w:cs="Times New Roman"/>
-        </w:rPr>
-        <w:t>b, column 4) are more likely to be misclassified with Kuskokwim or Nushagak fish, resulting in lower overall accuracy.</w:t>
-      </w:r>
-      <w:r>
-        <w:rPr>
-          <w:rFonts w:ascii="Times New Roman" w:hAnsi="Times New Roman" w:cs="Times New Roman"/>
-        </w:rPr>
-        <w:t xml:space="preserve"> </w:t>
-      </w:r>
-      <w:r>
-        <w:rPr>
-          <w:rFonts w:ascii="Times New Roman" w:hAnsi="Times New Roman" w:cs="Times New Roman"/>
-        </w:rPr>
-        <w:t xml:space="preserve">Nonetheless, even applying the most conservative </w:t>
-      </w:r>
-      <w:r>
-        <w:rPr>
-          <w:rFonts w:ascii="Times New Roman" w:hAnsi="Times New Roman" w:cs="Times New Roman"/>
-        </w:rPr>
-        <w:t xml:space="preserve">methods (90% confidence threshold on the restricted </w:t>
-      </w:r>
-      <w:proofErr w:type="gramStart"/>
-      <w:r>
-        <w:rPr>
-          <w:rFonts w:ascii="Times New Roman" w:hAnsi="Times New Roman" w:cs="Times New Roman"/>
-        </w:rPr>
-        <w:t>dataset</w:t>
-      </w:r>
-      <w:r>
-        <w:rPr>
-          <w:rFonts w:ascii="Times New Roman" w:hAnsi="Times New Roman" w:cs="Times New Roman"/>
-        </w:rPr>
-        <w:t xml:space="preserve"> </w:t>
-      </w:r>
-      <w:r>
-        <w:rPr>
-          <w:rFonts w:ascii="Times New Roman" w:hAnsi="Times New Roman" w:cs="Times New Roman"/>
-        </w:rPr>
-        <w:t>)</w:t>
-      </w:r>
-      <w:proofErr w:type="gramEnd"/>
-      <w:r>
-        <w:rPr>
-          <w:rFonts w:ascii="Times New Roman" w:hAnsi="Times New Roman" w:cs="Times New Roman"/>
-        </w:rPr>
-        <w:t xml:space="preserve"> we achieved 78% classification accuracy across all three datasets.</w:t>
-      </w:r>
-      <w:r>
-        <w:rPr>
-          <w:rFonts w:ascii="Times New Roman" w:hAnsi="Times New Roman" w:cs="Times New Roman"/>
-        </w:rPr>
-        <w:t xml:space="preserve"> </w:t>
+          <w:del w:id="129" w:author="Benjamin J. Makhlouf" w:date="2026-03-03T13:47:00Z" w16du:dateUtc="2026-03-03T21:47:00Z"/>
+          <w:rFonts w:ascii="Times New Roman" w:hAnsi="Times New Roman" w:cs="Times New Roman"/>
+        </w:rPr>
+      </w:pPr>
+      <w:r>
+        <w:rPr>
+          <w:rFonts w:ascii="Times New Roman" w:hAnsi="Times New Roman" w:cs="Times New Roman"/>
+        </w:rPr>
+        <w:t xml:space="preserve">Given the relatively small sample size in our testing set, we acknowledge that the relatively subtle difference in classification accuracy among methods may not be significant. However, even if the difference is insignificant, all methods presented here provide a high level of classification accuracy. </w:t>
       </w:r>
     </w:p>
     <w:p>
@@ -8653,7 +8466,464 @@
         <w:rPr>
           <w:rFonts w:ascii="Times New Roman" w:hAnsi="Times New Roman" w:cs="Times New Roman"/>
         </w:rPr>
+        <w:t xml:space="preserve">Using the </w:t>
+      </w:r>
+      <w:r>
+        <w:rPr>
+          <w:rFonts w:ascii="Times New Roman" w:hAnsi="Times New Roman" w:cs="Times New Roman"/>
+        </w:rPr>
+        <w:t>best</w:t>
+      </w:r>
+      <w:r>
+        <w:rPr>
+          <w:rFonts w:ascii="Times New Roman" w:hAnsi="Times New Roman" w:cs="Times New Roman"/>
+        </w:rPr>
+        <w:t xml:space="preserve"> preforming</w:t>
+      </w:r>
+      <w:r>
+        <w:rPr>
+          <w:rFonts w:ascii="Times New Roman" w:hAnsi="Times New Roman" w:cs="Times New Roman"/>
+        </w:rPr>
+        <w:t xml:space="preserve"> model, </w:t>
+      </w:r>
+      <w:r>
+        <w:rPr>
+          <w:rFonts w:ascii="Times New Roman" w:hAnsi="Times New Roman" w:cs="Times New Roman"/>
+        </w:rPr>
+        <w:t xml:space="preserve">watershed-specific </w:t>
+      </w:r>
+      <w:r>
+        <w:rPr>
+          <w:rFonts w:ascii="Times New Roman" w:hAnsi="Times New Roman" w:cs="Times New Roman"/>
+        </w:rPr>
+        <w:t xml:space="preserve">classification </w:t>
+      </w:r>
+      <w:r>
+        <w:rPr>
+          <w:rFonts w:ascii="Times New Roman" w:hAnsi="Times New Roman" w:cs="Times New Roman"/>
+        </w:rPr>
+        <w:t>accuracies</w:t>
+      </w:r>
+      <w:r>
+        <w:rPr>
+          <w:rFonts w:ascii="Times New Roman" w:hAnsi="Times New Roman" w:cs="Times New Roman"/>
+        </w:rPr>
+        <w:t xml:space="preserve"> on the full testing dataset</w:t>
+      </w:r>
+      <w:r>
+        <w:rPr>
+          <w:rFonts w:ascii="Times New Roman" w:hAnsi="Times New Roman" w:cs="Times New Roman"/>
+        </w:rPr>
+        <w:t xml:space="preserve"> exceed</w:t>
+      </w:r>
+      <w:r>
+        <w:rPr>
+          <w:rFonts w:ascii="Times New Roman" w:hAnsi="Times New Roman" w:cs="Times New Roman"/>
+        </w:rPr>
+        <w:t>ed</w:t>
+      </w:r>
+      <w:r>
+        <w:rPr>
+          <w:rFonts w:ascii="Times New Roman" w:hAnsi="Times New Roman" w:cs="Times New Roman"/>
+        </w:rPr>
+        <w:t xml:space="preserve"> 90% for all three watersheds. Most misclassifications occurred between Nushagak and Kuskokwim fish, consistent with expectations given the greater overlap in </w:t>
+      </w:r>
+      <w:r>
+        <w:rPr>
+          <w:rFonts w:ascii="Times New Roman" w:hAnsi="Times New Roman" w:cs="Times New Roman"/>
+        </w:rPr>
+        <w:t xml:space="preserve">⁸⁷Sr/⁸⁶Sr </w:t>
+      </w:r>
+      <w:r>
+        <w:rPr>
+          <w:rFonts w:ascii="Times New Roman" w:hAnsi="Times New Roman" w:cs="Times New Roman"/>
+        </w:rPr>
+        <w:t xml:space="preserve">values </w:t>
+      </w:r>
+      <w:r>
+        <w:rPr>
+          <w:rFonts w:ascii="Times New Roman" w:hAnsi="Times New Roman" w:cs="Times New Roman"/>
+        </w:rPr>
+        <w:t xml:space="preserve">in potential strontium sources and </w:t>
+      </w:r>
+      <w:r>
+        <w:rPr>
+          <w:rFonts w:ascii="Times New Roman" w:hAnsi="Times New Roman" w:cs="Times New Roman"/>
+        </w:rPr>
+        <w:t xml:space="preserve">closer spatial proximity between these watersheds. </w:t>
+      </w:r>
+      <w:r>
+        <w:rPr>
+          <w:rFonts w:ascii="Times New Roman" w:hAnsi="Times New Roman" w:cs="Times New Roman"/>
+        </w:rPr>
+        <w:t xml:space="preserve">This limitation is further illustrated in the confidence threshold analysis, in which we imposed the additional requirement that the model must assign to the correct class with a calibrated probability value above a given threshold. Preforming this analysis on the total dataset resulted in a </w:t>
+      </w:r>
+      <w:ins w:id="130" w:author="Benjamin J. Makhlouf" w:date="2026-03-01T20:18:00Z" w16du:dateUtc="2026-03-02T04:18:00Z">
+        <w:r>
+          <w:rPr>
+            <w:rFonts w:ascii="Times New Roman" w:hAnsi="Times New Roman" w:cs="Times New Roman"/>
+          </w:rPr>
+          <w:t xml:space="preserve">substantial </w:t>
+        </w:r>
+      </w:ins>
+      <w:del w:id="131" w:author="Benjamin J. Makhlouf" w:date="2026-03-01T20:18:00Z" w16du:dateUtc="2026-03-02T04:18:00Z">
+        <w:r>
+          <w:rPr>
+            <w:rFonts w:ascii="Times New Roman" w:hAnsi="Times New Roman" w:cs="Times New Roman"/>
+          </w:rPr>
+          <w:delText xml:space="preserve">significant </w:delText>
+        </w:r>
+      </w:del>
+      <w:r>
+        <w:rPr>
+          <w:rFonts w:ascii="Times New Roman" w:hAnsi="Times New Roman" w:cs="Times New Roman"/>
+        </w:rPr>
+        <w:t xml:space="preserve">decrease in classification accuracy in the Nushagak and Kuskokwim as we increased the threshold probability value. This reflects the fact although the model correctly assigns individuals to these watersheds in most cases, the associated confidence of the model is much </w:t>
+      </w:r>
+      <w:r>
+        <w:rPr>
+          <w:rFonts w:ascii="Times New Roman" w:hAnsi="Times New Roman" w:cs="Times New Roman"/>
+        </w:rPr>
+        <w:t xml:space="preserve">lower for these classes given their similarity in time series shape. </w:t>
+      </w:r>
+      <w:r>
+        <w:rPr>
+          <w:rFonts w:ascii="Times New Roman" w:hAnsi="Times New Roman" w:cs="Times New Roman"/>
+        </w:rPr>
+        <w:t xml:space="preserve">In contrast, Yukon fish exhibited </w:t>
+      </w:r>
+      <w:r>
+        <w:rPr>
+          <w:rFonts w:ascii="Times New Roman" w:hAnsi="Times New Roman" w:cs="Times New Roman"/>
+        </w:rPr>
+        <w:t xml:space="preserve">unique </w:t>
+      </w:r>
+      <w:r>
+        <w:rPr>
+          <w:rFonts w:ascii="Times New Roman" w:hAnsi="Times New Roman" w:cs="Times New Roman"/>
+        </w:rPr>
+        <w:t>patterns</w:t>
+      </w:r>
+      <w:r>
+        <w:rPr>
+          <w:rFonts w:ascii="Times New Roman" w:hAnsi="Times New Roman" w:cs="Times New Roman"/>
+        </w:rPr>
+        <w:t xml:space="preserve"> in otolith LA data</w:t>
+      </w:r>
+      <w:r>
+        <w:rPr>
+          <w:rFonts w:ascii="Times New Roman" w:hAnsi="Times New Roman" w:cs="Times New Roman"/>
+        </w:rPr>
+        <w:t xml:space="preserve"> due to the watershed's extreme spatial scale, broader range of isotope values, and extended migration timing</w:t>
+      </w:r>
+      <w:r>
+        <w:rPr>
+          <w:rFonts w:ascii="Times New Roman" w:hAnsi="Times New Roman" w:cs="Times New Roman"/>
+        </w:rPr>
+        <w:t xml:space="preserve"> (</w:t>
+      </w:r>
+      <w:r>
+        <w:rPr>
+          <w:rFonts w:ascii="Times New Roman" w:hAnsi="Times New Roman" w:cs="Times New Roman"/>
+        </w:rPr>
+        <w:t>Figure 2</w:t>
+      </w:r>
+      <w:r>
+        <w:rPr>
+          <w:rFonts w:ascii="Times New Roman" w:hAnsi="Times New Roman" w:cs="Times New Roman"/>
+        </w:rPr>
+        <w:t>)</w:t>
+      </w:r>
+      <w:r>
+        <w:rPr>
+          <w:rFonts w:ascii="Times New Roman" w:hAnsi="Times New Roman" w:cs="Times New Roman"/>
+        </w:rPr>
+        <w:t xml:space="preserve">. This likely resulted in otolith </w:t>
+      </w:r>
+      <w:r>
+        <w:rPr>
+          <w:rFonts w:ascii="Times New Roman" w:hAnsi="Times New Roman" w:cs="Times New Roman"/>
+        </w:rPr>
+        <w:t>time series</w:t>
+      </w:r>
+      <w:r>
+        <w:rPr>
+          <w:rFonts w:ascii="Times New Roman" w:hAnsi="Times New Roman" w:cs="Times New Roman"/>
+        </w:rPr>
+        <w:t xml:space="preserve"> which were distinct compared to the other watersheds either because of natal origin values</w:t>
+      </w:r>
+      <w:r>
+        <w:rPr>
+          <w:rFonts w:ascii="Times New Roman" w:hAnsi="Times New Roman" w:cs="Times New Roman"/>
+        </w:rPr>
+        <w:t xml:space="preserve"> only found in the Yukon (⁸⁷Sr/⁸⁶Sr &gt; 0.71</w:t>
+      </w:r>
+      <w:r>
+        <w:rPr>
+          <w:rFonts w:ascii="Times New Roman" w:hAnsi="Times New Roman" w:cs="Times New Roman"/>
+        </w:rPr>
+        <w:t>3</w:t>
+      </w:r>
+      <w:r>
+        <w:rPr>
+          <w:rFonts w:ascii="Times New Roman" w:hAnsi="Times New Roman" w:cs="Times New Roman"/>
+        </w:rPr>
+        <w:t>)</w:t>
+      </w:r>
+      <w:r>
+        <w:rPr>
+          <w:rFonts w:ascii="Times New Roman" w:hAnsi="Times New Roman" w:cs="Times New Roman"/>
+        </w:rPr>
+        <w:t xml:space="preserve"> or prominent features </w:t>
+      </w:r>
+      <w:r>
+        <w:rPr>
+          <w:rFonts w:ascii="Times New Roman" w:hAnsi="Times New Roman" w:cs="Times New Roman"/>
+        </w:rPr>
+        <w:t xml:space="preserve">resulting from a longer </w:t>
+      </w:r>
+      <w:r>
+        <w:rPr>
+          <w:rFonts w:ascii="Times New Roman" w:hAnsi="Times New Roman" w:cs="Times New Roman"/>
+        </w:rPr>
+        <w:t xml:space="preserve">migration through the enriched </w:t>
+      </w:r>
+      <w:r>
+        <w:rPr>
+          <w:rFonts w:ascii="Times New Roman" w:hAnsi="Times New Roman" w:cs="Times New Roman"/>
+        </w:rPr>
         <w:lastRenderedPageBreak/>
+        <w:t>mainstem tributary (</w:t>
+      </w:r>
+      <w:proofErr w:type="spellStart"/>
+      <w:r>
+        <w:rPr>
+          <w:rFonts w:ascii="Times New Roman" w:hAnsi="Times New Roman" w:cs="Times New Roman"/>
+        </w:rPr>
+        <w:t>i.e</w:t>
+      </w:r>
+      <w:proofErr w:type="spellEnd"/>
+      <w:r>
+        <w:rPr>
+          <w:rFonts w:ascii="Times New Roman" w:hAnsi="Times New Roman" w:cs="Times New Roman"/>
+        </w:rPr>
+        <w:t xml:space="preserve"> Figure </w:t>
+      </w:r>
+      <w:r>
+        <w:rPr>
+          <w:rFonts w:ascii="Times New Roman" w:hAnsi="Times New Roman" w:cs="Times New Roman"/>
+        </w:rPr>
+        <w:t>3</w:t>
+      </w:r>
+      <w:r>
+        <w:rPr>
+          <w:rFonts w:ascii="Times New Roman" w:hAnsi="Times New Roman" w:cs="Times New Roman"/>
+        </w:rPr>
+        <w:t xml:space="preserve">b, column 3). </w:t>
+      </w:r>
+      <w:r>
+        <w:rPr>
+          <w:rFonts w:ascii="Times New Roman" w:hAnsi="Times New Roman" w:cs="Times New Roman"/>
+        </w:rPr>
+        <w:t xml:space="preserve">Yukon classification accuracy dropped substantially in the </w:t>
+      </w:r>
+      <w:r>
+        <w:rPr>
+          <w:rFonts w:ascii="Times New Roman" w:hAnsi="Times New Roman" w:cs="Times New Roman"/>
+        </w:rPr>
+        <w:t>restricted</w:t>
+      </w:r>
+      <w:r>
+        <w:rPr>
+          <w:rFonts w:ascii="Times New Roman" w:hAnsi="Times New Roman" w:cs="Times New Roman"/>
+        </w:rPr>
+        <w:t xml:space="preserve"> </w:t>
+      </w:r>
+      <w:r>
+        <w:rPr>
+          <w:rFonts w:ascii="Times New Roman" w:hAnsi="Times New Roman" w:cs="Times New Roman"/>
+        </w:rPr>
+        <w:t xml:space="preserve">testing set (86.86% vs. 93.7% in the total testing set), despite similar numbers of misidentified individuals. </w:t>
+      </w:r>
+      <w:r>
+        <w:rPr>
+          <w:rFonts w:ascii="Times New Roman" w:hAnsi="Times New Roman" w:cs="Times New Roman"/>
+        </w:rPr>
+        <w:t xml:space="preserve">This </w:t>
+      </w:r>
+      <w:r>
+        <w:rPr>
+          <w:rFonts w:ascii="Times New Roman" w:hAnsi="Times New Roman" w:cs="Times New Roman"/>
+        </w:rPr>
+        <w:t>decline likely reflects the removal of the most easily classified cases</w:t>
+      </w:r>
+      <w:r>
+        <w:rPr>
+          <w:rFonts w:ascii="Times New Roman" w:hAnsi="Times New Roman" w:cs="Times New Roman"/>
+        </w:rPr>
+        <w:t>, which is further supported by</w:t>
+      </w:r>
+      <w:r>
+        <w:rPr>
+          <w:rFonts w:ascii="Times New Roman" w:hAnsi="Times New Roman" w:cs="Times New Roman"/>
+        </w:rPr>
+        <w:t xml:space="preserve"> </w:t>
+      </w:r>
+      <w:r>
+        <w:rPr>
+          <w:rFonts w:ascii="Times New Roman" w:hAnsi="Times New Roman" w:cs="Times New Roman"/>
+        </w:rPr>
+        <w:t>higher misclassification rates among CWAK individuals compared to those from the middle and upper Yukon regions</w:t>
+      </w:r>
+      <w:r>
+        <w:rPr>
+          <w:rFonts w:ascii="Times New Roman" w:hAnsi="Times New Roman" w:cs="Times New Roman"/>
+        </w:rPr>
+        <w:t xml:space="preserve"> (Supp. Figure </w:t>
+      </w:r>
+      <w:proofErr w:type="gramStart"/>
+      <w:r>
+        <w:rPr>
+          <w:rFonts w:ascii="Times New Roman" w:hAnsi="Times New Roman" w:cs="Times New Roman"/>
+        </w:rPr>
+        <w:t>2 )</w:t>
+      </w:r>
+      <w:proofErr w:type="gramEnd"/>
+      <w:r>
+        <w:rPr>
+          <w:rFonts w:ascii="Times New Roman" w:hAnsi="Times New Roman" w:cs="Times New Roman"/>
+        </w:rPr>
+        <w:t xml:space="preserve">. </w:t>
+      </w:r>
+      <w:r>
+        <w:rPr>
+          <w:rFonts w:ascii="Times New Roman" w:hAnsi="Times New Roman" w:cs="Times New Roman"/>
+        </w:rPr>
+        <w:t>The</w:t>
+      </w:r>
+      <w:r>
+        <w:rPr>
+          <w:rFonts w:ascii="Times New Roman" w:hAnsi="Times New Roman" w:cs="Times New Roman"/>
+        </w:rPr>
+        <w:t xml:space="preserve">se </w:t>
+      </w:r>
+      <w:r>
+        <w:rPr>
+          <w:rFonts w:ascii="Times New Roman" w:hAnsi="Times New Roman" w:cs="Times New Roman"/>
+        </w:rPr>
+        <w:t xml:space="preserve">challenges </w:t>
+      </w:r>
+      <w:r>
+        <w:rPr>
+          <w:rFonts w:ascii="Times New Roman" w:hAnsi="Times New Roman" w:cs="Times New Roman"/>
+        </w:rPr>
+        <w:t xml:space="preserve">likely stem </w:t>
+      </w:r>
+      <w:r>
+        <w:rPr>
+          <w:rFonts w:ascii="Times New Roman" w:hAnsi="Times New Roman" w:cs="Times New Roman"/>
+        </w:rPr>
+        <w:t>from shorter migration patterns that include less residence time in the mainstem Yukon River</w:t>
+      </w:r>
+      <w:r>
+        <w:rPr>
+          <w:rFonts w:ascii="Times New Roman" w:hAnsi="Times New Roman" w:cs="Times New Roman"/>
+        </w:rPr>
+        <w:t>, and, subsequently, a</w:t>
+      </w:r>
+      <w:r>
+        <w:rPr>
+          <w:rFonts w:ascii="Times New Roman" w:hAnsi="Times New Roman" w:cs="Times New Roman"/>
+        </w:rPr>
+        <w:t xml:space="preserve"> less pronounced increase in isotope values before marine entry</w:t>
+      </w:r>
+      <w:r>
+        <w:rPr>
+          <w:rFonts w:ascii="Times New Roman" w:hAnsi="Times New Roman" w:cs="Times New Roman"/>
+        </w:rPr>
+        <w:t xml:space="preserve">. </w:t>
+      </w:r>
+      <w:r>
+        <w:rPr>
+          <w:rFonts w:ascii="Times New Roman" w:hAnsi="Times New Roman" w:cs="Times New Roman"/>
+        </w:rPr>
+        <w:t xml:space="preserve">Without this distinguishing feature, CWAK individuals from the Yukon (i.e. Figure </w:t>
+      </w:r>
+      <w:r>
+        <w:rPr>
+          <w:rFonts w:ascii="Times New Roman" w:hAnsi="Times New Roman" w:cs="Times New Roman"/>
+        </w:rPr>
+        <w:t>3</w:t>
+      </w:r>
+      <w:r>
+        <w:rPr>
+          <w:rFonts w:ascii="Times New Roman" w:hAnsi="Times New Roman" w:cs="Times New Roman"/>
+        </w:rPr>
+        <w:t>b, column 4) are more likely to be misclassified with Kuskokwim or Nushagak fish, resulting in lower overall accuracy.</w:t>
+      </w:r>
+      <w:r>
+        <w:rPr>
+          <w:rFonts w:ascii="Times New Roman" w:hAnsi="Times New Roman" w:cs="Times New Roman"/>
+        </w:rPr>
+        <w:t xml:space="preserve"> </w:t>
+      </w:r>
+      <w:r>
+        <w:rPr>
+          <w:rFonts w:ascii="Times New Roman" w:hAnsi="Times New Roman" w:cs="Times New Roman"/>
+        </w:rPr>
+        <w:t xml:space="preserve">Nonetheless, even applying the most conservative </w:t>
+      </w:r>
+      <w:r>
+        <w:rPr>
+          <w:rFonts w:ascii="Times New Roman" w:hAnsi="Times New Roman" w:cs="Times New Roman"/>
+        </w:rPr>
+        <w:t xml:space="preserve">methods (90% confidence threshold on the restricted </w:t>
+      </w:r>
+      <w:proofErr w:type="gramStart"/>
+      <w:r>
+        <w:rPr>
+          <w:rFonts w:ascii="Times New Roman" w:hAnsi="Times New Roman" w:cs="Times New Roman"/>
+        </w:rPr>
+        <w:t>dataset</w:t>
+      </w:r>
+      <w:r>
+        <w:rPr>
+          <w:rFonts w:ascii="Times New Roman" w:hAnsi="Times New Roman" w:cs="Times New Roman"/>
+        </w:rPr>
+        <w:t xml:space="preserve"> </w:t>
+      </w:r>
+      <w:r>
+        <w:rPr>
+          <w:rFonts w:ascii="Times New Roman" w:hAnsi="Times New Roman" w:cs="Times New Roman"/>
+        </w:rPr>
+        <w:t>)</w:t>
+      </w:r>
+      <w:proofErr w:type="gramEnd"/>
+      <w:r>
+        <w:rPr>
+          <w:rFonts w:ascii="Times New Roman" w:hAnsi="Times New Roman" w:cs="Times New Roman"/>
+        </w:rPr>
+        <w:t xml:space="preserve"> we achieved 78% classification accuracy across all three datasets.</w:t>
+      </w:r>
+      <w:r>
+        <w:rPr>
+          <w:rFonts w:ascii="Times New Roman" w:hAnsi="Times New Roman" w:cs="Times New Roman"/>
+        </w:rPr>
+        <w:t xml:space="preserve"> </w:t>
+      </w:r>
+    </w:p>
+    <w:p>
+      <w:pPr>
+        <w:spacing w:line="480" w:lineRule="auto"/>
+        <w:ind w:firstLine="720"/>
+        <w:rPr>
+          <w:rFonts w:ascii="Times New Roman" w:hAnsi="Times New Roman" w:cs="Times New Roman"/>
+        </w:rPr>
+      </w:pPr>
+      <w:r>
+        <w:rPr>
+          <w:rFonts w:ascii="Times New Roman" w:hAnsi="Times New Roman" w:cs="Times New Roman"/>
+        </w:rPr>
         <w:t>In addition to the ability to distinguish among major watersheds, t</w:t>
       </w:r>
       <w:r>
@@ -8890,7 +9160,7 @@
       <w:r>
         <w:t xml:space="preserve">of hypotheses of declining population health by allowing for an explicit assessment of marine mortality on stock specific health. </w:t>
       </w:r>
-      <w:bookmarkStart w:id="92" w:name="_Hlk223339650"/>
+      <w:bookmarkStart w:id="132" w:name="_Hlk223339650"/>
       <w:r>
         <w:t xml:space="preserve">The </w:t>
       </w:r>
@@ -8924,7 +9194,7 @@
       <w:r>
         <w:t xml:space="preserve"> </w:t>
       </w:r>
-      <w:ins w:id="93" w:author="Benjamin J. Makhlouf" w:date="2026-03-02T10:14:00Z" w16du:dateUtc="2026-03-02T18:14:00Z">
+      <w:ins w:id="133" w:author="Benjamin J. Makhlouf" w:date="2026-03-02T10:14:00Z" w16du:dateUtc="2026-03-02T18:14:00Z">
         <w:r>
           <w:t xml:space="preserve">a </w:t>
         </w:r>
@@ -8932,7 +9202,7 @@
       <w:r>
         <w:t xml:space="preserve">calibrated </w:t>
       </w:r>
-      <w:ins w:id="94" w:author="Benjamin J. Makhlouf" w:date="2026-03-02T10:14:00Z" w16du:dateUtc="2026-03-02T18:14:00Z">
+      <w:ins w:id="134" w:author="Benjamin J. Makhlouf" w:date="2026-03-02T10:14:00Z" w16du:dateUtc="2026-03-02T18:14:00Z">
         <w:r>
           <w:t xml:space="preserve">classification model that </w:t>
         </w:r>
@@ -8943,60 +9213,230 @@
       <w:r>
         <w:t>s</w:t>
       </w:r>
-      <w:bookmarkEnd w:id="92"/>
+      <w:bookmarkEnd w:id="132"/>
       <w:r>
         <w:t xml:space="preserve">. </w:t>
       </w:r>
       <w:r>
-        <w:t xml:space="preserve">Our dataset is unusually large for its type and includes samples collected across several years and from nearly all parts of the sampled watersheds. As such, we expect it to be broadly representative of the natural variability among years, and that the model presented here will </w:t>
-      </w:r>
-      <w:r>
-        <w:lastRenderedPageBreak/>
-        <w:t xml:space="preserve">generalize well to new years of data. However, due to sample size constraints we did not include a true validation set from a year excluded from the training and testing data, leaving open the possibility that some degree of overfitting to this dataset could affect assignment accuracy for unseen years. </w:t>
+        <w:t xml:space="preserve">Our dataset is unusually large for its type and includes samples collected across several years and from nearly all parts of the sampled watersheds. As such, we expect it to be broadly representative of the natural variability among years, and that the model presented here will generalize well to new years of data. However, due to sample size constraints we did not include a true validation set from a year excluded from the training and testing data, leaving open the possibility that some degree of overfitting to this dataset could affect assignment accuracy for unseen years. </w:t>
       </w:r>
       <w:r>
         <w:rPr>
           <w:highlight w:val="yellow"/>
-          <w:rPrChange w:id="95" w:author="Benjamin J. Makhlouf" w:date="2026-03-02T10:25:00Z" w16du:dateUtc="2026-03-02T18:25:00Z">
+          <w:rPrChange w:id="135" w:author="Benjamin J. Makhlouf" w:date="2026-03-02T10:25:00Z" w16du:dateUtc="2026-03-02T18:25:00Z">
             <w:rPr/>
           </w:rPrChange>
         </w:rPr>
         <w:t>During exploratory analyses, we conducted a preliminary cross-year validation in which one year of Yukon data was withheld in each run and used as a validation set.</w:t>
       </w:r>
       <w:r>
-        <w:t xml:space="preserve"> Classification accuracy across years was generally consistent with testing performance, except for 2019, which performed moderately worse, possibly due to differences in sample preparation or data quality. While these preliminary results were not included in the final </w:t>
-      </w:r>
-      <w:proofErr w:type="gramStart"/>
-      <w:r>
-        <w:t>analysis</w:t>
-      </w:r>
-      <w:proofErr w:type="gramEnd"/>
-      <w:r>
-        <w:t xml:space="preserve"> they support the potential for this model to generalize to new years of data, </w:t>
-      </w:r>
-      <w:r>
-        <w:t xml:space="preserve">which we plan to further evaluate as additional, currently unprocessed years of otolith data become available. </w:t>
-      </w:r>
-      <w:r>
-        <w:t xml:space="preserve">Additionally, sample preparation procedures and </w:t>
-      </w:r>
-      <w:r>
-        <w:t xml:space="preserve">LA-ICPMS </w:t>
-      </w:r>
-      <w:r>
-        <w:t>specifications may vary among research groups, which could complicate direct comparisons between our dataset and others.</w:t>
-      </w:r>
-      <w:r>
-        <w:t xml:space="preserve"> </w:t>
-      </w:r>
-      <w:r>
-        <w:t xml:space="preserve">This consideration also applies to analyses of juvenile Chinook salmon, which should display comparable isotopic patterns </w:t>
-      </w:r>
-      <w:r>
-        <w:t xml:space="preserve">given that </w:t>
-      </w:r>
-      <w:r>
-        <w:t xml:space="preserve">our model used only the freshwater region of the otolith. Nevertheless, differences in analytical approaches, particularly when working with much smaller otoliths, could influence results, and this assumption should be evaluated before large-scale application. Despite these caveats, we expect the patterns identified here to be robust across similar data types, particularly when paired with advanced time-series methods </w:t>
+        <w:t xml:space="preserve"> Classification accuracy across years was generally consistent with testing performance, except for 2019, which performed moderately worse</w:t>
+      </w:r>
+      <w:ins w:id="136" w:author="Benjamin J. Makhlouf" w:date="2026-03-03T13:50:00Z" w16du:dateUtc="2026-03-03T21:50:00Z">
+        <w:r>
+          <w:t xml:space="preserve">. This </w:t>
+        </w:r>
+      </w:ins>
+      <w:ins w:id="137" w:author="Benjamin J. Makhlouf" w:date="2026-03-03T13:51:00Z" w16du:dateUtc="2026-03-03T21:51:00Z">
+        <w:r>
+          <w:t>discrepancy</w:t>
+        </w:r>
+      </w:ins>
+      <w:ins w:id="138" w:author="Benjamin J. Makhlouf" w:date="2026-03-03T13:50:00Z" w16du:dateUtc="2026-03-03T21:50:00Z">
+        <w:r>
+          <w:t xml:space="preserve"> could be due to several sources</w:t>
+        </w:r>
+      </w:ins>
+      <w:ins w:id="139" w:author="Benjamin J. Makhlouf" w:date="2026-03-03T13:53:00Z" w16du:dateUtc="2026-03-03T21:53:00Z">
+        <w:r>
+          <w:t>. F</w:t>
+        </w:r>
+      </w:ins>
+      <w:ins w:id="140" w:author="Benjamin J. Makhlouf" w:date="2026-03-03T13:51:00Z" w16du:dateUtc="2026-03-03T21:51:00Z">
+        <w:r>
+          <w:t>or example, sample preparation across this dataset was undertaken across several years and by several technicians. It is possible that preparation in this year resulted in quality that varied from other</w:t>
+        </w:r>
+      </w:ins>
+      <w:ins w:id="141" w:author="Benjamin J. Makhlouf" w:date="2026-03-03T13:52:00Z" w16du:dateUtc="2026-03-03T21:52:00Z">
+        <w:r>
+          <w:t xml:space="preserve"> years. Alternatively, the spatial composition of the 2019 Kuskokwim Chinook salmon return year may have been meaningfully different from other years, meaning the model was </w:t>
+        </w:r>
+      </w:ins>
+      <w:ins w:id="142" w:author="Benjamin J. Makhlouf" w:date="2026-03-03T13:53:00Z" w16du:dateUtc="2026-03-03T21:53:00Z">
+        <w:r>
+          <w:t xml:space="preserve">asked to classify several patterns with low training representation. </w:t>
+        </w:r>
+      </w:ins>
+      <w:del w:id="143" w:author="Benjamin J. Makhlouf" w:date="2026-03-03T13:50:00Z" w16du:dateUtc="2026-03-03T21:50:00Z">
+        <w:r>
+          <w:delText xml:space="preserve">, </w:delText>
+        </w:r>
+      </w:del>
+      <w:del w:id="144" w:author="Benjamin J. Makhlouf" w:date="2026-03-03T13:53:00Z" w16du:dateUtc="2026-03-03T21:53:00Z">
+        <w:r>
+          <w:delText xml:space="preserve">possibly due to differences in sample preparation or data quality. </w:delText>
+        </w:r>
+      </w:del>
+      <w:r>
+        <w:t xml:space="preserve">While these preliminary </w:t>
+      </w:r>
+      <w:r>
+        <w:lastRenderedPageBreak/>
+        <w:t>results were not included in the final analysis</w:t>
+      </w:r>
+      <w:ins w:id="145" w:author="Benjamin J. Makhlouf" w:date="2026-03-03T13:54:00Z" w16du:dateUtc="2026-03-03T21:54:00Z">
+        <w:r>
+          <w:t xml:space="preserve">, these and other considerations support the need for model validation on datasets which are not </w:t>
+        </w:r>
+      </w:ins>
+      <w:ins w:id="146" w:author="Benjamin J. Makhlouf" w:date="2026-03-03T13:55:00Z" w16du:dateUtc="2026-03-03T21:55:00Z">
+        <w:r>
+          <w:t xml:space="preserve">included </w:t>
+        </w:r>
+      </w:ins>
+      <w:ins w:id="147" w:author="Benjamin J. Makhlouf" w:date="2026-03-03T13:58:00Z" w16du:dateUtc="2026-03-03T21:58:00Z">
+        <w:r>
+          <w:t xml:space="preserve">in model training. </w:t>
+        </w:r>
+      </w:ins>
+      <w:ins w:id="148" w:author="Benjamin J. Makhlouf" w:date="2026-03-03T13:59:00Z" w16du:dateUtc="2026-03-03T21:59:00Z">
+        <w:r>
+          <w:t>V</w:t>
+        </w:r>
+      </w:ins>
+      <w:ins w:id="149" w:author="Benjamin J. Makhlouf" w:date="2026-03-03T13:55:00Z" w16du:dateUtc="2026-03-03T21:55:00Z">
+        <w:r>
+          <w:t>ariation in sample preparation</w:t>
+        </w:r>
+      </w:ins>
+      <w:ins w:id="150" w:author="Benjamin J. Makhlouf" w:date="2026-03-03T13:56:00Z" w16du:dateUtc="2026-03-03T21:56:00Z">
+        <w:r>
+          <w:t xml:space="preserve"> or </w:t>
+        </w:r>
+      </w:ins>
+      <w:ins w:id="151" w:author="Benjamin J. Makhlouf" w:date="2026-03-03T13:55:00Z" w16du:dateUtc="2026-03-03T21:55:00Z">
+        <w:r>
+          <w:t>LA-ICPMS specifications among research groups</w:t>
+        </w:r>
+      </w:ins>
+      <w:ins w:id="152" w:author="Benjamin J. Makhlouf" w:date="2026-03-03T13:59:00Z" w16du:dateUtc="2026-03-03T21:59:00Z">
+        <w:r>
+          <w:t xml:space="preserve"> could lead variable classification accuracy compared to the values demonstrated here. </w:t>
+        </w:r>
+        <w:r>
+          <w:t>This consideration also applies to analyses of juvenile Chinook salmon, which should display comparable isotopic patterns given that our model used only the freshwater region of the otolith. Nevertheless, differences in analytical approaches, particularly when working with much smaller otoliths, could influence results, and this assumption should be evaluated before large-scale application.</w:t>
+        </w:r>
+      </w:ins>
+      <w:ins w:id="153" w:author="Benjamin J. Makhlouf" w:date="2026-03-03T14:00:00Z" w16du:dateUtc="2026-03-03T22:00:00Z">
+        <w:r>
+          <w:t xml:space="preserve"> </w:t>
+        </w:r>
+      </w:ins>
+      <w:ins w:id="154" w:author="Benjamin J. Makhlouf" w:date="2026-03-03T13:56:00Z" w16du:dateUtc="2026-03-03T21:56:00Z">
+        <w:r>
+          <w:t xml:space="preserve">The overall performance of the model across year/watershed combinations in our dataset </w:t>
+        </w:r>
+      </w:ins>
+      <w:ins w:id="155" w:author="Benjamin J. Makhlouf" w:date="2026-03-03T13:57:00Z" w16du:dateUtc="2026-03-03T21:57:00Z">
+        <w:r>
+          <w:t xml:space="preserve">do support the </w:t>
+        </w:r>
+      </w:ins>
+      <w:del w:id="156" w:author="Benjamin J. Makhlouf" w:date="2026-03-03T13:57:00Z" w16du:dateUtc="2026-03-03T21:57:00Z">
+        <w:r>
+          <w:delText xml:space="preserve"> they support the </w:delText>
+        </w:r>
+      </w:del>
+      <w:r>
+        <w:t>potential for this model to generalize to new years of data</w:t>
+      </w:r>
+      <w:ins w:id="157" w:author="Benjamin J. Makhlouf" w:date="2026-03-03T13:57:00Z" w16du:dateUtc="2026-03-03T21:57:00Z">
+        <w:r>
+          <w:t xml:space="preserve">. </w:t>
+        </w:r>
+      </w:ins>
+      <w:ins w:id="158" w:author="Benjamin J. Makhlouf" w:date="2026-03-03T14:01:00Z" w16du:dateUtc="2026-03-03T22:01:00Z">
+        <w:r>
+          <w:t xml:space="preserve">Further, performance of 2022 Kuskokwim samples, which were processed at a different laboratory than all other samples, is comparable to </w:t>
+        </w:r>
+      </w:ins>
+      <w:ins w:id="159" w:author="Benjamin J. Makhlouf" w:date="2026-03-03T14:02:00Z" w16du:dateUtc="2026-03-03T22:02:00Z">
+        <w:r>
+          <w:t>performance across the dataset (ref supp.). These results suggest the ability for the model to reliably classify despite lab-specific variability in laser ablation data.</w:t>
+        </w:r>
+      </w:ins>
+      <w:ins w:id="160" w:author="Benjamin J. Makhlouf" w:date="2026-03-03T14:03:00Z" w16du:dateUtc="2026-03-03T22:03:00Z">
+        <w:r>
+          <w:t xml:space="preserve"> </w:t>
+        </w:r>
+      </w:ins>
+      <w:ins w:id="161" w:author="Benjamin J. Makhlouf" w:date="2026-03-03T13:57:00Z" w16du:dateUtc="2026-03-03T21:57:00Z">
+        <w:r>
+          <w:t xml:space="preserve">However, </w:t>
+        </w:r>
+      </w:ins>
+      <w:del w:id="162" w:author="Benjamin J. Makhlouf" w:date="2026-03-03T13:57:00Z" w16du:dateUtc="2026-03-03T21:57:00Z">
+        <w:r>
+          <w:delText xml:space="preserve">, </w:delText>
+        </w:r>
+        <w:r>
+          <w:delText>which</w:delText>
+        </w:r>
+      </w:del>
+      <w:r>
+        <w:t xml:space="preserve"> we plan to further </w:t>
+      </w:r>
+      <w:ins w:id="163" w:author="Benjamin J. Makhlouf" w:date="2026-03-03T13:57:00Z" w16du:dateUtc="2026-03-03T21:57:00Z">
+        <w:r>
+          <w:t>evaluate</w:t>
+        </w:r>
+        <w:r>
+          <w:t xml:space="preserve"> this performance </w:t>
+        </w:r>
+      </w:ins>
+      <w:del w:id="164" w:author="Benjamin J. Makhlouf" w:date="2026-03-03T13:57:00Z" w16du:dateUtc="2026-03-03T21:57:00Z">
+        <w:r>
+          <w:delText xml:space="preserve">evaluate </w:delText>
+        </w:r>
+      </w:del>
+      <w:r>
+        <w:t xml:space="preserve">as additional, currently unprocessed years of otolith data become available. </w:t>
+      </w:r>
+      <w:del w:id="165" w:author="Benjamin J. Makhlouf" w:date="2026-03-03T13:57:00Z" w16du:dateUtc="2026-03-03T21:57:00Z">
+        <w:r>
+          <w:delText xml:space="preserve">Additionally, sample preparation procedures and </w:delText>
+        </w:r>
+        <w:r>
+          <w:delText xml:space="preserve">LA-ICPMS </w:delText>
+        </w:r>
+        <w:r>
+          <w:delText>specifications may vary among research groups, which could complicate direct comparisons between our dataset and others.</w:delText>
+        </w:r>
+        <w:r>
+          <w:delText xml:space="preserve"> </w:delText>
+        </w:r>
+      </w:del>
+      <w:del w:id="166" w:author="Benjamin J. Makhlouf" w:date="2026-03-03T13:58:00Z" w16du:dateUtc="2026-03-03T21:58:00Z">
+        <w:r>
+          <w:delText xml:space="preserve">This consideration also applies to analyses of juvenile Chinook salmon, which should display comparable isotopic patterns </w:delText>
+        </w:r>
+        <w:r>
+          <w:delText xml:space="preserve">given that </w:delText>
+        </w:r>
+        <w:r>
+          <w:delText xml:space="preserve">our model used only the freshwater region of the otolith. Nevertheless, differences in analytical approaches, particularly when working with much smaller otoliths, could influence results, and this assumption should be evaluated before large-scale application. </w:delText>
+        </w:r>
+      </w:del>
+      <w:r>
+        <w:t xml:space="preserve">Despite these caveats, we expect the </w:t>
+      </w:r>
+      <w:ins w:id="167" w:author="Benjamin J. Makhlouf" w:date="2026-03-03T14:00:00Z" w16du:dateUtc="2026-03-03T22:00:00Z">
+        <w:r>
+          <w:t xml:space="preserve">broad </w:t>
+        </w:r>
+      </w:ins>
+      <w:r>
+        <w:t xml:space="preserve">patterns identified here to be robust across similar data types, particularly when paired with advanced time-series methods </w:t>
       </w:r>
       <w:r>
         <w:t xml:space="preserve">(ex. </w:t>
@@ -9022,12 +9462,12 @@
       <w:r>
         <w:fldChar w:fldCharType="end"/>
       </w:r>
-      <w:ins w:id="96" w:author="Benjamin J. Makhlouf" w:date="2026-03-02T10:27:00Z" w16du:dateUtc="2026-03-02T18:27:00Z">
+      <w:ins w:id="168" w:author="Benjamin J. Makhlouf" w:date="2026-03-02T10:27:00Z" w16du:dateUtc="2026-03-02T18:27:00Z">
         <w:r>
           <w:t xml:space="preserve"> </w:t>
         </w:r>
       </w:ins>
-      <w:del w:id="97" w:author="Benjamin J. Makhlouf" w:date="2026-03-02T10:25:00Z" w16du:dateUtc="2026-03-02T18:25:00Z">
+      <w:del w:id="169" w:author="Benjamin J. Makhlouf" w:date="2026-03-02T10:25:00Z" w16du:dateUtc="2026-03-02T18:25:00Z">
         <w:r>
           <w:delText>(Arai et al., 2025 (</w:delText>
         </w:r>
@@ -9109,26 +9549,26 @@
         <w:t xml:space="preserve">class estimates with </w:t>
       </w:r>
       <w:r>
-        <w:t xml:space="preserve">a true measure of </w:t>
+        <w:t xml:space="preserve">a true measure of model uncertainty. </w:t>
+      </w:r>
+      <w:r>
+        <w:t xml:space="preserve">In turn, </w:t>
+      </w:r>
+      <w:r>
+        <w:t xml:space="preserve">managers </w:t>
+      </w:r>
+      <w:r>
+        <w:t xml:space="preserve">or decision makers may use </w:t>
+      </w:r>
+      <w:r>
+        <w:t xml:space="preserve">the result of the models presented here to make decisions based on flexible </w:t>
+      </w:r>
+      <w:r>
+        <w:t xml:space="preserve">thresholds of misassignment risk which more </w:t>
       </w:r>
       <w:r>
         <w:lastRenderedPageBreak/>
-        <w:t xml:space="preserve">model uncertainty. </w:t>
-      </w:r>
-      <w:r>
-        <w:t xml:space="preserve">In turn, </w:t>
-      </w:r>
-      <w:r>
-        <w:t xml:space="preserve">managers </w:t>
-      </w:r>
-      <w:r>
-        <w:t xml:space="preserve">or decision makers may use </w:t>
-      </w:r>
-      <w:r>
-        <w:t xml:space="preserve">the result of the models presented here to make decisions based on flexible </w:t>
-      </w:r>
-      <w:r>
-        <w:t xml:space="preserve">thresholds of misassignment risk which more accurately </w:t>
+        <w:t xml:space="preserve">accurately </w:t>
       </w:r>
       <w:r>
         <w:t xml:space="preserve">consider </w:t>
@@ -9196,7 +9636,7 @@
       <w:r>
         <w:t xml:space="preserve"> limited for in-season management or rapid research applications. Otolith LA-ICPMS is costly and labor-intensive, making large-scale, real-time assessment of river origin for marine-caught samples impractical. Moreover, otolith collection is lethal, which may be prohibitive given the increasingly endangered status of Chinook salmon in this region</w:t>
       </w:r>
-      <w:ins w:id="98" w:author="Benjamin J. Makhlouf" w:date="2026-03-02T10:29:00Z" w16du:dateUtc="2026-03-02T18:29:00Z">
+      <w:ins w:id="170" w:author="Benjamin J. Makhlouf" w:date="2026-03-02T10:29:00Z" w16du:dateUtc="2026-03-02T18:29:00Z">
         <w:r>
           <w:t xml:space="preserve"> </w:t>
         </w:r>
@@ -9308,38 +9748,38 @@
         <w:rPr>
           <w:rFonts w:ascii="Times New Roman" w:hAnsi="Times New Roman" w:cs="Times New Roman"/>
         </w:rPr>
-        <w:t xml:space="preserve"> In this case, enabling river-basin scale determination of provenance for marine-caught Chinook salmon allows managers to connect region-wide salmon population patterns with river-specific </w:t>
+        <w:t xml:space="preserve"> In this case, enabling river-basin scale determination of provenance for marine-caught Chinook salmon allows managers to connect region-wide salmon population patterns with river-specific population health. </w:t>
+      </w:r>
+      <w:r>
+        <w:rPr>
+          <w:rFonts w:ascii="Times New Roman" w:hAnsi="Times New Roman" w:cs="Times New Roman"/>
+        </w:rPr>
+        <w:t xml:space="preserve">Doing so may allow </w:t>
+      </w:r>
+      <w:r>
+        <w:rPr>
+          <w:rFonts w:ascii="Times New Roman" w:hAnsi="Times New Roman" w:cs="Times New Roman"/>
+        </w:rPr>
+        <w:t xml:space="preserve">researchers </w:t>
+      </w:r>
+      <w:r>
+        <w:rPr>
+          <w:rFonts w:ascii="Times New Roman" w:hAnsi="Times New Roman" w:cs="Times New Roman"/>
+        </w:rPr>
+        <w:t>to</w:t>
+      </w:r>
+      <w:r>
+        <w:rPr>
+          <w:rFonts w:ascii="Times New Roman" w:hAnsi="Times New Roman" w:cs="Times New Roman"/>
+        </w:rPr>
+        <w:t xml:space="preserve"> better understand how ecosystem processes at several spatial scales and across ecosystems are interconnected to informing overall ecosystem </w:t>
       </w:r>
       <w:r>
         <w:rPr>
           <w:rFonts w:ascii="Times New Roman" w:hAnsi="Times New Roman" w:cs="Times New Roman"/>
         </w:rPr>
         <w:lastRenderedPageBreak/>
-        <w:t xml:space="preserve">population health. </w:t>
-      </w:r>
-      <w:r>
-        <w:rPr>
-          <w:rFonts w:ascii="Times New Roman" w:hAnsi="Times New Roman" w:cs="Times New Roman"/>
-        </w:rPr>
-        <w:t xml:space="preserve">Doing so may allow </w:t>
-      </w:r>
-      <w:r>
-        <w:rPr>
-          <w:rFonts w:ascii="Times New Roman" w:hAnsi="Times New Roman" w:cs="Times New Roman"/>
-        </w:rPr>
-        <w:t xml:space="preserve">researchers </w:t>
-      </w:r>
-      <w:r>
-        <w:rPr>
-          <w:rFonts w:ascii="Times New Roman" w:hAnsi="Times New Roman" w:cs="Times New Roman"/>
-        </w:rPr>
-        <w:t>to</w:t>
-      </w:r>
-      <w:r>
-        <w:rPr>
-          <w:rFonts w:ascii="Times New Roman" w:hAnsi="Times New Roman" w:cs="Times New Roman"/>
-        </w:rPr>
-        <w:t xml:space="preserve"> better understand how ecosystem processes at several spatial scales and across ecosystems are interconnected to informing overall ecosystem health. </w:t>
+        <w:t xml:space="preserve">health. </w:t>
       </w:r>
       <w:r>
         <w:rPr>
@@ -9379,7 +9819,13 @@
         <w:ind w:firstLine="720"/>
         <w:outlineLvl w:val="1"/>
         <w:rPr>
-          <w:rFonts w:ascii="Times New Roman" w:hAnsi="Times New Roman" w:cs="Times New Roman"/>
+          <w:color w:val="222222"/>
+          <w:shd w:val="clear" w:color="auto" w:fill="FFFFFF"/>
+          <w:rPrChange w:id="171" w:author="Benjamin J. Makhlouf" w:date="2026-03-03T12:20:00Z" w16du:dateUtc="2026-03-03T20:20:00Z">
+            <w:rPr>
+              <w:rFonts w:ascii="Times New Roman" w:hAnsi="Times New Roman" w:cs="Times New Roman"/>
+            </w:rPr>
+          </w:rPrChange>
         </w:rPr>
       </w:pPr>
       <w:r>
@@ -9402,7 +9848,32 @@
           <w:color w:val="222222"/>
           <w:shd w:val="clear" w:color="auto" w:fill="FFFFFF"/>
         </w:rPr>
-        <w:t>not possible without the efforts of Dr. Sean Brennan, who motivated much of the data collection used in this study, and </w:t>
+        <w:t>not possible without the efforts of Dr. Sean Brennan, who motivated much of the data collection used in this study</w:t>
+      </w:r>
+      <w:ins w:id="172" w:author="Benjamin J. Makhlouf" w:date="2026-03-03T12:18:00Z" w16du:dateUtc="2026-03-03T20:18:00Z">
+        <w:r>
+          <w:rPr>
+            <w:color w:val="222222"/>
+            <w:shd w:val="clear" w:color="auto" w:fill="FFFFFF"/>
+          </w:rPr>
+          <w:t xml:space="preserve"> </w:t>
+        </w:r>
+      </w:ins>
+      <w:del w:id="173" w:author="Benjamin J. Makhlouf" w:date="2026-03-03T12:18:00Z" w16du:dateUtc="2026-03-03T20:18:00Z">
+        <w:r>
+          <w:rPr>
+            <w:color w:val="222222"/>
+            <w:shd w:val="clear" w:color="auto" w:fill="FFFFFF"/>
+          </w:rPr>
+          <w:delText xml:space="preserve">, </w:delText>
+        </w:r>
+      </w:del>
+      <w:r>
+        <w:rPr>
+          <w:color w:val="222222"/>
+          <w:shd w:val="clear" w:color="auto" w:fill="FFFFFF"/>
+        </w:rPr>
+        <w:t>and </w:t>
       </w:r>
       <w:r>
         <w:rPr>
@@ -9432,7 +9903,23 @@
           <w:color w:val="222222"/>
           <w:shd w:val="clear" w:color="auto" w:fill="FFFFFF"/>
         </w:rPr>
-        <w:t>for ecological research in Alaska. We thank the University of Washington’s eScience Institute Data Science and AI Accelerator program, which provided significant mentorship and resources to a</w:t>
+        <w:t>for ecological research</w:t>
+      </w:r>
+      <w:del w:id="174" w:author="Benjamin J. Makhlouf" w:date="2026-03-03T12:18:00Z" w16du:dateUtc="2026-03-03T20:18:00Z">
+        <w:r>
+          <w:rPr>
+            <w:color w:val="222222"/>
+            <w:shd w:val="clear" w:color="auto" w:fill="FFFFFF"/>
+          </w:rPr>
+          <w:delText xml:space="preserve"> in Alaska</w:delText>
+        </w:r>
+      </w:del>
+      <w:r>
+        <w:rPr>
+          <w:color w:val="222222"/>
+          <w:shd w:val="clear" w:color="auto" w:fill="FFFFFF"/>
+        </w:rPr>
+        <w:t>. We thank the University of Washington’s eScience Institute Data Science and AI Accelerator program, which provided significant mentorship and resources to a</w:t>
       </w:r>
       <w:r>
         <w:rPr>
@@ -9447,7 +9934,23 @@
           <w:color w:val="222222"/>
           <w:shd w:val="clear" w:color="auto" w:fill="FFFFFF"/>
         </w:rPr>
-        <w:t>this project. We thank the efforts of Alaska </w:t>
+        <w:t xml:space="preserve">this project. We </w:t>
+      </w:r>
+      <w:ins w:id="175" w:author="Benjamin J. Makhlouf" w:date="2026-03-03T12:18:00Z" w16du:dateUtc="2026-03-03T20:18:00Z">
+        <w:r>
+          <w:rPr>
+            <w:color w:val="222222"/>
+            <w:shd w:val="clear" w:color="auto" w:fill="FFFFFF"/>
+          </w:rPr>
+          <w:t xml:space="preserve">also </w:t>
+        </w:r>
+      </w:ins>
+      <w:r>
+        <w:rPr>
+          <w:color w:val="222222"/>
+          <w:shd w:val="clear" w:color="auto" w:fill="FFFFFF"/>
+        </w:rPr>
+        <w:t>thank the efforts of Alaska </w:t>
       </w:r>
       <w:r>
         <w:rPr>
@@ -9591,7 +10094,50 @@
           <w:color w:val="222222"/>
           <w:shd w:val="clear" w:color="auto" w:fill="FFFFFF"/>
         </w:rPr>
-        <w:t>this study. This work w</w:t>
+        <w:t xml:space="preserve">this study. </w:t>
+      </w:r>
+      <w:ins w:id="176" w:author="Benjamin J. Makhlouf" w:date="2026-03-03T12:19:00Z" w16du:dateUtc="2026-03-03T20:19:00Z">
+        <w:r>
+          <w:rPr>
+            <w:color w:val="222222"/>
+            <w:shd w:val="clear" w:color="auto" w:fill="FFFFFF"/>
+          </w:rPr>
+          <w:t>The University of Utah Strontium Metals lab have been longstanding partners in performing laser ablation and consulting on L</w:t>
+        </w:r>
+      </w:ins>
+      <w:ins w:id="177" w:author="Benjamin J. Makhlouf" w:date="2026-03-03T12:20:00Z" w16du:dateUtc="2026-03-03T20:20:00Z">
+        <w:r>
+          <w:rPr>
+            <w:color w:val="222222"/>
+            <w:shd w:val="clear" w:color="auto" w:fill="FFFFFF"/>
+          </w:rPr>
+          <w:t>A-ICPMS data, and we thank them for their continued support and contribution to producing this dataset.</w:t>
+        </w:r>
+      </w:ins>
+      <w:ins w:id="178" w:author="Benjamin J. Makhlouf" w:date="2026-03-03T12:21:00Z" w16du:dateUtc="2026-03-03T20:21:00Z">
+        <w:r>
+          <w:rPr>
+            <w:color w:val="222222"/>
+            <w:shd w:val="clear" w:color="auto" w:fill="FFFFFF"/>
+          </w:rPr>
+          <w:t xml:space="preserve"> We also acknowledge the Keck lab at Oregon State University for their support and guidance.</w:t>
+        </w:r>
+      </w:ins>
+      <w:ins w:id="179" w:author="Benjamin J. Makhlouf" w:date="2026-03-03T12:20:00Z" w16du:dateUtc="2026-03-03T20:20:00Z">
+        <w:r>
+          <w:rPr>
+            <w:color w:val="222222"/>
+            <w:shd w:val="clear" w:color="auto" w:fill="FFFFFF"/>
+          </w:rPr>
+          <w:t xml:space="preserve"> </w:t>
+        </w:r>
+      </w:ins>
+      <w:r>
+        <w:rPr>
+          <w:color w:val="222222"/>
+          <w:shd w:val="clear" w:color="auto" w:fill="FFFFFF"/>
+        </w:rPr>
+        <w:t>This work w</w:t>
       </w:r>
       <w:r>
         <w:rPr>
@@ -9771,7 +10317,14 @@
         <w:rPr>
           <w:rFonts w:ascii="Times New Roman" w:hAnsi="Times New Roman" w:cs="Times New Roman"/>
         </w:rPr>
-        <w:t xml:space="preserve"> provided technical expertise and provided extensive consultation on project direction. Daniel E. Schindler directed the project and analysis, secured funding, and helped develop the manuscript. All authors contributed to editing the final manuscript. </w:t>
+        <w:t xml:space="preserve"> provided technical expertise and provided extensive consultation on project direction. Daniel E. Schindler </w:t>
+      </w:r>
+      <w:r>
+        <w:rPr>
+          <w:rFonts w:ascii="Times New Roman" w:hAnsi="Times New Roman" w:cs="Times New Roman"/>
+        </w:rPr>
+        <w:lastRenderedPageBreak/>
+        <w:t xml:space="preserve">directed the project and analysis, secured funding, and helped develop the manuscript. All authors contributed to editing the final manuscript. </w:t>
       </w:r>
     </w:p>
     <w:p>
@@ -10089,6 +10642,7 @@
         <w:rPr>
           <w:rFonts w:ascii="Times New Roman" w:hAnsi="Times New Roman" w:cs="Times New Roman"/>
         </w:rPr>
+        <w:lastRenderedPageBreak/>
         <w:t xml:space="preserve">Brennan, S. R., Cline, T. J., &amp; Schindler, D. E. (2019). Quantifying habitat use of migratory fish across riverscapes using space-time isotope models. </w:t>
       </w:r>
       <w:r>
@@ -10173,7 +10727,6 @@
         <w:rPr>
           <w:rFonts w:ascii="Times New Roman" w:hAnsi="Times New Roman" w:cs="Times New Roman"/>
         </w:rPr>
-        <w:lastRenderedPageBreak/>
         <w:t xml:space="preserve">Brennan, S. R., Zimmerman, C. E., Fernandez, D. P., Cerling, T. E., McPhee, M. V., &amp; Wooller, M. J. (2015). Strontium isotopes delineate fine-scale natal origins and migration histories of Pacific salmon. </w:t>
       </w:r>
       <w:r>
@@ -10552,6 +11105,7 @@
         <w:rPr>
           <w:rFonts w:ascii="Times New Roman" w:hAnsi="Times New Roman" w:cs="Times New Roman"/>
         </w:rPr>
+        <w:lastRenderedPageBreak/>
         <w:t xml:space="preserve">Hess, J. E., Whiteaker, J. M., Fryer, J. K., &amp; Narum, S. R. (2014). Monitoring Stock‐Specific Abundance, Run Timing, and Straying of Chinook Salmon in the Columbia River Using Genetic Stock Identification (GSI). </w:t>
       </w:r>
       <w:r>
@@ -10636,7 +11190,6 @@
         <w:rPr>
           <w:rFonts w:ascii="Times New Roman" w:hAnsi="Times New Roman" w:cs="Times New Roman"/>
         </w:rPr>
-        <w:lastRenderedPageBreak/>
         <w:t xml:space="preserve">Kuhn, M., Vaughn, D., &amp; Ruiz, E. (2025). </w:t>
       </w:r>
       <w:r>
@@ -10903,7 +11456,14 @@
         <w:rPr>
           <w:rFonts w:ascii="Times New Roman" w:hAnsi="Times New Roman" w:cs="Times New Roman"/>
         </w:rPr>
-        <w:t xml:space="preserve">Reis-Santos, P., Gillanders, B. M., Sturrock, A. M., Izzo, C., Oxman, D. S., Lueders-Dumont, J. A., Hüssy, K., Tanner, S. E., Rogers, T., Doubleday, Z. A., Andrews, A. H., Trueman, C., Brophy, D., Thiem, J. D., Baumgartner, L. J., Willmes, M., Chung, M.-T., Charapata, P., Johnson, R. C., … Walther, B. D. (2022). Reading the biomineralized book of life: Expanding otolith biogeochemical research and applications for fisheries and ecosystem-based management. </w:t>
+        <w:t xml:space="preserve">Reis-Santos, P., Gillanders, B. M., Sturrock, A. M., Izzo, C., Oxman, D. S., Lueders-Dumont, J. A., Hüssy, K., Tanner, S. E., Rogers, T., Doubleday, Z. A., Andrews, A. H., Trueman, C., Brophy, D., Thiem, J. D., Baumgartner, L. J., Willmes, M., Chung, M.-T., Charapata, P., Johnson, R. C., … Walther, B. D. (2022). Reading the biomineralized book of life: Expanding otolith </w:t>
+      </w:r>
+      <w:r>
+        <w:rPr>
+          <w:rFonts w:ascii="Times New Roman" w:hAnsi="Times New Roman" w:cs="Times New Roman"/>
+        </w:rPr>
+        <w:lastRenderedPageBreak/>
+        <w:t xml:space="preserve">biogeochemical research and applications for fisheries and ecosystem-based management. </w:t>
       </w:r>
       <w:r>
         <w:rPr>
@@ -10959,7 +11519,6 @@
         <w:rPr>
           <w:rFonts w:ascii="Times New Roman" w:hAnsi="Times New Roman" w:cs="Times New Roman"/>
         </w:rPr>
-        <w:lastRenderedPageBreak/>
         <w:t xml:space="preserve">Silva Filho, T., Song, H., Perello-Nieto, M., Santos-Rodriguez, R., Kull, M., &amp; Flach, P. (2023). Classifier calibration: A survey on how to assess and improve predicted class probabilities. </w:t>
       </w:r>
       <w:r>
@@ -11607,13 +12166,20 @@
       <w:pPr>
         <w:rPr>
           <w:rFonts w:ascii="Times New Roman" w:hAnsi="Times New Roman" w:cs="Times New Roman"/>
-        </w:rPr>
-      </w:pPr>
-      <w:r>
-        <w:rPr>
-          <w:rFonts w:ascii="Times New Roman" w:hAnsi="Times New Roman" w:cs="Times New Roman"/>
           <w:b/>
           <w:bCs/>
+          <w:rPrChange w:id="180" w:author="Benjamin J. Makhlouf" w:date="2026-03-03T12:24:00Z" w16du:dateUtc="2026-03-03T20:24:00Z">
+            <w:rPr>
+              <w:rFonts w:ascii="Times New Roman" w:hAnsi="Times New Roman" w:cs="Times New Roman"/>
+            </w:rPr>
+          </w:rPrChange>
+        </w:rPr>
+      </w:pPr>
+      <w:r>
+        <w:rPr>
+          <w:rFonts w:ascii="Times New Roman" w:hAnsi="Times New Roman" w:cs="Times New Roman"/>
+          <w:b/>
+          <w:bCs/>
         </w:rPr>
         <w:t>Figure 2:</w:t>
       </w:r>
@@ -11621,9 +12187,79 @@
         <w:rPr>
           <w:rFonts w:ascii="Times New Roman" w:hAnsi="Times New Roman" w:cs="Times New Roman"/>
         </w:rPr>
-        <w:t xml:space="preserve"> Principal Component analysis of GAM smoothed timeseries data (n = 2,531 otoliths). S</w:t>
-      </w:r>
-      <w:ins w:id="99" w:author="Benjamin J. Makhlouf" w:date="2026-03-01T20:18:00Z" w16du:dateUtc="2026-03-02T04:18:00Z">
+        <w:t xml:space="preserve"> </w:t>
+      </w:r>
+      <w:r>
+        <w:rPr>
+          <w:rFonts w:ascii="Times New Roman" w:hAnsi="Times New Roman" w:cs="Times New Roman"/>
+        </w:rPr>
+        <w:t xml:space="preserve">Principal Component analysis of GAM smoothed </w:t>
+      </w:r>
+      <w:ins w:id="181" w:author="Benjamin J. Makhlouf" w:date="2026-03-03T12:23:00Z" w16du:dateUtc="2026-03-03T20:23:00Z">
+        <w:r>
+          <w:rPr>
+            <w:rFonts w:ascii="Times New Roman" w:hAnsi="Times New Roman" w:cs="Times New Roman"/>
+          </w:rPr>
+          <w:t xml:space="preserve">⁸⁷Sr/⁸⁶Sr </w:t>
+        </w:r>
+      </w:ins>
+      <w:r>
+        <w:rPr>
+          <w:rFonts w:ascii="Times New Roman" w:hAnsi="Times New Roman" w:cs="Times New Roman"/>
+        </w:rPr>
+        <w:t>timeseries data</w:t>
+      </w:r>
+      <w:ins w:id="182" w:author="Benjamin J. Makhlouf" w:date="2026-03-03T12:23:00Z" w16du:dateUtc="2026-03-03T20:23:00Z">
+        <w:r>
+          <w:rPr>
+            <w:rFonts w:ascii="Times New Roman" w:hAnsi="Times New Roman" w:cs="Times New Roman"/>
+          </w:rPr>
+          <w:t xml:space="preserve"> collected from Chinook salmon otoliths in western Alaska</w:t>
+        </w:r>
+      </w:ins>
+      <w:r>
+        <w:rPr>
+          <w:rFonts w:ascii="Times New Roman" w:hAnsi="Times New Roman" w:cs="Times New Roman"/>
+        </w:rPr>
+        <w:t xml:space="preserve"> (n = 2,531 otoliths). </w:t>
+      </w:r>
+      <w:ins w:id="183" w:author="Benjamin J. Makhlouf" w:date="2026-03-03T12:23:00Z" w16du:dateUtc="2026-03-03T20:23:00Z">
+        <w:r>
+          <w:rPr>
+            <w:rFonts w:ascii="Times New Roman" w:hAnsi="Times New Roman" w:cs="Times New Roman"/>
+            <w:rPrChange w:id="184" w:author="Benjamin J. Makhlouf" w:date="2026-03-03T12:25:00Z" w16du:dateUtc="2026-03-03T20:25:00Z">
+              <w:rPr>
+                <w:rFonts w:ascii="Times New Roman" w:hAnsi="Times New Roman" w:cs="Times New Roman"/>
+                <w:b/>
+                <w:bCs/>
+              </w:rPr>
+            </w:rPrChange>
+          </w:rPr>
+          <w:t xml:space="preserve">Each point represents otolith Sr8786 data </w:t>
+        </w:r>
+      </w:ins>
+      <w:ins w:id="185" w:author="Benjamin J. Makhlouf" w:date="2026-03-03T12:24:00Z" w16du:dateUtc="2026-03-03T20:24:00Z">
+        <w:r>
+          <w:rPr>
+            <w:rFonts w:ascii="Times New Roman" w:hAnsi="Times New Roman" w:cs="Times New Roman"/>
+            <w:rPrChange w:id="186" w:author="Benjamin J. Makhlouf" w:date="2026-03-03T12:25:00Z" w16du:dateUtc="2026-03-03T20:25:00Z">
+              <w:rPr>
+                <w:rFonts w:ascii="Times New Roman" w:hAnsi="Times New Roman" w:cs="Times New Roman"/>
+                <w:b/>
+                <w:bCs/>
+              </w:rPr>
+            </w:rPrChange>
+          </w:rPr>
+          <w:t xml:space="preserve">from the onset of the natal origin signature until marine entry, smoothed with a generalized additive model (GAM). </w:t>
+        </w:r>
+      </w:ins>
+      <w:r>
+        <w:rPr>
+          <w:rFonts w:ascii="Times New Roman" w:hAnsi="Times New Roman" w:cs="Times New Roman"/>
+        </w:rPr>
+        <w:t>S</w:t>
+      </w:r>
+      <w:ins w:id="187" w:author="Benjamin J. Makhlouf" w:date="2026-03-01T20:18:00Z" w16du:dateUtc="2026-03-02T04:18:00Z">
         <w:r>
           <w:rPr>
             <w:rFonts w:ascii="Times New Roman" w:hAnsi="Times New Roman" w:cs="Times New Roman"/>
@@ -11631,7 +12267,7 @@
           <w:t>ubstantial</w:t>
         </w:r>
       </w:ins>
-      <w:del w:id="100" w:author="Benjamin J. Makhlouf" w:date="2026-03-01T20:18:00Z" w16du:dateUtc="2026-03-02T04:18:00Z">
+      <w:del w:id="188" w:author="Benjamin J. Makhlouf" w:date="2026-03-01T20:18:00Z" w16du:dateUtc="2026-03-02T04:18:00Z">
         <w:r>
           <w:rPr>
             <w:rFonts w:ascii="Times New Roman" w:hAnsi="Times New Roman" w:cs="Times New Roman"/>
@@ -11643,7 +12279,123 @@
         <w:rPr>
           <w:rFonts w:ascii="Times New Roman" w:hAnsi="Times New Roman" w:cs="Times New Roman"/>
         </w:rPr>
-        <w:t xml:space="preserve"> clustering is evident, but with overlap between all watersheds. Yukon (Blue points) contain a much larger range of values, indicative of the large range in natal ⁸⁷Sr/⁸⁶Sr values in the basin. Kuskokwim (Red points) overlap between both Nushagak and Yukon fish, likely due to its position in the region between both watersheds. </w:t>
+        <w:t xml:space="preserve"> clustering </w:t>
+      </w:r>
+      <w:ins w:id="189" w:author="Benjamin J. Makhlouf" w:date="2026-03-03T12:24:00Z" w16du:dateUtc="2026-03-03T20:24:00Z">
+        <w:r>
+          <w:rPr>
+            <w:rFonts w:ascii="Times New Roman" w:hAnsi="Times New Roman" w:cs="Times New Roman"/>
+          </w:rPr>
+          <w:t xml:space="preserve">by watershed </w:t>
+        </w:r>
+      </w:ins>
+      <w:r>
+        <w:rPr>
+          <w:rFonts w:ascii="Times New Roman" w:hAnsi="Times New Roman" w:cs="Times New Roman"/>
+        </w:rPr>
+        <w:t xml:space="preserve">is evident, </w:t>
+      </w:r>
+      <w:ins w:id="190" w:author="Benjamin J. Makhlouf" w:date="2026-03-03T12:24:00Z" w16du:dateUtc="2026-03-03T20:24:00Z">
+        <w:r>
+          <w:rPr>
+            <w:rFonts w:ascii="Times New Roman" w:hAnsi="Times New Roman" w:cs="Times New Roman"/>
+          </w:rPr>
+          <w:t xml:space="preserve">however, there is significant </w:t>
+        </w:r>
+      </w:ins>
+      <w:del w:id="191" w:author="Benjamin J. Makhlouf" w:date="2026-03-03T12:24:00Z" w16du:dateUtc="2026-03-03T20:24:00Z">
+        <w:r>
+          <w:rPr>
+            <w:rFonts w:ascii="Times New Roman" w:hAnsi="Times New Roman" w:cs="Times New Roman"/>
+          </w:rPr>
+          <w:delText xml:space="preserve">but with </w:delText>
+        </w:r>
+      </w:del>
+      <w:r>
+        <w:rPr>
+          <w:rFonts w:ascii="Times New Roman" w:hAnsi="Times New Roman" w:cs="Times New Roman"/>
+        </w:rPr>
+        <w:t xml:space="preserve">overlap between all watersheds. Yukon (Blue points) contain a much larger range of values, indicative of the large range in natal ⁸⁷Sr/⁸⁶Sr values in the basin. Kuskokwim (Red points) </w:t>
+      </w:r>
+      <w:ins w:id="192" w:author="Benjamin J. Makhlouf" w:date="2026-03-03T12:24:00Z" w16du:dateUtc="2026-03-03T20:24:00Z">
+        <w:r>
+          <w:rPr>
+            <w:rFonts w:ascii="Times New Roman" w:hAnsi="Times New Roman" w:cs="Times New Roman"/>
+          </w:rPr>
+          <w:t xml:space="preserve">are nearly completely </w:t>
+        </w:r>
+      </w:ins>
+      <w:r>
+        <w:rPr>
+          <w:rFonts w:ascii="Times New Roman" w:hAnsi="Times New Roman" w:cs="Times New Roman"/>
+        </w:rPr>
+        <w:t>overlap</w:t>
+      </w:r>
+      <w:ins w:id="193" w:author="Benjamin J. Makhlouf" w:date="2026-03-03T12:24:00Z" w16du:dateUtc="2026-03-03T20:24:00Z">
+        <w:r>
+          <w:rPr>
+            <w:rFonts w:ascii="Times New Roman" w:hAnsi="Times New Roman" w:cs="Times New Roman"/>
+          </w:rPr>
+          <w:t xml:space="preserve">ped </w:t>
+        </w:r>
+      </w:ins>
+      <w:del w:id="194" w:author="Benjamin J. Makhlouf" w:date="2026-03-03T12:24:00Z" w16du:dateUtc="2026-03-03T20:24:00Z">
+        <w:r>
+          <w:rPr>
+            <w:rFonts w:ascii="Times New Roman" w:hAnsi="Times New Roman" w:cs="Times New Roman"/>
+          </w:rPr>
+          <w:delText xml:space="preserve"> </w:delText>
+        </w:r>
+      </w:del>
+      <w:ins w:id="195" w:author="Benjamin J. Makhlouf" w:date="2026-03-03T12:25:00Z" w16du:dateUtc="2026-03-03T20:25:00Z">
+        <w:r>
+          <w:rPr>
+            <w:rFonts w:ascii="Times New Roman" w:hAnsi="Times New Roman" w:cs="Times New Roman"/>
+          </w:rPr>
+          <w:t xml:space="preserve">by </w:t>
+        </w:r>
+      </w:ins>
+      <w:del w:id="196" w:author="Benjamin J. Makhlouf" w:date="2026-03-03T12:25:00Z" w16du:dateUtc="2026-03-03T20:25:00Z">
+        <w:r>
+          <w:rPr>
+            <w:rFonts w:ascii="Times New Roman" w:hAnsi="Times New Roman" w:cs="Times New Roman"/>
+          </w:rPr>
+          <w:delText xml:space="preserve">between </w:delText>
+        </w:r>
+      </w:del>
+      <w:r>
+        <w:rPr>
+          <w:rFonts w:ascii="Times New Roman" w:hAnsi="Times New Roman" w:cs="Times New Roman"/>
+        </w:rPr>
+        <w:t xml:space="preserve">both Nushagak and Yukon </w:t>
+      </w:r>
+      <w:ins w:id="197" w:author="Benjamin J. Makhlouf" w:date="2026-03-03T12:25:00Z" w16du:dateUtc="2026-03-03T20:25:00Z">
+        <w:r>
+          <w:rPr>
+            <w:rFonts w:ascii="Times New Roman" w:hAnsi="Times New Roman" w:cs="Times New Roman"/>
+          </w:rPr>
+          <w:t>samples</w:t>
+        </w:r>
+      </w:ins>
+      <w:del w:id="198" w:author="Benjamin J. Makhlouf" w:date="2026-03-03T12:25:00Z" w16du:dateUtc="2026-03-03T20:25:00Z">
+        <w:r>
+          <w:rPr>
+            <w:rFonts w:ascii="Times New Roman" w:hAnsi="Times New Roman" w:cs="Times New Roman"/>
+          </w:rPr>
+          <w:delText>fish</w:delText>
+        </w:r>
+      </w:del>
+      <w:r>
+        <w:rPr>
+          <w:rFonts w:ascii="Times New Roman" w:hAnsi="Times New Roman" w:cs="Times New Roman"/>
+        </w:rPr>
+        <w:t>, likely due to its position in the region between both watersheds.</w:t>
+      </w:r>
+      <w:r>
+        <w:rPr>
+          <w:rFonts w:ascii="Times New Roman" w:hAnsi="Times New Roman" w:cs="Times New Roman"/>
+        </w:rPr>
+        <w:t xml:space="preserve"> </w:t>
       </w:r>
     </w:p>
     <w:p>
@@ -11738,8 +12490,104 @@
         <w:rPr>
           <w:rFonts w:ascii="Times New Roman" w:hAnsi="Times New Roman" w:cs="Times New Roman"/>
         </w:rPr>
-        <w:t xml:space="preserve">A) Principal component analysis of all samples with a natal origin ⁸⁷Sr/⁸⁶Sr of 0.7080 - 0.7085. Clustering among watersheds is evident between principal components 1 and 2 (68.39% of variance), as well as between principal components 2 and 3 (31.16% of variance). There is some overlap between all three watersheds in both cases. B) Sample otolith LA timeseries </w:t>
-      </w:r>
+        <w:t xml:space="preserve">A) Principal component analysis of </w:t>
+      </w:r>
+      <w:ins w:id="199" w:author="Benjamin J. Makhlouf" w:date="2026-03-03T12:25:00Z" w16du:dateUtc="2026-03-03T20:25:00Z">
+        <w:r>
+          <w:rPr>
+            <w:rFonts w:ascii="Times New Roman" w:hAnsi="Times New Roman" w:cs="Times New Roman"/>
+          </w:rPr>
+          <w:t xml:space="preserve">otolith </w:t>
+        </w:r>
+      </w:ins>
+      <w:ins w:id="200" w:author="Benjamin J. Makhlouf" w:date="2026-03-03T12:26:00Z" w16du:dateUtc="2026-03-03T20:26:00Z">
+        <w:r>
+          <w:rPr>
+            <w:rFonts w:ascii="Times New Roman" w:hAnsi="Times New Roman" w:cs="Times New Roman"/>
+          </w:rPr>
+          <w:t xml:space="preserve">⁸⁷Sr/⁸⁶Sr </w:t>
+        </w:r>
+        <w:r>
+          <w:rPr>
+            <w:rFonts w:ascii="Times New Roman" w:hAnsi="Times New Roman" w:cs="Times New Roman"/>
+          </w:rPr>
+          <w:t>timeseries</w:t>
+        </w:r>
+      </w:ins>
+      <w:del w:id="201" w:author="Benjamin J. Makhlouf" w:date="2026-03-03T12:25:00Z" w16du:dateUtc="2026-03-03T20:25:00Z">
+        <w:r>
+          <w:rPr>
+            <w:rFonts w:ascii="Times New Roman" w:hAnsi="Times New Roman" w:cs="Times New Roman"/>
+          </w:rPr>
+          <w:delText>all</w:delText>
+        </w:r>
+      </w:del>
+      <w:del w:id="202" w:author="Benjamin J. Makhlouf" w:date="2026-03-03T12:26:00Z" w16du:dateUtc="2026-03-03T20:26:00Z">
+        <w:r>
+          <w:rPr>
+            <w:rFonts w:ascii="Times New Roman" w:hAnsi="Times New Roman" w:cs="Times New Roman"/>
+          </w:rPr>
+          <w:delText xml:space="preserve"> samples</w:delText>
+        </w:r>
+      </w:del>
+      <w:r>
+        <w:rPr>
+          <w:rFonts w:ascii="Times New Roman" w:hAnsi="Times New Roman" w:cs="Times New Roman"/>
+        </w:rPr>
+        <w:t xml:space="preserve"> with a natal origin ⁸⁷Sr/⁸⁶Sr of 0.7080 - 0.7085. </w:t>
+      </w:r>
+      <w:ins w:id="203" w:author="Benjamin J. Makhlouf" w:date="2026-03-03T12:26:00Z" w16du:dateUtc="2026-03-03T20:26:00Z">
+        <w:r>
+          <w:rPr>
+            <w:rFonts w:ascii="Times New Roman" w:hAnsi="Times New Roman" w:cs="Times New Roman"/>
+          </w:rPr>
+          <w:t xml:space="preserve">These individuals are unable to be </w:t>
+        </w:r>
+      </w:ins>
+      <w:ins w:id="204" w:author="Benjamin J. Makhlouf" w:date="2026-03-03T12:27:00Z" w16du:dateUtc="2026-03-03T20:27:00Z">
+        <w:r>
+          <w:rPr>
+            <w:rFonts w:ascii="Times New Roman" w:hAnsi="Times New Roman" w:cs="Times New Roman"/>
+          </w:rPr>
+          <w:t xml:space="preserve">distinguished using the natal origin value alone. </w:t>
+        </w:r>
+      </w:ins>
+      <w:r>
+        <w:rPr>
+          <w:rFonts w:ascii="Times New Roman" w:hAnsi="Times New Roman" w:cs="Times New Roman"/>
+        </w:rPr>
+        <w:t xml:space="preserve">Clustering among watersheds is evident between principal components 1 and 2 (68.39% of variance), as well as between principal components 2 and 3 (31.16% of variance). There is some overlap between all three watersheds in both cases. B) </w:t>
+      </w:r>
+      <w:ins w:id="205" w:author="Benjamin J. Makhlouf" w:date="2026-03-03T12:27:00Z" w16du:dateUtc="2026-03-03T20:27:00Z">
+        <w:r>
+          <w:rPr>
+            <w:rFonts w:ascii="Times New Roman" w:hAnsi="Times New Roman" w:cs="Times New Roman"/>
+          </w:rPr>
+          <w:t>A single representative sample of</w:t>
+        </w:r>
+      </w:ins>
+      <w:del w:id="206" w:author="Benjamin J. Makhlouf" w:date="2026-03-03T12:27:00Z" w16du:dateUtc="2026-03-03T20:27:00Z">
+        <w:r>
+          <w:rPr>
+            <w:rFonts w:ascii="Times New Roman" w:hAnsi="Times New Roman" w:cs="Times New Roman"/>
+          </w:rPr>
+          <w:delText>Sample</w:delText>
+        </w:r>
+      </w:del>
+      <w:r>
+        <w:rPr>
+          <w:rFonts w:ascii="Times New Roman" w:hAnsi="Times New Roman" w:cs="Times New Roman"/>
+        </w:rPr>
+        <w:t xml:space="preserve"> otolith LA timeseries </w:t>
+      </w:r>
+      <w:ins w:id="207" w:author="Benjamin J. Makhlouf" w:date="2026-03-03T13:32:00Z" w16du:dateUtc="2026-03-03T21:32:00Z">
+        <w:r>
+          <w:rPr>
+            <w:rFonts w:ascii="Times New Roman" w:hAnsi="Times New Roman" w:cs="Times New Roman"/>
+          </w:rPr>
+          <w:t xml:space="preserve">for each watershed, smoothed by a generalized additive model (GAM). The smoothed line is </w:t>
+        </w:r>
+      </w:ins>
       <w:r>
         <w:rPr>
           <w:rFonts w:ascii="Times New Roman" w:hAnsi="Times New Roman" w:cs="Times New Roman"/>
@@ -11750,7 +12598,35 @@
         <w:rPr>
           <w:rFonts w:ascii="Times New Roman" w:hAnsi="Times New Roman" w:cs="Times New Roman"/>
         </w:rPr>
-        <w:t>d by the absolute value of the PCA loadings at associated timeseries indices. PC1 (top row) shows high loading on the middle section of the timeseries after the natal origin region. PC2 is driven by the region of the timeseries towards the marine entry, likely the result of mainstem migration to the ocean. Separation along PC3 is driven by the very beginning of the timeseries, which is the region associated with the natal origin. Notably, Yukon individuals from the CWAK region contain a less pronounces mainstem signal as compared to their counterpart from the upper or middle Yukon genetic groups.</w:t>
+        <w:t>d by the absolute value of</w:t>
+      </w:r>
+      <w:del w:id="208" w:author="Benjamin J. Makhlouf" w:date="2026-03-03T12:27:00Z" w16du:dateUtc="2026-03-03T20:27:00Z">
+        <w:r>
+          <w:rPr>
+            <w:rFonts w:ascii="Times New Roman" w:hAnsi="Times New Roman" w:cs="Times New Roman"/>
+          </w:rPr>
+          <w:delText xml:space="preserve"> the</w:delText>
+        </w:r>
+      </w:del>
+      <w:r>
+        <w:rPr>
+          <w:rFonts w:ascii="Times New Roman" w:hAnsi="Times New Roman" w:cs="Times New Roman"/>
+        </w:rPr>
+        <w:t xml:space="preserve"> PCA loadings at associated </w:t>
+      </w:r>
+      <w:del w:id="209" w:author="Benjamin J. Makhlouf" w:date="2026-03-03T12:27:00Z" w16du:dateUtc="2026-03-03T20:27:00Z">
+        <w:r>
+          <w:rPr>
+            <w:rFonts w:ascii="Times New Roman" w:hAnsi="Times New Roman" w:cs="Times New Roman"/>
+          </w:rPr>
+          <w:delText xml:space="preserve">timeseries </w:delText>
+        </w:r>
+      </w:del>
+      <w:r>
+        <w:rPr>
+          <w:rFonts w:ascii="Times New Roman" w:hAnsi="Times New Roman" w:cs="Times New Roman"/>
+        </w:rPr>
+        <w:t>indices. PC1 (top row) shows high loading on the middle section of the timeseries after the natal origin region. PC2 is driven by the region of the timeseries towards the marine entry, likely the result of mainstem migration to the ocean. Separation along PC3 is driven by the very beginning of the timeseries, which is the region associated with the natal origin. Notably, Yukon individuals from the CWAK region contain a less pronounces mainstem signal as compared to their counterpart from the upper or middle Yukon genetic groups.</w:t>
       </w:r>
     </w:p>
     <w:p>
@@ -11894,7 +12770,33 @@
         <w:rPr>
           <w:rFonts w:ascii="Times New Roman" w:hAnsi="Times New Roman" w:cs="Times New Roman"/>
         </w:rPr>
-        <w:t xml:space="preserve"> Model Performance comparison among data preprocessing steps and model types. Accuracy indicates the proportion of each class correctly classified. F1-Score is the harmonic mean of precision and recall, providing a balanced performance measure across all watershed classes. Results compare two ⁸⁷Sr/⁸⁶Sr timeseries smoothing methods (GAM, MA) and three machine learning algorithms (Random Forest, SVM, KNN) using either all test data (Total) or only overlapping isotope ranges </w:t>
+        <w:t xml:space="preserve"> Model Performance comparison among data preprocessing steps and model types</w:t>
+      </w:r>
+      <w:ins w:id="210" w:author="Benjamin J. Makhlouf" w:date="2026-03-03T12:28:00Z" w16du:dateUtc="2026-03-03T20:28:00Z">
+        <w:r>
+          <w:rPr>
+            <w:rFonts w:ascii="Times New Roman" w:hAnsi="Times New Roman" w:cs="Times New Roman"/>
+          </w:rPr>
+          <w:t xml:space="preserve"> on otolith </w:t>
+        </w:r>
+        <w:r>
+          <w:rPr>
+            <w:rFonts w:ascii="Times New Roman" w:hAnsi="Times New Roman" w:cs="Times New Roman"/>
+          </w:rPr>
+          <w:t>⁸⁷Sr/⁸⁶Sr</w:t>
+        </w:r>
+        <w:r>
+          <w:rPr>
+            <w:rFonts w:ascii="Times New Roman" w:hAnsi="Times New Roman" w:cs="Times New Roman"/>
+          </w:rPr>
+          <w:t xml:space="preserve"> timeseries from Chinook salmon in Western Alaska watersheds</w:t>
+        </w:r>
+      </w:ins>
+      <w:r>
+        <w:rPr>
+          <w:rFonts w:ascii="Times New Roman" w:hAnsi="Times New Roman" w:cs="Times New Roman"/>
+        </w:rPr>
+        <w:t xml:space="preserve">. Accuracy indicates the proportion of each class correctly classified. F1-Score is the harmonic mean of precision and recall, providing a balanced performance measure across all watershed classes. Results compare two ⁸⁷Sr/⁸⁶Sr timeseries smoothing methods (GAM, MA) and three machine learning algorithms (Random Forest, SVM, KNN) using either all test data (Total) or only overlapping isotope ranges </w:t>
       </w:r>
       <w:r>
         <w:rPr>
@@ -12116,8 +13018,80 @@
         <w:rPr>
           <w:rFonts w:ascii="Times New Roman" w:hAnsi="Times New Roman" w:cs="Times New Roman"/>
         </w:rPr>
-        <w:t xml:space="preserve"> Confusion matrix from the highest performing model (Random Forest on GAM Smoothed data) for both total test set and overlapping subset. Boxes along the horizontal axis indicate correctly classified individuals (red). Vertical axis labels are the actual watershed labels whereas horizontal labels are the predicted class from the model. Percentages indicate the percent of the actual class identified as the predicted class and numbers indicate the number of the actual class assigned to the predicted class. </w:t>
-      </w:r>
+        <w:t xml:space="preserve"> Confusion matrix from the highest performing </w:t>
+      </w:r>
+      <w:ins w:id="211" w:author="Benjamin J. Makhlouf" w:date="2026-03-03T12:29:00Z" w16du:dateUtc="2026-03-03T20:29:00Z">
+        <w:r>
+          <w:rPr>
+            <w:rFonts w:ascii="Times New Roman" w:hAnsi="Times New Roman" w:cs="Times New Roman"/>
+          </w:rPr>
+          <w:t xml:space="preserve">classification </w:t>
+        </w:r>
+      </w:ins>
+      <w:r>
+        <w:rPr>
+          <w:rFonts w:ascii="Times New Roman" w:hAnsi="Times New Roman" w:cs="Times New Roman"/>
+        </w:rPr>
+        <w:t>model (Random Forest on GAM Smoothed data)</w:t>
+      </w:r>
+      <w:ins w:id="212" w:author="Benjamin J. Makhlouf" w:date="2026-03-03T12:29:00Z" w16du:dateUtc="2026-03-03T20:29:00Z">
+        <w:r>
+          <w:rPr>
+            <w:rFonts w:ascii="Times New Roman" w:hAnsi="Times New Roman" w:cs="Times New Roman"/>
+          </w:rPr>
+          <w:t xml:space="preserve"> for </w:t>
+        </w:r>
+      </w:ins>
+      <w:ins w:id="213" w:author="Benjamin J. Makhlouf" w:date="2026-03-03T12:30:00Z" w16du:dateUtc="2026-03-03T20:30:00Z">
+        <w:r>
+          <w:rPr>
+            <w:rFonts w:ascii="Times New Roman" w:hAnsi="Times New Roman" w:cs="Times New Roman"/>
+          </w:rPr>
+          <w:t xml:space="preserve">Chinook salmon in Western Alaska watersheds using otolith </w:t>
+        </w:r>
+        <w:r>
+          <w:rPr>
+            <w:rFonts w:ascii="Times New Roman" w:hAnsi="Times New Roman" w:cs="Times New Roman"/>
+          </w:rPr>
+          <w:t>⁸⁷Sr/⁸⁶Sr</w:t>
+        </w:r>
+        <w:r>
+          <w:rPr>
+            <w:rFonts w:ascii="Times New Roman" w:hAnsi="Times New Roman" w:cs="Times New Roman"/>
+          </w:rPr>
+          <w:t xml:space="preserve">. Results are separated into the total testing set and a testing set limited to only overlapping isotope ranges. </w:t>
+        </w:r>
+      </w:ins>
+      <w:del w:id="214" w:author="Benjamin J. Makhlouf" w:date="2026-03-03T12:31:00Z" w16du:dateUtc="2026-03-03T20:31:00Z">
+        <w:r>
+          <w:rPr>
+            <w:rFonts w:ascii="Times New Roman" w:hAnsi="Times New Roman" w:cs="Times New Roman"/>
+          </w:rPr>
+          <w:delText xml:space="preserve"> for both total test set and overlapping subset. </w:delText>
+        </w:r>
+      </w:del>
+      <w:r>
+        <w:rPr>
+          <w:rFonts w:ascii="Times New Roman" w:hAnsi="Times New Roman" w:cs="Times New Roman"/>
+        </w:rPr>
+        <w:t xml:space="preserve">Boxes along the horizontal axis indicate correctly classified individuals (red). Vertical axis labels are the actual watershed labels whereas horizontal labels are the predicted class from the model. Percentages indicate the percent of the actual class identified as the predicted class and numbers indicate the </w:t>
+      </w:r>
+      <w:ins w:id="215" w:author="Benjamin J. Makhlouf" w:date="2026-03-03T12:31:00Z" w16du:dateUtc="2026-03-03T20:31:00Z">
+        <w:r>
+          <w:rPr>
+            <w:rFonts w:ascii="Times New Roman" w:hAnsi="Times New Roman" w:cs="Times New Roman"/>
+          </w:rPr>
+          <w:t xml:space="preserve">number of individuals in each group. </w:t>
+        </w:r>
+      </w:ins>
+      <w:del w:id="216" w:author="Benjamin J. Makhlouf" w:date="2026-03-03T12:31:00Z" w16du:dateUtc="2026-03-03T20:31:00Z">
+        <w:r>
+          <w:rPr>
+            <w:rFonts w:ascii="Times New Roman" w:hAnsi="Times New Roman" w:cs="Times New Roman"/>
+          </w:rPr>
+          <w:delText xml:space="preserve">number of the actual class assigned to the predicted class. </w:delText>
+        </w:r>
+      </w:del>
     </w:p>
     <w:p>
       <w:pPr>
@@ -12255,7 +13229,49 @@
         <w:rPr>
           <w:rFonts w:ascii="Times New Roman" w:hAnsi="Times New Roman" w:cs="Times New Roman"/>
         </w:rPr>
-        <w:t xml:space="preserve">Classification accuracy with different probability thresholds (60-90%). Points indicate the percentage of correctly classified individuals with a calibrated probability value above the given threshold value. Grey dashed lines represent the overall accuracy, whereas </w:t>
+        <w:t xml:space="preserve">Classification accuracy </w:t>
+      </w:r>
+      <w:ins w:id="217" w:author="Benjamin J. Makhlouf" w:date="2026-03-03T12:31:00Z" w16du:dateUtc="2026-03-03T20:31:00Z">
+        <w:r>
+          <w:rPr>
+            <w:rFonts w:ascii="Times New Roman" w:hAnsi="Times New Roman" w:cs="Times New Roman"/>
+          </w:rPr>
+          <w:t>of Chinook salmon to</w:t>
+        </w:r>
+      </w:ins>
+      <w:ins w:id="218" w:author="Benjamin J. Makhlouf" w:date="2026-03-03T12:32:00Z" w16du:dateUtc="2026-03-03T20:32:00Z">
+        <w:r>
+          <w:rPr>
+            <w:rFonts w:ascii="Times New Roman" w:hAnsi="Times New Roman" w:cs="Times New Roman"/>
+          </w:rPr>
+          <w:t xml:space="preserve"> Western Alaska Watersheds using machine learning models alongside </w:t>
+        </w:r>
+        <w:r>
+          <w:rPr>
+            <w:rFonts w:ascii="Times New Roman" w:hAnsi="Times New Roman" w:cs="Times New Roman"/>
+          </w:rPr>
+          <w:t xml:space="preserve">⁸⁷Sr/⁸⁶Sr </w:t>
+        </w:r>
+        <w:r>
+          <w:rPr>
+            <w:rFonts w:ascii="Times New Roman" w:hAnsi="Times New Roman" w:cs="Times New Roman"/>
+          </w:rPr>
+          <w:t xml:space="preserve">timeseries data. Accuracy is displayed along a range of probability thresholds </w:t>
+        </w:r>
+      </w:ins>
+      <w:del w:id="219" w:author="Benjamin J. Makhlouf" w:date="2026-03-03T12:32:00Z" w16du:dateUtc="2026-03-03T20:32:00Z">
+        <w:r>
+          <w:rPr>
+            <w:rFonts w:ascii="Times New Roman" w:hAnsi="Times New Roman" w:cs="Times New Roman"/>
+          </w:rPr>
+          <w:delText>with different probability thresholds</w:delText>
+        </w:r>
+      </w:del>
+      <w:r>
+        <w:rPr>
+          <w:rFonts w:ascii="Times New Roman" w:hAnsi="Times New Roman" w:cs="Times New Roman"/>
+        </w:rPr>
+        <w:t xml:space="preserve"> (60-90%). Points indicate the percentage of correctly classified individuals with a calibrated probability value above the given threshold value. Grey dashed lines represent the overall accuracy, whereas </w:t>
       </w:r>
       <w:r>
         <w:rPr>

</xml_diff>